<commit_message>
docs: rewrite progress report sentences without em dashes
</commit_message>
<xml_diff>
--- a/info/CS57_Progress_Report.docx
+++ b/info/CS57_Progress_Report.docx
@@ -285,7 +285,7 @@
       <w:pPr>
         <w:pStyle w:val="PhDPreliminaryHeading"/>
       </w:pPr>
-      <w:bookmarkStart w:id="0" w:name="_Toc242391227"/>
+      <w:bookmarkStart w:id="0" w:name="_Toc242394574"/>
       <w:r>
         <w:lastRenderedPageBreak/>
         <w:t>Table of Contents</w:t>
@@ -331,7 +331,7 @@
         </w:rPr>
         <w:fldChar w:fldCharType="separate"/>
       </w:r>
-      <w:hyperlink w:anchor="_Toc242391227" w:history="1">
+      <w:hyperlink w:anchor="_Toc242394574" w:history="1">
         <w:r>
           <w:rPr>
             <w:rStyle w:val="a9"/>
@@ -354,7 +354,7 @@
           <w:rPr>
             <w:webHidden/>
           </w:rPr>
-          <w:instrText xml:space="preserve"> PAGEREF _Toc242391227 \h </w:instrText>
+          <w:instrText xml:space="preserve"> PAGEREF _Toc242394574 \h </w:instrText>
         </w:r>
         <w:r>
           <w:rPr>
@@ -397,7 +397,7 @@
           <w14:ligatures w14:val="standardContextual"/>
         </w:rPr>
       </w:pPr>
-      <w:hyperlink w:anchor="_Toc242391228" w:history="1">
+      <w:hyperlink w:anchor="_Toc242394575" w:history="1">
         <w:r>
           <w:rPr>
             <w:rStyle w:val="a9"/>
@@ -446,7 +446,7 @@
             <w:noProof/>
             <w:webHidden/>
           </w:rPr>
-          <w:instrText xml:space="preserve"> PAGEREF _Toc242391228 \h </w:instrText>
+          <w:instrText xml:space="preserve"> PAGEREF _Toc242394575 \h </w:instrText>
         </w:r>
         <w:r>
           <w:rPr>
@@ -489,7 +489,7 @@
           <w14:ligatures w14:val="standardContextual"/>
         </w:rPr>
       </w:pPr>
-      <w:hyperlink w:anchor="_Toc242391229" w:history="1">
+      <w:hyperlink w:anchor="_Toc242394576" w:history="1">
         <w:r>
           <w:rPr>
             <w:rStyle w:val="a9"/>
@@ -529,7 +529,7 @@
           <w:rPr>
             <w:webHidden/>
           </w:rPr>
-          <w:instrText xml:space="preserve"> PAGEREF _Toc242391229 \h </w:instrText>
+          <w:instrText xml:space="preserve"> PAGEREF _Toc242394576 \h </w:instrText>
         </w:r>
         <w:r>
           <w:rPr>
@@ -568,7 +568,7 @@
           <w14:ligatures w14:val="standardContextual"/>
         </w:rPr>
       </w:pPr>
-      <w:hyperlink w:anchor="_Toc242391230" w:history="1">
+      <w:hyperlink w:anchor="_Toc242394577" w:history="1">
         <w:r>
           <w:rPr>
             <w:rStyle w:val="a9"/>
@@ -608,7 +608,7 @@
           <w:rPr>
             <w:webHidden/>
           </w:rPr>
-          <w:instrText xml:space="preserve"> PAGEREF _Toc242391230 \h </w:instrText>
+          <w:instrText xml:space="preserve"> PAGEREF _Toc242394577 \h </w:instrText>
         </w:r>
         <w:r>
           <w:rPr>
@@ -647,7 +647,7 @@
           <w14:ligatures w14:val="standardContextual"/>
         </w:rPr>
       </w:pPr>
-      <w:hyperlink w:anchor="_Toc242391231" w:history="1">
+      <w:hyperlink w:anchor="_Toc242394578" w:history="1">
         <w:r>
           <w:rPr>
             <w:rStyle w:val="a9"/>
@@ -687,7 +687,7 @@
           <w:rPr>
             <w:webHidden/>
           </w:rPr>
-          <w:instrText xml:space="preserve"> PAGEREF _Toc242391231 \h </w:instrText>
+          <w:instrText xml:space="preserve"> PAGEREF _Toc242394578 \h </w:instrText>
         </w:r>
         <w:r>
           <w:rPr>
@@ -726,7 +726,7 @@
           <w14:ligatures w14:val="standardContextual"/>
         </w:rPr>
       </w:pPr>
-      <w:hyperlink w:anchor="_Toc242391232" w:history="1">
+      <w:hyperlink w:anchor="_Toc242394579" w:history="1">
         <w:r>
           <w:rPr>
             <w:rStyle w:val="a9"/>
@@ -766,7 +766,7 @@
           <w:rPr>
             <w:webHidden/>
           </w:rPr>
-          <w:instrText xml:space="preserve"> PAGEREF _Toc242391232 \h </w:instrText>
+          <w:instrText xml:space="preserve"> PAGEREF _Toc242394579 \h </w:instrText>
         </w:r>
         <w:r>
           <w:rPr>
@@ -805,7 +805,7 @@
           <w14:ligatures w14:val="standardContextual"/>
         </w:rPr>
       </w:pPr>
-      <w:hyperlink w:anchor="_Toc242391233" w:history="1">
+      <w:hyperlink w:anchor="_Toc242394580" w:history="1">
         <w:r>
           <w:rPr>
             <w:rStyle w:val="a9"/>
@@ -845,7 +845,7 @@
           <w:rPr>
             <w:webHidden/>
           </w:rPr>
-          <w:instrText xml:space="preserve"> PAGEREF _Toc242391233 \h </w:instrText>
+          <w:instrText xml:space="preserve"> PAGEREF _Toc242394580 \h </w:instrText>
         </w:r>
         <w:r>
           <w:rPr>
@@ -884,7 +884,7 @@
           <w14:ligatures w14:val="standardContextual"/>
         </w:rPr>
       </w:pPr>
-      <w:hyperlink w:anchor="_Toc242391234" w:history="1">
+      <w:hyperlink w:anchor="_Toc242394581" w:history="1">
         <w:r>
           <w:rPr>
             <w:rStyle w:val="a9"/>
@@ -924,7 +924,7 @@
           <w:rPr>
             <w:webHidden/>
           </w:rPr>
-          <w:instrText xml:space="preserve"> PAGEREF _Toc242391234 \h </w:instrText>
+          <w:instrText xml:space="preserve"> PAGEREF _Toc242394581 \h </w:instrText>
         </w:r>
         <w:r>
           <w:rPr>
@@ -963,7 +963,7 @@
           <w14:ligatures w14:val="standardContextual"/>
         </w:rPr>
       </w:pPr>
-      <w:hyperlink w:anchor="_Toc242391235" w:history="1">
+      <w:hyperlink w:anchor="_Toc242394582" w:history="1">
         <w:r>
           <w:rPr>
             <w:rStyle w:val="a9"/>
@@ -1003,7 +1003,7 @@
           <w:rPr>
             <w:webHidden/>
           </w:rPr>
-          <w:instrText xml:space="preserve"> PAGEREF _Toc242391235 \h </w:instrText>
+          <w:instrText xml:space="preserve"> PAGEREF _Toc242394582 \h </w:instrText>
         </w:r>
         <w:r>
           <w:rPr>
@@ -1042,7 +1042,7 @@
           <w14:ligatures w14:val="standardContextual"/>
         </w:rPr>
       </w:pPr>
-      <w:hyperlink w:anchor="_Toc242391236" w:history="1">
+      <w:hyperlink w:anchor="_Toc242394583" w:history="1">
         <w:r>
           <w:rPr>
             <w:rStyle w:val="a9"/>
@@ -1082,7 +1082,7 @@
           <w:rPr>
             <w:webHidden/>
           </w:rPr>
-          <w:instrText xml:space="preserve"> PAGEREF _Toc242391236 \h </w:instrText>
+          <w:instrText xml:space="preserve"> PAGEREF _Toc242394583 \h </w:instrText>
         </w:r>
         <w:r>
           <w:rPr>
@@ -1121,7 +1121,7 @@
           <w14:ligatures w14:val="standardContextual"/>
         </w:rPr>
       </w:pPr>
-      <w:hyperlink w:anchor="_Toc242391237" w:history="1">
+      <w:hyperlink w:anchor="_Toc242394584" w:history="1">
         <w:r>
           <w:rPr>
             <w:rStyle w:val="a9"/>
@@ -1161,7 +1161,7 @@
           <w:rPr>
             <w:webHidden/>
           </w:rPr>
-          <w:instrText xml:space="preserve"> PAGEREF _Toc242391237 \h </w:instrText>
+          <w:instrText xml:space="preserve"> PAGEREF _Toc242394584 \h </w:instrText>
         </w:r>
         <w:r>
           <w:rPr>
@@ -1200,7 +1200,7 @@
           <w14:ligatures w14:val="standardContextual"/>
         </w:rPr>
       </w:pPr>
-      <w:hyperlink w:anchor="_Toc242391238" w:history="1">
+      <w:hyperlink w:anchor="_Toc242394585" w:history="1">
         <w:r>
           <w:rPr>
             <w:rStyle w:val="a9"/>
@@ -1240,7 +1240,7 @@
           <w:rPr>
             <w:webHidden/>
           </w:rPr>
-          <w:instrText xml:space="preserve"> PAGEREF _Toc242391238 \h </w:instrText>
+          <w:instrText xml:space="preserve"> PAGEREF _Toc242394585 \h </w:instrText>
         </w:r>
         <w:r>
           <w:rPr>
@@ -1279,7 +1279,7 @@
           <w14:ligatures w14:val="standardContextual"/>
         </w:rPr>
       </w:pPr>
-      <w:hyperlink w:anchor="_Toc242391239" w:history="1">
+      <w:hyperlink w:anchor="_Toc242394586" w:history="1">
         <w:r>
           <w:rPr>
             <w:rStyle w:val="a9"/>
@@ -1319,7 +1319,7 @@
           <w:rPr>
             <w:webHidden/>
           </w:rPr>
-          <w:instrText xml:space="preserve"> PAGEREF _Toc242391239 \h </w:instrText>
+          <w:instrText xml:space="preserve"> PAGEREF _Toc242394586 \h </w:instrText>
         </w:r>
         <w:r>
           <w:rPr>
@@ -1358,7 +1358,7 @@
           <w14:ligatures w14:val="standardContextual"/>
         </w:rPr>
       </w:pPr>
-      <w:hyperlink w:anchor="_Toc242391240" w:history="1">
+      <w:hyperlink w:anchor="_Toc242394587" w:history="1">
         <w:r>
           <w:rPr>
             <w:rStyle w:val="a9"/>
@@ -1398,7 +1398,7 @@
           <w:rPr>
             <w:webHidden/>
           </w:rPr>
-          <w:instrText xml:space="preserve"> PAGEREF _Toc242391240 \h </w:instrText>
+          <w:instrText xml:space="preserve"> PAGEREF _Toc242394587 \h </w:instrText>
         </w:r>
         <w:r>
           <w:rPr>
@@ -1437,7 +1437,7 @@
           <w14:ligatures w14:val="standardContextual"/>
         </w:rPr>
       </w:pPr>
-      <w:hyperlink w:anchor="_Toc242391241" w:history="1">
+      <w:hyperlink w:anchor="_Toc242394588" w:history="1">
         <w:r>
           <w:rPr>
             <w:rStyle w:val="a9"/>
@@ -1477,7 +1477,7 @@
           <w:rPr>
             <w:webHidden/>
           </w:rPr>
-          <w:instrText xml:space="preserve"> PAGEREF _Toc242391241 \h </w:instrText>
+          <w:instrText xml:space="preserve"> PAGEREF _Toc242394588 \h </w:instrText>
         </w:r>
         <w:r>
           <w:rPr>
@@ -1516,7 +1516,7 @@
           <w14:ligatures w14:val="standardContextual"/>
         </w:rPr>
       </w:pPr>
-      <w:hyperlink w:anchor="_Toc242391242" w:history="1">
+      <w:hyperlink w:anchor="_Toc242394589" w:history="1">
         <w:r>
           <w:rPr>
             <w:rStyle w:val="a9"/>
@@ -1556,7 +1556,7 @@
           <w:rPr>
             <w:webHidden/>
           </w:rPr>
-          <w:instrText xml:space="preserve"> PAGEREF _Toc242391242 \h </w:instrText>
+          <w:instrText xml:space="preserve"> PAGEREF _Toc242394589 \h </w:instrText>
         </w:r>
         <w:r>
           <w:rPr>
@@ -1573,7 +1573,7 @@
           <w:rPr>
             <w:webHidden/>
           </w:rPr>
-          <w:t>11</w:t>
+          <w:t>12</w:t>
         </w:r>
         <w:r>
           <w:rPr>
@@ -1595,7 +1595,7 @@
           <w14:ligatures w14:val="standardContextual"/>
         </w:rPr>
       </w:pPr>
-      <w:hyperlink w:anchor="_Toc242391243" w:history="1">
+      <w:hyperlink w:anchor="_Toc242394590" w:history="1">
         <w:r>
           <w:rPr>
             <w:rStyle w:val="a9"/>
@@ -1635,7 +1635,7 @@
           <w:rPr>
             <w:webHidden/>
           </w:rPr>
-          <w:instrText xml:space="preserve"> PAGEREF _Toc242391243 \h </w:instrText>
+          <w:instrText xml:space="preserve"> PAGEREF _Toc242394590 \h </w:instrText>
         </w:r>
         <w:r>
           <w:rPr>
@@ -1652,7 +1652,7 @@
           <w:rPr>
             <w:webHidden/>
           </w:rPr>
-          <w:t>11</w:t>
+          <w:t>12</w:t>
         </w:r>
         <w:r>
           <w:rPr>
@@ -1674,7 +1674,7 @@
           <w14:ligatures w14:val="standardContextual"/>
         </w:rPr>
       </w:pPr>
-      <w:hyperlink w:anchor="_Toc242391244" w:history="1">
+      <w:hyperlink w:anchor="_Toc242394591" w:history="1">
         <w:r>
           <w:rPr>
             <w:rStyle w:val="a9"/>
@@ -1714,7 +1714,7 @@
           <w:rPr>
             <w:webHidden/>
           </w:rPr>
-          <w:instrText xml:space="preserve"> PAGEREF _Toc242391244 \h </w:instrText>
+          <w:instrText xml:space="preserve"> PAGEREF _Toc242394591 \h </w:instrText>
         </w:r>
         <w:r>
           <w:rPr>
@@ -1753,7 +1753,7 @@
           <w14:ligatures w14:val="standardContextual"/>
         </w:rPr>
       </w:pPr>
-      <w:hyperlink w:anchor="_Toc242391245" w:history="1">
+      <w:hyperlink w:anchor="_Toc242394592" w:history="1">
         <w:r>
           <w:rPr>
             <w:rStyle w:val="a9"/>
@@ -1793,7 +1793,7 @@
           <w:rPr>
             <w:webHidden/>
           </w:rPr>
-          <w:instrText xml:space="preserve"> PAGEREF _Toc242391245 \h </w:instrText>
+          <w:instrText xml:space="preserve"> PAGEREF _Toc242394592 \h </w:instrText>
         </w:r>
         <w:r>
           <w:rPr>
@@ -1810,7 +1810,7 @@
           <w:rPr>
             <w:webHidden/>
           </w:rPr>
-          <w:t>12</w:t>
+          <w:t>13</w:t>
         </w:r>
         <w:r>
           <w:rPr>
@@ -1832,7 +1832,7 @@
           <w14:ligatures w14:val="standardContextual"/>
         </w:rPr>
       </w:pPr>
-      <w:hyperlink w:anchor="_Toc242391246" w:history="1">
+      <w:hyperlink w:anchor="_Toc242394593" w:history="1">
         <w:r>
           <w:rPr>
             <w:rStyle w:val="a9"/>
@@ -1872,7 +1872,7 @@
           <w:rPr>
             <w:webHidden/>
           </w:rPr>
-          <w:instrText xml:space="preserve"> PAGEREF _Toc242391246 \h </w:instrText>
+          <w:instrText xml:space="preserve"> PAGEREF _Toc242394593 \h </w:instrText>
         </w:r>
         <w:r>
           <w:rPr>
@@ -1889,7 +1889,7 @@
           <w:rPr>
             <w:webHidden/>
           </w:rPr>
-          <w:t>14</w:t>
+          <w:t>15</w:t>
         </w:r>
         <w:r>
           <w:rPr>
@@ -1911,7 +1911,7 @@
           <w14:ligatures w14:val="standardContextual"/>
         </w:rPr>
       </w:pPr>
-      <w:hyperlink w:anchor="_Toc242391247" w:history="1">
+      <w:hyperlink w:anchor="_Toc242394594" w:history="1">
         <w:r>
           <w:rPr>
             <w:rStyle w:val="a9"/>
@@ -1951,7 +1951,7 @@
           <w:rPr>
             <w:webHidden/>
           </w:rPr>
-          <w:instrText xml:space="preserve"> PAGEREF _Toc242391247 \h </w:instrText>
+          <w:instrText xml:space="preserve"> PAGEREF _Toc242394594 \h </w:instrText>
         </w:r>
         <w:r>
           <w:rPr>
@@ -1968,7 +1968,7 @@
           <w:rPr>
             <w:webHidden/>
           </w:rPr>
-          <w:t>15</w:t>
+          <w:t>16</w:t>
         </w:r>
         <w:r>
           <w:rPr>
@@ -1990,7 +1990,7 @@
           <w14:ligatures w14:val="standardContextual"/>
         </w:rPr>
       </w:pPr>
-      <w:hyperlink w:anchor="_Toc242391248" w:history="1">
+      <w:hyperlink w:anchor="_Toc242394595" w:history="1">
         <w:r>
           <w:rPr>
             <w:rStyle w:val="a9"/>
@@ -2030,7 +2030,7 @@
           <w:rPr>
             <w:webHidden/>
           </w:rPr>
-          <w:instrText xml:space="preserve"> PAGEREF _Toc242391248 \h </w:instrText>
+          <w:instrText xml:space="preserve"> PAGEREF _Toc242394595 \h </w:instrText>
         </w:r>
         <w:r>
           <w:rPr>
@@ -2047,7 +2047,7 @@
           <w:rPr>
             <w:webHidden/>
           </w:rPr>
-          <w:t>15</w:t>
+          <w:t>16</w:t>
         </w:r>
         <w:r>
           <w:rPr>
@@ -2069,7 +2069,7 @@
           <w14:ligatures w14:val="standardContextual"/>
         </w:rPr>
       </w:pPr>
-      <w:hyperlink w:anchor="_Toc242391249" w:history="1">
+      <w:hyperlink w:anchor="_Toc242394596" w:history="1">
         <w:r>
           <w:rPr>
             <w:rStyle w:val="a9"/>
@@ -2109,7 +2109,7 @@
           <w:rPr>
             <w:webHidden/>
           </w:rPr>
-          <w:instrText xml:space="preserve"> PAGEREF _Toc242391249 \h </w:instrText>
+          <w:instrText xml:space="preserve"> PAGEREF _Toc242394596 \h </w:instrText>
         </w:r>
         <w:r>
           <w:rPr>
@@ -2126,7 +2126,7 @@
           <w:rPr>
             <w:webHidden/>
           </w:rPr>
-          <w:t>16</w:t>
+          <w:t>17</w:t>
         </w:r>
         <w:r>
           <w:rPr>
@@ -2148,7 +2148,7 @@
           <w14:ligatures w14:val="standardContextual"/>
         </w:rPr>
       </w:pPr>
-      <w:hyperlink w:anchor="_Toc242391250" w:history="1">
+      <w:hyperlink w:anchor="_Toc242394597" w:history="1">
         <w:r>
           <w:rPr>
             <w:rStyle w:val="a9"/>
@@ -2188,7 +2188,7 @@
           <w:rPr>
             <w:webHidden/>
           </w:rPr>
-          <w:instrText xml:space="preserve"> PAGEREF _Toc242391250 \h </w:instrText>
+          <w:instrText xml:space="preserve"> PAGEREF _Toc242394597 \h </w:instrText>
         </w:r>
         <w:r>
           <w:rPr>
@@ -2205,7 +2205,7 @@
           <w:rPr>
             <w:webHidden/>
           </w:rPr>
-          <w:t>17</w:t>
+          <w:t>18</w:t>
         </w:r>
         <w:r>
           <w:rPr>
@@ -2231,7 +2231,7 @@
           <w14:ligatures w14:val="standardContextual"/>
         </w:rPr>
       </w:pPr>
-      <w:hyperlink w:anchor="_Toc242391251" w:history="1">
+      <w:hyperlink w:anchor="_Toc242394598" w:history="1">
         <w:r>
           <w:rPr>
             <w:rStyle w:val="a9"/>
@@ -2280,7 +2280,7 @@
             <w:noProof/>
             <w:webHidden/>
           </w:rPr>
-          <w:instrText xml:space="preserve"> PAGEREF _Toc242391251 \h </w:instrText>
+          <w:instrText xml:space="preserve"> PAGEREF _Toc242394598 \h </w:instrText>
         </w:r>
         <w:r>
           <w:rPr>
@@ -2300,7 +2300,7 @@
             <w:noProof/>
             <w:webHidden/>
           </w:rPr>
-          <w:t>18</w:t>
+          <w:t>19</w:t>
         </w:r>
         <w:r>
           <w:rPr>
@@ -2323,7 +2323,7 @@
           <w14:ligatures w14:val="standardContextual"/>
         </w:rPr>
       </w:pPr>
-      <w:hyperlink w:anchor="_Toc242391252" w:history="1">
+      <w:hyperlink w:anchor="_Toc242394599" w:history="1">
         <w:r>
           <w:rPr>
             <w:rStyle w:val="a9"/>
@@ -2363,7 +2363,7 @@
           <w:rPr>
             <w:webHidden/>
           </w:rPr>
-          <w:instrText xml:space="preserve"> PAGEREF _Toc242391252 \h </w:instrText>
+          <w:instrText xml:space="preserve"> PAGEREF _Toc242394599 \h </w:instrText>
         </w:r>
         <w:r>
           <w:rPr>
@@ -2380,7 +2380,7 @@
           <w:rPr>
             <w:webHidden/>
           </w:rPr>
-          <w:t>19</w:t>
+          <w:t>20</w:t>
         </w:r>
         <w:r>
           <w:rPr>
@@ -2402,7 +2402,7 @@
           <w14:ligatures w14:val="standardContextual"/>
         </w:rPr>
       </w:pPr>
-      <w:hyperlink w:anchor="_Toc242391253" w:history="1">
+      <w:hyperlink w:anchor="_Toc242394600" w:history="1">
         <w:r>
           <w:rPr>
             <w:rStyle w:val="a9"/>
@@ -2442,7 +2442,7 @@
           <w:rPr>
             <w:webHidden/>
           </w:rPr>
-          <w:instrText xml:space="preserve"> PAGEREF _Toc242391253 \h </w:instrText>
+          <w:instrText xml:space="preserve"> PAGEREF _Toc242394600 \h </w:instrText>
         </w:r>
         <w:r>
           <w:rPr>
@@ -2459,7 +2459,7 @@
           <w:rPr>
             <w:webHidden/>
           </w:rPr>
-          <w:t>20</w:t>
+          <w:t>21</w:t>
         </w:r>
         <w:r>
           <w:rPr>
@@ -2481,7 +2481,7 @@
           <w14:ligatures w14:val="standardContextual"/>
         </w:rPr>
       </w:pPr>
-      <w:hyperlink w:anchor="_Toc242391254" w:history="1">
+      <w:hyperlink w:anchor="_Toc242394601" w:history="1">
         <w:r>
           <w:rPr>
             <w:rStyle w:val="a9"/>
@@ -2521,7 +2521,7 @@
           <w:rPr>
             <w:webHidden/>
           </w:rPr>
-          <w:instrText xml:space="preserve"> PAGEREF _Toc242391254 \h </w:instrText>
+          <w:instrText xml:space="preserve"> PAGEREF _Toc242394601 \h </w:instrText>
         </w:r>
         <w:r>
           <w:rPr>
@@ -2538,7 +2538,7 @@
           <w:rPr>
             <w:webHidden/>
           </w:rPr>
-          <w:t>21</w:t>
+          <w:t>22</w:t>
         </w:r>
         <w:r>
           <w:rPr>
@@ -2560,7 +2560,7 @@
           <w14:ligatures w14:val="standardContextual"/>
         </w:rPr>
       </w:pPr>
-      <w:hyperlink w:anchor="_Toc242391255" w:history="1">
+      <w:hyperlink w:anchor="_Toc242394602" w:history="1">
         <w:r>
           <w:rPr>
             <w:rStyle w:val="a9"/>
@@ -2600,7 +2600,7 @@
           <w:rPr>
             <w:webHidden/>
           </w:rPr>
-          <w:instrText xml:space="preserve"> PAGEREF _Toc242391255 \h </w:instrText>
+          <w:instrText xml:space="preserve"> PAGEREF _Toc242394602 \h </w:instrText>
         </w:r>
         <w:r>
           <w:rPr>
@@ -2617,7 +2617,7 @@
           <w:rPr>
             <w:webHidden/>
           </w:rPr>
-          <w:t>22</w:t>
+          <w:t>23</w:t>
         </w:r>
         <w:r>
           <w:rPr>
@@ -2639,7 +2639,7 @@
           <w14:ligatures w14:val="standardContextual"/>
         </w:rPr>
       </w:pPr>
-      <w:hyperlink w:anchor="_Toc242391256" w:history="1">
+      <w:hyperlink w:anchor="_Toc242394603" w:history="1">
         <w:r>
           <w:rPr>
             <w:rStyle w:val="a9"/>
@@ -2679,7 +2679,7 @@
           <w:rPr>
             <w:webHidden/>
           </w:rPr>
-          <w:instrText xml:space="preserve"> PAGEREF _Toc242391256 \h </w:instrText>
+          <w:instrText xml:space="preserve"> PAGEREF _Toc242394603 \h </w:instrText>
         </w:r>
         <w:r>
           <w:rPr>
@@ -2696,7 +2696,7 @@
           <w:rPr>
             <w:webHidden/>
           </w:rPr>
-          <w:t>22</w:t>
+          <w:t>23</w:t>
         </w:r>
         <w:r>
           <w:rPr>
@@ -2722,7 +2722,7 @@
           <w14:ligatures w14:val="standardContextual"/>
         </w:rPr>
       </w:pPr>
-      <w:hyperlink w:anchor="_Toc242391257" w:history="1">
+      <w:hyperlink w:anchor="_Toc242394604" w:history="1">
         <w:r>
           <w:rPr>
             <w:rStyle w:val="a9"/>
@@ -2771,7 +2771,7 @@
             <w:noProof/>
             <w:webHidden/>
           </w:rPr>
-          <w:instrText xml:space="preserve"> PAGEREF _Toc242391257 \h </w:instrText>
+          <w:instrText xml:space="preserve"> PAGEREF _Toc242394604 \h </w:instrText>
         </w:r>
         <w:r>
           <w:rPr>
@@ -2791,7 +2791,7 @@
             <w:noProof/>
             <w:webHidden/>
           </w:rPr>
-          <w:t>23</w:t>
+          <w:t>24</w:t>
         </w:r>
         <w:r>
           <w:rPr>
@@ -2814,7 +2814,7 @@
           <w14:ligatures w14:val="standardContextual"/>
         </w:rPr>
       </w:pPr>
-      <w:hyperlink w:anchor="_Toc242391258" w:history="1">
+      <w:hyperlink w:anchor="_Toc242394605" w:history="1">
         <w:r>
           <w:rPr>
             <w:rStyle w:val="a9"/>
@@ -2854,7 +2854,7 @@
           <w:rPr>
             <w:webHidden/>
           </w:rPr>
-          <w:instrText xml:space="preserve"> PAGEREF _Toc242391258 \h </w:instrText>
+          <w:instrText xml:space="preserve"> PAGEREF _Toc242394605 \h </w:instrText>
         </w:r>
         <w:r>
           <w:rPr>
@@ -2871,7 +2871,7 @@
           <w:rPr>
             <w:webHidden/>
           </w:rPr>
-          <w:t>23</w:t>
+          <w:t>24</w:t>
         </w:r>
         <w:r>
           <w:rPr>
@@ -2893,7 +2893,7 @@
           <w14:ligatures w14:val="standardContextual"/>
         </w:rPr>
       </w:pPr>
-      <w:hyperlink w:anchor="_Toc242391259" w:history="1">
+      <w:hyperlink w:anchor="_Toc242394606" w:history="1">
         <w:r>
           <w:rPr>
             <w:rStyle w:val="a9"/>
@@ -2933,7 +2933,7 @@
           <w:rPr>
             <w:webHidden/>
           </w:rPr>
-          <w:instrText xml:space="preserve"> PAGEREF _Toc242391259 \h </w:instrText>
+          <w:instrText xml:space="preserve"> PAGEREF _Toc242394606 \h </w:instrText>
         </w:r>
         <w:r>
           <w:rPr>
@@ -2950,7 +2950,7 @@
           <w:rPr>
             <w:webHidden/>
           </w:rPr>
-          <w:t>24</w:t>
+          <w:t>25</w:t>
         </w:r>
         <w:r>
           <w:rPr>
@@ -2972,7 +2972,7 @@
           <w14:ligatures w14:val="standardContextual"/>
         </w:rPr>
       </w:pPr>
-      <w:hyperlink w:anchor="_Toc242391260" w:history="1">
+      <w:hyperlink w:anchor="_Toc242394607" w:history="1">
         <w:r>
           <w:rPr>
             <w:rStyle w:val="a9"/>
@@ -3012,7 +3012,7 @@
           <w:rPr>
             <w:webHidden/>
           </w:rPr>
-          <w:instrText xml:space="preserve"> PAGEREF _Toc242391260 \h </w:instrText>
+          <w:instrText xml:space="preserve"> PAGEREF _Toc242394607 \h </w:instrText>
         </w:r>
         <w:r>
           <w:rPr>
@@ -3029,7 +3029,7 @@
           <w:rPr>
             <w:webHidden/>
           </w:rPr>
-          <w:t>26</w:t>
+          <w:t>27</w:t>
         </w:r>
         <w:r>
           <w:rPr>
@@ -3051,7 +3051,7 @@
           <w14:ligatures w14:val="standardContextual"/>
         </w:rPr>
       </w:pPr>
-      <w:hyperlink w:anchor="_Toc242391261" w:history="1">
+      <w:hyperlink w:anchor="_Toc242394608" w:history="1">
         <w:r>
           <w:rPr>
             <w:rStyle w:val="a9"/>
@@ -3091,7 +3091,7 @@
           <w:rPr>
             <w:webHidden/>
           </w:rPr>
-          <w:instrText xml:space="preserve"> PAGEREF _Toc242391261 \h </w:instrText>
+          <w:instrText xml:space="preserve"> PAGEREF _Toc242394608 \h </w:instrText>
         </w:r>
         <w:r>
           <w:rPr>
@@ -3108,7 +3108,7 @@
           <w:rPr>
             <w:webHidden/>
           </w:rPr>
-          <w:t>26</w:t>
+          <w:t>27</w:t>
         </w:r>
         <w:r>
           <w:rPr>
@@ -3134,7 +3134,7 @@
           <w14:ligatures w14:val="standardContextual"/>
         </w:rPr>
       </w:pPr>
-      <w:hyperlink w:anchor="_Toc242391262" w:history="1">
+      <w:hyperlink w:anchor="_Toc242394609" w:history="1">
         <w:r>
           <w:rPr>
             <w:rStyle w:val="a9"/>
@@ -3183,7 +3183,7 @@
             <w:noProof/>
             <w:webHidden/>
           </w:rPr>
-          <w:instrText xml:space="preserve"> PAGEREF _Toc242391262 \h </w:instrText>
+          <w:instrText xml:space="preserve"> PAGEREF _Toc242394609 \h </w:instrText>
         </w:r>
         <w:r>
           <w:rPr>
@@ -3203,7 +3203,7 @@
             <w:noProof/>
             <w:webHidden/>
           </w:rPr>
-          <w:t>27</w:t>
+          <w:t>28</w:t>
         </w:r>
         <w:r>
           <w:rPr>
@@ -3226,7 +3226,7 @@
           <w14:ligatures w14:val="standardContextual"/>
         </w:rPr>
       </w:pPr>
-      <w:hyperlink w:anchor="_Toc242391263" w:history="1">
+      <w:hyperlink w:anchor="_Toc242394610" w:history="1">
         <w:r>
           <w:rPr>
             <w:rStyle w:val="a9"/>
@@ -3266,7 +3266,7 @@
           <w:rPr>
             <w:webHidden/>
           </w:rPr>
-          <w:instrText xml:space="preserve"> PAGEREF _Toc242391263 \h </w:instrText>
+          <w:instrText xml:space="preserve"> PAGEREF _Toc242394610 \h </w:instrText>
         </w:r>
         <w:r>
           <w:rPr>
@@ -3283,7 +3283,7 @@
           <w:rPr>
             <w:webHidden/>
           </w:rPr>
-          <w:t>27</w:t>
+          <w:t>28</w:t>
         </w:r>
         <w:r>
           <w:rPr>
@@ -3305,7 +3305,7 @@
           <w14:ligatures w14:val="standardContextual"/>
         </w:rPr>
       </w:pPr>
-      <w:hyperlink w:anchor="_Toc242391264" w:history="1">
+      <w:hyperlink w:anchor="_Toc242394611" w:history="1">
         <w:r>
           <w:rPr>
             <w:rStyle w:val="a9"/>
@@ -3345,7 +3345,7 @@
           <w:rPr>
             <w:webHidden/>
           </w:rPr>
-          <w:instrText xml:space="preserve"> PAGEREF _Toc242391264 \h </w:instrText>
+          <w:instrText xml:space="preserve"> PAGEREF _Toc242394611 \h </w:instrText>
         </w:r>
         <w:r>
           <w:rPr>
@@ -3362,7 +3362,7 @@
           <w:rPr>
             <w:webHidden/>
           </w:rPr>
-          <w:t>28</w:t>
+          <w:t>29</w:t>
         </w:r>
         <w:r>
           <w:rPr>
@@ -3384,7 +3384,7 @@
           <w14:ligatures w14:val="standardContextual"/>
         </w:rPr>
       </w:pPr>
-      <w:hyperlink w:anchor="_Toc242391265" w:history="1">
+      <w:hyperlink w:anchor="_Toc242394612" w:history="1">
         <w:r>
           <w:rPr>
             <w:rStyle w:val="a9"/>
@@ -3424,7 +3424,7 @@
           <w:rPr>
             <w:webHidden/>
           </w:rPr>
-          <w:instrText xml:space="preserve"> PAGEREF _Toc242391265 \h </w:instrText>
+          <w:instrText xml:space="preserve"> PAGEREF _Toc242394612 \h </w:instrText>
         </w:r>
         <w:r>
           <w:rPr>
@@ -3441,7 +3441,7 @@
           <w:rPr>
             <w:webHidden/>
           </w:rPr>
-          <w:t>29</w:t>
+          <w:t>30</w:t>
         </w:r>
         <w:r>
           <w:rPr>
@@ -3463,7 +3463,7 @@
           <w14:ligatures w14:val="standardContextual"/>
         </w:rPr>
       </w:pPr>
-      <w:hyperlink w:anchor="_Toc242391266" w:history="1">
+      <w:hyperlink w:anchor="_Toc242394613" w:history="1">
         <w:r>
           <w:rPr>
             <w:rStyle w:val="a9"/>
@@ -3503,7 +3503,7 @@
           <w:rPr>
             <w:webHidden/>
           </w:rPr>
-          <w:instrText xml:space="preserve"> PAGEREF _Toc242391266 \h </w:instrText>
+          <w:instrText xml:space="preserve"> PAGEREF _Toc242394613 \h </w:instrText>
         </w:r>
         <w:r>
           <w:rPr>
@@ -3520,7 +3520,7 @@
           <w:rPr>
             <w:webHidden/>
           </w:rPr>
-          <w:t>30</w:t>
+          <w:t>31</w:t>
         </w:r>
         <w:r>
           <w:rPr>
@@ -3542,7 +3542,7 @@
           <w14:ligatures w14:val="standardContextual"/>
         </w:rPr>
       </w:pPr>
-      <w:hyperlink w:anchor="_Toc242391267" w:history="1">
+      <w:hyperlink w:anchor="_Toc242394614" w:history="1">
         <w:r>
           <w:rPr>
             <w:rStyle w:val="a9"/>
@@ -3582,7 +3582,7 @@
           <w:rPr>
             <w:webHidden/>
           </w:rPr>
-          <w:instrText xml:space="preserve"> PAGEREF _Toc242391267 \h </w:instrText>
+          <w:instrText xml:space="preserve"> PAGEREF _Toc242394614 \h </w:instrText>
         </w:r>
         <w:r>
           <w:rPr>
@@ -3599,7 +3599,7 @@
           <w:rPr>
             <w:webHidden/>
           </w:rPr>
-          <w:t>31</w:t>
+          <w:t>32</w:t>
         </w:r>
         <w:r>
           <w:rPr>
@@ -3625,7 +3625,7 @@
           <w14:ligatures w14:val="standardContextual"/>
         </w:rPr>
       </w:pPr>
-      <w:hyperlink w:anchor="_Toc242391268" w:history="1">
+      <w:hyperlink w:anchor="_Toc242394615" w:history="1">
         <w:r>
           <w:rPr>
             <w:rStyle w:val="a9"/>
@@ -3674,7 +3674,7 @@
             <w:noProof/>
             <w:webHidden/>
           </w:rPr>
-          <w:instrText xml:space="preserve"> PAGEREF _Toc242391268 \h </w:instrText>
+          <w:instrText xml:space="preserve"> PAGEREF _Toc242394615 \h </w:instrText>
         </w:r>
         <w:r>
           <w:rPr>
@@ -3694,7 +3694,7 @@
             <w:noProof/>
             <w:webHidden/>
           </w:rPr>
-          <w:t>31</w:t>
+          <w:t>32</w:t>
         </w:r>
         <w:r>
           <w:rPr>
@@ -3721,7 +3721,7 @@
           <w14:ligatures w14:val="standardContextual"/>
         </w:rPr>
       </w:pPr>
-      <w:hyperlink w:anchor="_Toc242391269" w:history="1">
+      <w:hyperlink w:anchor="_Toc242394616" w:history="1">
         <w:r>
           <w:rPr>
             <w:rStyle w:val="a9"/>
@@ -3748,7 +3748,7 @@
             <w:noProof/>
             <w:webHidden/>
           </w:rPr>
-          <w:instrText xml:space="preserve"> PAGEREF _Toc242391269 \h </w:instrText>
+          <w:instrText xml:space="preserve"> PAGEREF _Toc242394616 \h </w:instrText>
         </w:r>
         <w:r>
           <w:rPr>
@@ -3768,7 +3768,7 @@
             <w:noProof/>
             <w:webHidden/>
           </w:rPr>
-          <w:t>32</w:t>
+          <w:t>33</w:t>
         </w:r>
         <w:r>
           <w:rPr>
@@ -3817,7 +3817,7 @@
       <w:pPr>
         <w:pStyle w:val="1"/>
       </w:pPr>
-      <w:bookmarkStart w:id="1" w:name="_Toc242391228"/>
+      <w:bookmarkStart w:id="1" w:name="_Toc242394575"/>
       <w:r>
         <w:lastRenderedPageBreak/>
         <w:t>Progress &amp; Achievements</w:t>
@@ -3838,10 +3838,10 @@
         <w:t>since our Week 5 proposal</w:t>
       </w:r>
       <w:r>
-        <w:t xml:space="preserve"> — the four sprints from 7 September to 7 October — and on the plan to the end of semester. Section 1 starts from the people who use the platform and follows each of their needs through the tickets and sprints that met it, then describes the front end, the back end and the data, and shows that the minimum viable product works. Section 2 covers the obstacles met, sprint by sprint, and the risks ahead; Section 3 where the timeline has moved and why; Section 4 the updated plan, milestones and reporting. Sectio</w:t>
+        <w:t>, that is, in the four sprints from 7 September to 7 October, and on the plan to the end of semester. Section 1 starts from the people who use the platform and follows each of their needs through the tickets and sprints that met it, then describes the front end, the back end and the data, and shows that the minimum viable product works. Section 2 covers the obstacles met, sprint by sprint, and the risks ahead; Section 3 where the timeline has moved and why; Section 4 the updated plan, milestones and reporti</w:t>
       </w:r>
       <w:r>
-        <w:t xml:space="preserve">n 5 acknowledges the use of AI tools, and Appendix A explains the identifiers used throughout. Unless stated otherwise, every statement about the software refers to the main branch of the team's GitHub repository (USYD-CS-Capstone/hej) at commit </w:t>
+        <w:t xml:space="preserve">ng. Section 5 acknowledges the use of AI tools, and Appendix A explains the identifiers used throughout. Unless stated otherwise, every statement about the software refers to the main branch of the team's GitHub repository (USYD-CS-Capstone/hej) at commit </w:t>
       </w:r>
       <w:r>
         <w:rPr>
@@ -3859,7 +3859,7 @@
       <w:pPr>
         <w:pStyle w:val="2"/>
       </w:pPr>
-      <w:bookmarkStart w:id="2" w:name="_Toc242391229"/>
+      <w:bookmarkStart w:id="2" w:name="_Toc242394576"/>
       <w:r>
         <w:t>The project in brief</w:t>
       </w:r>
@@ -3870,7 +3870,7 @@
         <w:pStyle w:val="ReportNormal"/>
       </w:pPr>
       <w:r>
-        <w:t xml:space="preserve">Hej is Arc Intelligence's platform for producing labelled datasets for AI. People annotate items (for example, assigning a topic to a news headline), reviewers accept or reject that work, and disagreements are settled by an expert. The client handed over a working but immature codebase — a Next.js web application and a FastAPI service with a relational database — and asked us not to make labelling faster but to make the resulting dataset </w:t>
+        <w:t xml:space="preserve">Hej is Arc Intelligence's platform for producing labelled datasets for AI. People annotate items (for example, assigning a topic to a news headline), reviewers accept or reject that work, and disagreements are settled by an expert. The client handed over a working but immature codebase, a Next.js web application and a FastAPI service with a relational database, and asked us not to make labelling faster but to make the resulting dataset </w:t>
       </w:r>
       <w:r>
         <w:rPr>
@@ -3888,7 +3888,7 @@
         <w:t>how did this label get here</w:t>
       </w:r>
       <w:r>
-        <w:t xml:space="preserve"> — who annotated it, what the AI suggested and whether the person accepted it, who reviewed it, how any disagreement was settled and under which guideline — and it must refuse to release data that cannot answer. The brief groups this into six pillars: </w:t>
+        <w:t xml:space="preserve">: who annotated it, what the AI suggested and whether the person accepted it, who reviewed it, how any disagreement was settled and under which guideline. It must also refuse to release data that cannot answer. The brief groups this into six pillars: </w:t>
       </w:r>
       <w:r>
         <w:rPr>
@@ -3965,21 +3965,21 @@
         <w:t>finalised work cannot be overwritten</w:t>
       </w:r>
       <w:r>
-        <w:t xml:space="preserve">). Each story is broken into Jira tickets (SCRUM-n), and each ticket is delivered through a GitHub pull request (#n) that a team member other than the author reviews before it </w:t>
+        <w:t xml:space="preserve">). Each story is broken into Jira tickets (SCRUM-n), and each ticket is delivered through a GitHub pull request (#n) that a team member other than the author reviews before it is merged. Work is estimated in units (u): one unit is two to three subtasks, and one </w:t>
       </w:r>
       <w:r>
         <w:lastRenderedPageBreak/>
-        <w:t>is merged. Work is estimated in units (u): one unit is two to three subtasks, and one Jira story point equals one unit. A story counts as complete only when it meets our Definition of Done — demonstrable in the running application, shipped with tests, any linked defect proven fixed by a test that fails on the old code, documentation u</w:t>
+        <w:t>Jira story point equals one unit. A story counts as complete only when it meets our Definition of Done: demonstrable in the running application, shipped with tests, any linked defect proven fixed by a test that fails on the old code, documentation up</w:t>
       </w:r>
       <w:r>
-        <w:t>pdated, and reviewed by someone other than its author.</w:t>
+        <w:t>dated, and reviewed by someone other than its author.</w:t>
       </w:r>
     </w:p>
     <w:p>
       <w:pPr>
         <w:pStyle w:val="2"/>
       </w:pPr>
-      <w:bookmarkStart w:id="3" w:name="_Toc242391230"/>
+      <w:bookmarkStart w:id="3" w:name="_Toc242394577"/>
       <w:r>
         <w:t>Summary: are we on track?</w:t>
       </w:r>
@@ -4562,7 +4562,7 @@
       <w:pPr>
         <w:pStyle w:val="2"/>
       </w:pPr>
-      <w:bookmarkStart w:id="4" w:name="_Toc242391231"/>
+      <w:bookmarkStart w:id="4" w:name="_Toc242394578"/>
       <w:r>
         <w:t>Who the platform is for</w:t>
       </w:r>
@@ -5234,7 +5234,7 @@
       <w:pPr>
         <w:pStyle w:val="2"/>
       </w:pPr>
-      <w:bookmarkStart w:id="5" w:name="_Toc242391232"/>
+      <w:bookmarkStart w:id="5" w:name="_Toc242394579"/>
       <w:r>
         <w:t>From user needs to sprints</w:t>
       </w:r>
@@ -5561,7 +5561,7 @@
                 <w:sz w:val="15"/>
                 <w:szCs w:val="15"/>
               </w:rPr>
-              <w:t>— (enforced by the server)</w:t>
+              <w:t>None needed (enforced by the server)</w:t>
             </w:r>
           </w:p>
         </w:tc>
@@ -6484,7 +6484,7 @@
         </w:rPr>
         <w:lastRenderedPageBreak/>
         <w:drawing>
-          <wp:inline distT="0" distB="0" distL="0" distR="0" wp14:anchorId="67701B2D" wp14:editId="52CF84B5">
+          <wp:inline distT="0" distB="0" distL="0" distR="0" wp14:anchorId="6AD3CAF0" wp14:editId="5A1D477B">
             <wp:extent cx="5212080" cy="4366877"/>
             <wp:effectExtent l="0" t="0" r="0" b="0"/>
             <wp:docPr id="101" name="Figure 101"/>
@@ -6541,7 +6541,7 @@
       <w:pPr>
         <w:pStyle w:val="2"/>
       </w:pPr>
-      <w:bookmarkStart w:id="6" w:name="_Toc242391233"/>
+      <w:bookmarkStart w:id="6" w:name="_Toc242394580"/>
       <w:r>
         <w:t>Sprint by sprint: what was built and what was solved</w:t>
       </w:r>
@@ -7078,7 +7078,7 @@
                 <w:sz w:val="15"/>
                 <w:szCs w:val="15"/>
               </w:rPr>
-              <w:t>20 / —</w:t>
+              <w:t>20 / in progress</w:t>
             </w:r>
           </w:p>
         </w:tc>
@@ -7214,7 +7214,7 @@
       <w:pPr>
         <w:pStyle w:val="2"/>
       </w:pPr>
-      <w:bookmarkStart w:id="7" w:name="_Toc242391234"/>
+      <w:bookmarkStart w:id="7" w:name="_Toc242394581"/>
       <w:r>
         <w:t>Front end: what each user can now do</w:t>
       </w:r>
@@ -7232,7 +7232,7 @@
       <w:pPr>
         <w:pStyle w:val="3"/>
       </w:pPr>
-      <w:bookmarkStart w:id="8" w:name="_Toc242391235"/>
+      <w:bookmarkStart w:id="8" w:name="_Toc242394582"/>
       <w:r>
         <w:t>Administrator and invitee</w:t>
       </w:r>
@@ -7243,10 +7243,10 @@
         <w:pStyle w:val="ReportNormal"/>
       </w:pPr>
       <w:r>
-        <w:t>The members page (Figure 2) lists everyone in the organisation with their account status, membership status and roles, and lets the administrator create users, edit roles and status, and remove members (SCRUM-90, #28). When inviting, the administrator must choose the roles — the client asked for no default — and the invitee sees pending invitations in their own list and accepts one, receiving exactly those roles (SCRUM-115, #56). Two front-end faults found in review were fixed on the way: reissuing an invit</w:t>
+        <w:t>The members page (Figure 2) lists everyone in the organisation with their account status, membership status and roles, and lets the administrator create users, edit roles and status, and remove members (SCRUM-90, #28). When inviting, the administrator must choose the roles, because the client asked for no default role, and the invitee sees pending invitations in their own list and accepts one, receiving exactly those roles (SCRUM-115, #56). Two front-end faults found in review were fixed on the way: reissui</w:t>
       </w:r>
       <w:r>
-        <w:t>ation could undo an acceptance, and switching organisation could let a late response overwrite the new organisation's data.</w:t>
+        <w:t>ng an invitation could undo an acceptance, and switching organisation could let a late response overwrite the new organisation's data.</w:t>
       </w:r>
     </w:p>
     <w:p>
@@ -7261,7 +7261,7 @@
         </w:rPr>
         <w:lastRenderedPageBreak/>
         <w:drawing>
-          <wp:inline distT="0" distB="0" distL="0" distR="0" wp14:anchorId="7E22FB27" wp14:editId="1F09FA7C">
+          <wp:inline distT="0" distB="0" distL="0" distR="0" wp14:anchorId="304C21E9" wp14:editId="73BDB485">
             <wp:extent cx="4754880" cy="2971800"/>
             <wp:effectExtent l="0" t="0" r="0" b="0"/>
             <wp:docPr id="102" name="Figure 102"/>
@@ -7318,7 +7318,7 @@
       <w:pPr>
         <w:pStyle w:val="3"/>
       </w:pPr>
-      <w:bookmarkStart w:id="9" w:name="_Toc242391236"/>
+      <w:bookmarkStart w:id="9" w:name="_Toc242394583"/>
       <w:r>
         <w:t>Project manager and task owner</w:t>
       </w:r>
@@ -7338,7 +7338,7 @@
         <w:t>Enforced</w:t>
       </w:r>
       <w:r>
-        <w:t xml:space="preserve"> — already changing what the workflow allows — and which are </w:t>
+        <w:t xml:space="preserve">, meaning they already change what the workflow allows, and which are </w:t>
       </w:r>
       <w:r>
         <w:rPr>
@@ -7365,7 +7365,7 @@
         </w:rPr>
         <w:lastRenderedPageBreak/>
         <w:drawing>
-          <wp:inline distT="0" distB="0" distL="0" distR="0" wp14:anchorId="5CDB2F80" wp14:editId="5FBA3424">
+          <wp:inline distT="0" distB="0" distL="0" distR="0" wp14:anchorId="4FC33A17" wp14:editId="0F98743A">
             <wp:extent cx="5120640" cy="3031183"/>
             <wp:effectExtent l="0" t="0" r="0" b="0"/>
             <wp:docPr id="103" name="Figure 103"/>
@@ -7422,7 +7422,7 @@
       <w:pPr>
         <w:pStyle w:val="3"/>
       </w:pPr>
-      <w:bookmarkStart w:id="10" w:name="_Toc242391237"/>
+      <w:bookmarkStart w:id="10" w:name="_Toc242394584"/>
       <w:r>
         <w:t>Annotator</w:t>
       </w:r>
@@ -7433,7 +7433,10 @@
         <w:pStyle w:val="ReportNormal"/>
       </w:pPr>
       <w:r>
-        <w:t>The annotator's work list (Figure 4) shows only items their role allows and how many of the required human submissions each has — "2 of 2 submitted" greys out Annotate, while "0 of 2" invites work (#49). Opening an item brings up the work panel, which no longer shows colleagues' drafts or answers, keeps edits on returned work instead of reverting them, and reports any refusal in the server's own words (#43). The Annotate and Review pages now load in about half a second rather than three (#54).</w:t>
+        <w:t xml:space="preserve">The annotator's work list (Figure 4) shows only items their role allows and how many of the required human submissions each has. An item showing "2 of 2 submitted" has its Annotate button greyed out, while one showing "0 of 2" is open for work (#49). Opening an item brings up the work panel, which no longer shows colleagues' drafts or answers, keeps edits on returned work instead of reverting them, and reports any refusal in the server's own words (#43). The Annotate and Review pages now load in about half </w:t>
+      </w:r>
+      <w:r>
+        <w:t>a second rather than three (#54).</w:t>
       </w:r>
     </w:p>
     <w:p>
@@ -7446,8 +7449,9 @@
         <w:rPr>
           <w:noProof/>
         </w:rPr>
+        <w:lastRenderedPageBreak/>
         <w:drawing>
-          <wp:inline distT="0" distB="0" distL="0" distR="0" wp14:anchorId="056F1F79" wp14:editId="131728FF">
+          <wp:inline distT="0" distB="0" distL="0" distR="0" wp14:anchorId="66AF8FD0" wp14:editId="782D07FC">
             <wp:extent cx="5120640" cy="3222991"/>
             <wp:effectExtent l="0" t="0" r="0" b="0"/>
             <wp:docPr id="104" name="Figure 104"/>
@@ -7504,9 +7508,8 @@
       <w:pPr>
         <w:pStyle w:val="3"/>
       </w:pPr>
-      <w:bookmarkStart w:id="11" w:name="_Toc242391238"/>
+      <w:bookmarkStart w:id="11" w:name="_Toc242394585"/>
       <w:r>
-        <w:lastRenderedPageBreak/>
         <w:t>Reviewer</w:t>
       </w:r>
       <w:bookmarkEnd w:id="11"/>
@@ -7516,10 +7519,10 @@
         <w:pStyle w:val="ReportNormal"/>
       </w:pPr>
       <w:r>
-        <w:t>The review panel (Figure 5) lists the submissions awaiting this reviewer on an item, by author, and the reviewer picks one; the decision is recorded against that submission only (#34, #44). The panel shows the task's review policy — here one approval and a justification for every decision — and offers accept, adjust, reject and escalate. On an AI-assisted task the AI's answer arrives for review in the same panel, labelled as AI-assisted (Figure 6). A sampled share of submissions is shown to a second reviewe</w:t>
+        <w:t>The review panel (Figure 5) lists the submissions awaiting this reviewer on an item, by author, and the reviewer picks one; the decision is recorded against that submission only (#34, #44). The panel shows the task's review policy, which here requires one approval and a justification for every decision, and offers accept, adjust, reject and escalate. On an AI-assisted task the AI's answer arrives for review in the same panel, labelled as AI-assisted (Figure 6). A sampled share of submissions is shown to a s</w:t>
       </w:r>
       <w:r>
-        <w:t>r who cannot see the first decision until their own is in (#53).</w:t>
+        <w:t>econd reviewer who cannot see the first decision until their own is in (#53).</w:t>
       </w:r>
     </w:p>
     <w:p>
@@ -7532,8 +7535,9 @@
         <w:rPr>
           <w:noProof/>
         </w:rPr>
+        <w:lastRenderedPageBreak/>
         <w:drawing>
-          <wp:inline distT="0" distB="0" distL="0" distR="0" wp14:anchorId="7A8C6F69" wp14:editId="789B18DC">
+          <wp:inline distT="0" distB="0" distL="0" distR="0" wp14:anchorId="72983E30" wp14:editId="5596AA27">
             <wp:extent cx="5120640" cy="3096768"/>
             <wp:effectExtent l="0" t="0" r="0" b="0"/>
             <wp:docPr id="105" name="Figure 105"/>
@@ -7596,9 +7600,8 @@
         <w:rPr>
           <w:noProof/>
         </w:rPr>
-        <w:lastRenderedPageBreak/>
         <w:drawing>
-          <wp:inline distT="0" distB="0" distL="0" distR="0" wp14:anchorId="7115AABA" wp14:editId="674396AE">
+          <wp:inline distT="0" distB="0" distL="0" distR="0" wp14:anchorId="100A779B" wp14:editId="7C9B3C30">
             <wp:extent cx="5120640" cy="3096768"/>
             <wp:effectExtent l="0" t="0" r="0" b="0"/>
             <wp:docPr id="106" name="Figure 106"/>
@@ -7655,7 +7658,7 @@
       <w:pPr>
         <w:pStyle w:val="3"/>
       </w:pPr>
-      <w:bookmarkStart w:id="12" w:name="_Toc242391239"/>
+      <w:bookmarkStart w:id="12" w:name="_Toc242394586"/>
       <w:r>
         <w:t>Expert</w:t>
       </w:r>
@@ -7666,7 +7669,11 @@
         <w:pStyle w:val="ReportNormal"/>
       </w:pPr>
       <w:r>
-        <w:t>The dispute desk (Figure 7) lists items escalated to an expert, with the reviewer's reason, and records the expert's decision — finalise, or send back to the annotator — with a note. The server refuses the decision from anyone who annotated, reviewed or routed the item, administrators included (#45, #53). Once the expert rules, the item joins the task's finalised list (Figure 8) and can be exported. The client's refined three-outcome ruling and the dedicated dispute screens are Week 9–10 work.</w:t>
+        <w:t xml:space="preserve">The dispute desk (Figure 7) lists items escalated to an expert, with the reviewer's reason, and records the expert's decision, either to finalise the item or to send it back to the annotator, together with a note. The server refuses the decision from anyone who annotated, reviewed or routed the item, administrators included (#45, #53). Once the expert rules, the item joins the task's finalised list (Figure 8) and can be exported. The </w:t>
+      </w:r>
+      <w:r>
+        <w:lastRenderedPageBreak/>
+        <w:t>client's refined three-outcome ruling and the dedicated dispute screens are Week 9–10 work.</w:t>
       </w:r>
     </w:p>
     <w:p>
@@ -7680,7 +7687,7 @@
           <w:noProof/>
         </w:rPr>
         <w:drawing>
-          <wp:inline distT="0" distB="0" distL="0" distR="0" wp14:anchorId="26F88DD2" wp14:editId="28656764">
+          <wp:inline distT="0" distB="0" distL="0" distR="0" wp14:anchorId="6A60F732" wp14:editId="24F81973">
             <wp:extent cx="5120640" cy="1471448"/>
             <wp:effectExtent l="0" t="0" r="0" b="0"/>
             <wp:docPr id="107" name="Figure 107"/>
@@ -7744,7 +7751,7 @@
           <w:noProof/>
         </w:rPr>
         <w:drawing>
-          <wp:inline distT="0" distB="0" distL="0" distR="0" wp14:anchorId="553C2059" wp14:editId="7EB1D8EF">
+          <wp:inline distT="0" distB="0" distL="0" distR="0" wp14:anchorId="5CF513E9" wp14:editId="4109C842">
             <wp:extent cx="5120640" cy="1227755"/>
             <wp:effectExtent l="0" t="0" r="0" b="0"/>
             <wp:docPr id="108" name="Figure 108"/>
@@ -7801,9 +7808,8 @@
       <w:pPr>
         <w:pStyle w:val="2"/>
       </w:pPr>
-      <w:bookmarkStart w:id="13" w:name="_Toc242391240"/>
+      <w:bookmarkStart w:id="13" w:name="_Toc242394587"/>
       <w:r>
-        <w:lastRenderedPageBreak/>
         <w:t>Back end and data</w:t>
       </w:r>
       <w:bookmarkEnd w:id="13"/>
@@ -7812,7 +7818,7 @@
       <w:pPr>
         <w:pStyle w:val="3"/>
       </w:pPr>
-      <w:bookmarkStart w:id="14" w:name="_Toc242391241"/>
+      <w:bookmarkStart w:id="14" w:name="_Toc242394588"/>
       <w:r>
         <w:t>The dataset</w:t>
       </w:r>
@@ -7850,7 +7856,7 @@
         <w:t>structured</w:t>
       </w:r>
       <w:r>
-        <w:t xml:space="preserve"> — JSONL records, each with an identifier, the text and gold labels — while images, audio and video are </w:t>
+        <w:t xml:space="preserve">, as JSONL records that each hold an identifier, the text and gold labels, while images, audio and video are </w:t>
       </w:r>
       <w:r>
         <w:rPr>
@@ -8289,8 +8295,9 @@
       <w:pPr>
         <w:pStyle w:val="3"/>
       </w:pPr>
-      <w:bookmarkStart w:id="15" w:name="_Toc242391242"/>
+      <w:bookmarkStart w:id="15" w:name="_Toc242394589"/>
       <w:r>
+        <w:lastRenderedPageBreak/>
         <w:t>AI: external models, not trained by us</w:t>
       </w:r>
       <w:bookmarkEnd w:id="15"/>
@@ -8306,14 +8313,14 @@
         <w:t>We do not train or fine-tune any model.</w:t>
       </w:r>
       <w:r>
-        <w:t xml:space="preserve"> The platform calls external large language models through one OpenAI-compatible client — hosted APIs from OpenAI, Qwen (DashScope), DeepSeek, Doubao (Ark) and Groq, or a model run locally through Ollama, as in this report's screenshots — and records which provider and model produced each answer. The AI's output is treated as one more author's answer that people must review, never as ground truth; a failed call is reported as a failure rather than turned into a placeholder answer (C1–C3).</w:t>
+        <w:t xml:space="preserve"> The platform calls external large language models through one OpenAI-compatible client, which can reach hosted APIs from OpenAI, Qwen (DashScope), DeepSeek, Doubao (Ark) and Groq, or a model run locally through Ollama, as in this report's screenshots. It records which provider and model produced each answer. The AI's output is treated as one more author's answer that people must review, never as ground truth; a failed call is reported as a failure rather than turned into a placeholder answer (C1–C3).</w:t>
       </w:r>
     </w:p>
     <w:p>
       <w:pPr>
         <w:pStyle w:val="3"/>
       </w:pPr>
-      <w:bookmarkStart w:id="16" w:name="_Toc242391243"/>
+      <w:bookmarkStart w:id="16" w:name="_Toc242394590"/>
       <w:r>
         <w:t>How the back end supports the front end</w:t>
       </w:r>
@@ -8492,7 +8499,6 @@
                 <w:sz w:val="16"/>
                 <w:szCs w:val="16"/>
               </w:rPr>
-              <w:lastRenderedPageBreak/>
               <w:t>Capabilities from current roles; cross-project write guards (#4, #14)</w:t>
             </w:r>
           </w:p>
@@ -9214,7 +9220,7 @@
       <w:pPr>
         <w:pStyle w:val="3"/>
       </w:pPr>
-      <w:bookmarkStart w:id="17" w:name="_Toc242391244"/>
+      <w:bookmarkStart w:id="17" w:name="_Toc242394591"/>
       <w:r>
         <w:t>Back-end scripts and services used in operations</w:t>
       </w:r>
@@ -9235,6 +9241,7 @@
         <w:spacing w:before="200" w:after="80" w:line="240" w:lineRule="auto"/>
       </w:pPr>
       <w:r>
+        <w:lastRenderedPageBreak/>
         <w:t>Table 7. Operational scripts and services, and what they enable</w:t>
       </w:r>
     </w:p>
@@ -9712,7 +9719,7 @@
       <w:pPr>
         <w:pStyle w:val="3"/>
       </w:pPr>
-      <w:bookmarkStart w:id="18" w:name="_Toc242391245"/>
+      <w:bookmarkStart w:id="18" w:name="_Toc242394592"/>
       <w:r>
         <w:t>Records, quality and inherited defects</w:t>
       </w:r>
@@ -9723,11 +9730,10 @@
         <w:pStyle w:val="ReportNormal"/>
       </w:pPr>
       <w:r>
-        <w:t xml:space="preserve">Every answer is now kept as a version of its own — the AI's, each annotator's, each resubmission — and at most one version per item can be marked authoritative, which the database itself enforces; reopening an item clears the marker but keeps every version (F3; #47). This is what the release work in Weeks 9 and 10 builds on. Each action also writes an audit entry with its actor and time (Figure 9). The evaluation harness (#39) runs scripted cases through the real API as real users holding real roles, </w:t>
+        <w:t xml:space="preserve">Every answer is now kept as a version of its own, whether it comes from the AI, an annotator or a resubmission, and at most one version per item can be marked authoritative, which the database itself enforces; reopening an item clears the marker but keeps every version (F3; #47). This is what the release work in Weeks 9 and 10 builds on. Each action also writes an audit entry with its actor and time (Figure 9). The evaluation harness (#39) runs scripted cases through the real API as real users holding real </w:t>
       </w:r>
       <w:r>
-        <w:lastRenderedPageBreak/>
-        <w:t>and its four cases pass; a draft PR (#51) adds the casebook's adversarial categories and gold records. The platform runs on PostgreSQL 18 as well as SQLite, and CI runs the backend suite on both, with PostgreSQL set to a non-UTC time zone to expose date-handling bugs (#24).</w:t>
+        <w:t>roles, and its four cases pass; a draft PR (#51) adds the casebook's adversarial categories and gold records. The platform runs on PostgreSQL 18 as well as SQLite, and CI runs the backend suite on both, with PostgreSQL set to a non-UTC time zone to expose date-handling bugs (#24).</w:t>
       </w:r>
     </w:p>
     <w:p>
@@ -9740,8 +9746,9 @@
         <w:rPr>
           <w:noProof/>
         </w:rPr>
+        <w:lastRenderedPageBreak/>
         <w:drawing>
-          <wp:inline distT="0" distB="0" distL="0" distR="0" wp14:anchorId="07DC4A87" wp14:editId="2923E0B4">
+          <wp:inline distT="0" distB="0" distL="0" distR="0" wp14:anchorId="2F54540F" wp14:editId="5129933F">
             <wp:extent cx="3108960" cy="4880344"/>
             <wp:effectExtent l="0" t="0" r="0" b="0"/>
             <wp:docPr id="109" name="Figure 109"/>
@@ -9799,7 +9806,7 @@
         <w:pStyle w:val="ReportNormal"/>
       </w:pPr>
       <w:r>
-        <w:t>Our audit of the inherited code catalogued 30 defects. Table 8 lists the six rated critical — the ones that made the platform unsafe for real multi-user work — and where each stands. Of the other 24, 17 are fixed, 5 have a fix merged that awaits a closure check, and 2 are open: completion and export figures disagreeing (issue 19, story B6) and the wrong actor type in audit entries (issue 21, F4 in Week 10).</w:t>
+        <w:t>Our audit of the inherited code catalogued 30 defects. Table 8 lists the six rated critical, which were the ones that made the platform unsafe for real multi-user work, and where each stands. Of the other 24, 17 are fixed, 5 have a fix merged that awaits a closure check, and 2 are open: completion and export figures disagreeing (issue 19, story B6) and the wrong actor type in audit entries (issue 21, F4 in Week 10).</w:t>
       </w:r>
     </w:p>
     <w:p>
@@ -10029,7 +10036,7 @@
                 <w:sz w:val="18"/>
                 <w:szCs w:val="18"/>
               </w:rPr>
-              <w:t>Drafts had no ownership — anyone could edit another's</w:t>
+              <w:t>Drafts had no ownership, so anyone could edit another person's draft</w:t>
             </w:r>
           </w:p>
         </w:tc>
@@ -10384,7 +10391,7 @@
       <w:pPr>
         <w:pStyle w:val="2"/>
       </w:pPr>
-      <w:bookmarkStart w:id="19" w:name="_Toc242391246"/>
+      <w:bookmarkStart w:id="19" w:name="_Toc242394593"/>
       <w:r>
         <w:t>Deliverables and the MVP</w:t>
       </w:r>
@@ -11014,7 +11021,7 @@
       <w:pPr>
         <w:pStyle w:val="3"/>
       </w:pPr>
-      <w:bookmarkStart w:id="20" w:name="_Toc242391247"/>
+      <w:bookmarkStart w:id="20" w:name="_Toc242394594"/>
       <w:r>
         <w:lastRenderedPageBreak/>
         <w:t>The MVP: complete, tested and working</w:t>
@@ -11026,10 +11033,10 @@
         <w:pStyle w:val="ReportNormal"/>
       </w:pPr>
       <w:r>
-        <w:t>At Status Check 1 (26 August) the client and the team agreed that success is first defined as a working, high-quality end-to-end annotation workflow for text — task setup, AI annotation, human review, role-based permissions and dispute resolution — with further functionality treated as extension work. That is our minimum viable product. Table 10 walks through it step by step, with the screen that shows each step working and the automated tests that check it; every test module named is on main, and every one</w:t>
+        <w:t>At Status Check 1 (26 August) the client and the team agreed that success is first defined as a working, high-quality end-to-end annotation workflow for text, covering task setup, AI annotation, human review, role-based permissions and dispute resolution, with further functionality treated as extension work. That is our minimum viable product. Table 10 walks through it step by step, with the screen that shows each step working and the automated tests that check it; every test module named is on main, and ev</w:t>
       </w:r>
       <w:r>
-        <w:t xml:space="preserve"> passed when the suites were re-run for this report on 8 October.</w:t>
+        <w:t>ery one passed when the suites were re-run for this report on 8 October.</w:t>
       </w:r>
     </w:p>
     <w:p>
@@ -11784,7 +11791,7 @@
       <w:pPr>
         <w:pStyle w:val="2"/>
       </w:pPr>
-      <w:bookmarkStart w:id="21" w:name="_Toc242391248"/>
+      <w:bookmarkStart w:id="21" w:name="_Toc242394595"/>
       <w:r>
         <w:t>Progress by epic</w:t>
       </w:r>
@@ -11799,10 +11806,10 @@
       </w:r>
       <w:r>
         <w:lastRenderedPageBreak/>
-        <w:t>in Section 4. Four stories were added after the proposal's 59: B7, B8 and D9 from the client's answers of 24 September, and A6 from the performance investigation. Six stories were set aside by team decision on 14 September: A1 (enforced branch protection) and A5 (one shared status vocabulary) as lower value than the remaining features, and K1–K4 (technical report, decision records, findings and demonstration), which are deliverables rather than features — they are tracked outside Jira and scheduled for 29 O</w:t>
+        <w:t>in Section 4. Four stories were added after the proposal's 59: B7, B8 and D9 from the client's answers of 24 September, and A6 from the performance investigation. Six stories were set aside by team decision on 14 September: A1 (enforced branch protection) and A5 (one shared status vocabulary) as lower value than the remaining features, and K1–K4 (technical report, decision records, findings and demonstration), which are deliverables rather than features. They are tracked outside Jira and scheduled for 29 Oc</w:t>
       </w:r>
       <w:r>
-        <w:t>ctober to 1 November, not dropped.</w:t>
+        <w:t>tober to 1 November, not dropped.</w:t>
       </w:r>
     </w:p>
     <w:p>
@@ -11816,7 +11823,7 @@
           <w:noProof/>
         </w:rPr>
         <w:drawing>
-          <wp:inline distT="0" distB="0" distL="0" distR="0" wp14:anchorId="6070340D" wp14:editId="4B89CEAF">
+          <wp:inline distT="0" distB="0" distL="0" distR="0" wp14:anchorId="4302C2E2" wp14:editId="5BFB40A0">
             <wp:extent cx="5212080" cy="2461260"/>
             <wp:effectExtent l="0" t="0" r="0" b="0"/>
             <wp:docPr id="110" name="Figure 110"/>
@@ -11873,7 +11880,7 @@
       <w:pPr>
         <w:pStyle w:val="2"/>
       </w:pPr>
-      <w:bookmarkStart w:id="22" w:name="_Toc242391249"/>
+      <w:bookmarkStart w:id="22" w:name="_Toc242394596"/>
       <w:r>
         <w:t>Contributions by member</w:t>
       </w:r>
@@ -12459,7 +12466,7 @@
       <w:pPr>
         <w:pStyle w:val="2"/>
       </w:pPr>
-      <w:bookmarkStart w:id="23" w:name="_Toc242391250"/>
+      <w:bookmarkStart w:id="23" w:name="_Toc242394597"/>
       <w:r>
         <w:t>How we work</w:t>
       </w:r>
@@ -12586,7 +12593,7 @@
       <w:pPr>
         <w:pStyle w:val="1"/>
       </w:pPr>
-      <w:bookmarkStart w:id="24" w:name="_Toc242391251"/>
+      <w:bookmarkStart w:id="24" w:name="_Toc242394598"/>
       <w:r>
         <w:lastRenderedPageBreak/>
         <w:t>Obstacles</w:t>
@@ -12598,17 +12605,17 @@
         <w:pStyle w:val="ReportNormal"/>
       </w:pPr>
       <w:r>
-        <w:t xml:space="preserve">This section separates the obstacles we have already met — project-wide (Section 2.1) and inside particular sprints and stories (Section 2.2) — which explain most of the timeline changes in Section 3, from the risks (Section 2.3) and dependencies (Section 2.4) still ahead, which shape the plan in Section 4; Section 2.5 records what we have learned. Each obstacle and risk carries an identifier — O1 to O9 and R1 to R10 — and names the deliverable and the part of the timeline it touches, so it can be followed </w:t>
+        <w:t>This section separates the obstacles we have already met, both project-wide (Section 2.1) and inside particular sprints and stories (Section 2.2), which explain most of the timeline changes in Section 3, from the risks (Section 2.3) and dependencies (Section 2.4) still ahead, which shape the plan in Section 4; Section 2.5 records what we have learned. Each obstacle and risk carries an identifier (O1 to O9 and R1 to R10) and names the deliverable and the part of the timeline it touches, so it can be followed</w:t>
       </w:r>
       <w:r>
-        <w:t>into Sections 3 and 4.</w:t>
+        <w:t xml:space="preserve"> into Sections 3 and 4.</w:t>
       </w:r>
     </w:p>
     <w:p>
       <w:pPr>
         <w:pStyle w:val="2"/>
       </w:pPr>
-      <w:bookmarkStart w:id="25" w:name="_Toc242391252"/>
+      <w:bookmarkStart w:id="25" w:name="_Toc242394599"/>
       <w:r>
         <w:lastRenderedPageBreak/>
         <w:t>Obstacles met so far</w:t>
@@ -13433,7 +13440,7 @@
                 <w:sz w:val="16"/>
                 <w:szCs w:val="16"/>
               </w:rPr>
-              <w:t>Sequencing: at Status Check 2 (23 Sep) provenance and evaluation — heavily weighted deliverables — had not started, and the release export (W10) depended on a provenance record scheduled for W11</w:t>
+              <w:t>Sequencing: at Status Check 2 (23 Sep) provenance and evaluation, both heavily weighted deliverables, had not started, and the release export (W10) depended on a provenance record scheduled for W11</w:t>
             </w:r>
           </w:p>
         </w:tc>
@@ -13744,7 +13751,7 @@
       <w:pPr>
         <w:pStyle w:val="2"/>
       </w:pPr>
-      <w:bookmarkStart w:id="26" w:name="_Toc242391253"/>
+      <w:bookmarkStart w:id="26" w:name="_Toc242394600"/>
       <w:r>
         <w:t>Challenges by sprint and story</w:t>
       </w:r>
@@ -14678,7 +14685,7 @@
                 <w:sz w:val="15"/>
                 <w:szCs w:val="15"/>
               </w:rPr>
-              <w:t>Blindness never ended — a reviewer stayed blind to decisions after the round closed, and an adjudicator who could review was blind to the dispute; the agreement report leaked an open round's verdicts</w:t>
+              <w:t>Blindness never ended: a reviewer stayed blind to decisions after the round closed, and an adjudicator who could review was blind to the dispute; the agreement report leaked an open round's verdicts</w:t>
             </w:r>
           </w:p>
         </w:tc>
@@ -14997,7 +15004,7 @@
       <w:pPr>
         <w:pStyle w:val="2"/>
       </w:pPr>
-      <w:bookmarkStart w:id="27" w:name="_Toc242391254"/>
+      <w:bookmarkStart w:id="27" w:name="_Toc242394601"/>
       <w:r>
         <w:lastRenderedPageBreak/>
         <w:t>Risks ahead</w:t>
@@ -15009,7 +15016,7 @@
         <w:pStyle w:val="ReportNormal"/>
       </w:pPr>
       <w:r>
-        <w:t>Table 14 is the risk register for the remaining weeks, rated for likelihood (L) and impact (I) as high, medium or low, and plotted in Figure 11. Each risk names what it affects, has more than one mitigation so that the plan does not rest on a single remedy, and has an owner and a trigger — the observable event that starts the contingency — reviewed at the weekly meeting. The dependencies behind R1 and R2 are drawn in Figure 14 (Section 4.2).</w:t>
+        <w:t>Table 14 is the risk register for the remaining weeks, rated for likelihood (L) and impact (I) as high, medium or low, and plotted in Figure 11. Each risk names what it affects, has more than one mitigation so that the plan does not rest on a single remedy, and has an owner and a trigger, the observable event that starts the contingency; both are reviewed at the weekly meeting. The dependencies behind R1 and R2 are drawn in Figure 14 (Section 4.2).</w:t>
       </w:r>
     </w:p>
     <w:p>
@@ -15023,7 +15030,7 @@
           <w:noProof/>
         </w:rPr>
         <w:drawing>
-          <wp:inline distT="0" distB="0" distL="0" distR="0" wp14:anchorId="00CAE200" wp14:editId="024CC5FD">
+          <wp:inline distT="0" distB="0" distL="0" distR="0" wp14:anchorId="50EB22E0" wp14:editId="67A5C2AA">
             <wp:extent cx="3291840" cy="2351314"/>
             <wp:effectExtent l="0" t="0" r="0" b="0"/>
             <wp:docPr id="111" name="Figure 111"/>
@@ -16432,7 +16439,7 @@
       <w:pPr>
         <w:pStyle w:val="2"/>
       </w:pPr>
-      <w:bookmarkStart w:id="28" w:name="_Toc242391255"/>
+      <w:bookmarkStart w:id="28" w:name="_Toc242394602"/>
       <w:r>
         <w:t>Dependencies</w:t>
       </w:r>
@@ -16935,7 +16942,7 @@
                 <w:sz w:val="16"/>
                 <w:szCs w:val="16"/>
               </w:rPr>
-              <w:t>—</w:t>
+              <w:t>Not needed</w:t>
             </w:r>
           </w:p>
         </w:tc>
@@ -17385,7 +17392,7 @@
                 <w:sz w:val="16"/>
                 <w:szCs w:val="16"/>
               </w:rPr>
-              <w:t>—</w:t>
+              <w:t>Not needed</w:t>
             </w:r>
           </w:p>
         </w:tc>
@@ -17490,7 +17497,7 @@
       <w:pPr>
         <w:pStyle w:val="2"/>
       </w:pPr>
-      <w:bookmarkStart w:id="29" w:name="_Toc242391256"/>
+      <w:bookmarkStart w:id="29" w:name="_Toc242394603"/>
       <w:r>
         <w:t>Lessons learned</w:t>
       </w:r>
@@ -17579,7 +17586,7 @@
         <w:rPr>
           <w:szCs w:val="24"/>
         </w:rPr>
-        <w:t xml:space="preserve"> Every test used a handful of items, so a page that sent 404 requests for 200 items looked fine until scenario testing. A6 now sets a measured target — under one second and at most ten requests for a 200-item page — that later changes are checked against.</w:t>
+        <w:t xml:space="preserve"> Every test used a handful of items, so a page that sent 404 requests for 200 items looked fine until scenario testing. A6 now sets a measured target of under one second and at most ten requests for a 200-item page, which later changes are checked against.</w:t>
       </w:r>
     </w:p>
     <w:p>
@@ -17605,7 +17612,7 @@
       <w:pPr>
         <w:pStyle w:val="1"/>
       </w:pPr>
-      <w:bookmarkStart w:id="30" w:name="_Toc242391257"/>
+      <w:bookmarkStart w:id="30" w:name="_Toc242394604"/>
       <w:r>
         <w:t>Deviation to Timeline</w:t>
       </w:r>
@@ -17615,7 +17622,7 @@
       <w:pPr>
         <w:pStyle w:val="2"/>
       </w:pPr>
-      <w:bookmarkStart w:id="31" w:name="_Toc242391258"/>
+      <w:bookmarkStart w:id="31" w:name="_Toc242394605"/>
       <w:r>
         <w:t>The baseline</w:t>
       </w:r>
@@ -17644,7 +17651,7 @@
         </w:rPr>
         <w:lastRenderedPageBreak/>
         <w:drawing>
-          <wp:inline distT="0" distB="0" distL="0" distR="0" wp14:anchorId="56541FED" wp14:editId="7459A218">
+          <wp:inline distT="0" distB="0" distL="0" distR="0" wp14:anchorId="5D29E50C" wp14:editId="2B44EFC7">
             <wp:extent cx="5212080" cy="3040380"/>
             <wp:effectExtent l="0" t="0" r="0" b="0"/>
             <wp:docPr id="112" name="Figure 112"/>
@@ -17715,7 +17722,7 @@
       <w:pPr>
         <w:pStyle w:val="2"/>
       </w:pPr>
-      <w:bookmarkStart w:id="32" w:name="_Toc242391259"/>
+      <w:bookmarkStart w:id="32" w:name="_Toc242394606"/>
       <w:r>
         <w:t>What moved, and why</w:t>
       </w:r>
@@ -17741,7 +17748,7 @@
         </w:rPr>
         <w:lastRenderedPageBreak/>
         <w:drawing>
-          <wp:inline distT="0" distB="0" distL="0" distR="0" wp14:anchorId="2DAC5FE4" wp14:editId="48E77A54">
+          <wp:inline distT="0" distB="0" distL="0" distR="0" wp14:anchorId="0EAF66C9" wp14:editId="7A06D70D">
             <wp:extent cx="5212080" cy="4155577"/>
             <wp:effectExtent l="0" t="0" r="0" b="0"/>
             <wp:docPr id="113" name="Figure 113"/>
@@ -19028,7 +19035,7 @@
       <w:pPr>
         <w:pStyle w:val="2"/>
       </w:pPr>
-      <w:bookmarkStart w:id="33" w:name="_Toc242391260"/>
+      <w:bookmarkStart w:id="33" w:name="_Toc242394607"/>
       <w:r>
         <w:t>Carry-over between sprints</w:t>
       </w:r>
@@ -19049,7 +19056,7 @@
       <w:pPr>
         <w:pStyle w:val="2"/>
       </w:pPr>
-      <w:bookmarkStart w:id="34" w:name="_Toc242391261"/>
+      <w:bookmarkStart w:id="34" w:name="_Toc242394608"/>
       <w:r>
         <w:t>Impact on the project</w:t>
       </w:r>
@@ -19135,7 +19142,7 @@
       <w:pPr>
         <w:pStyle w:val="1"/>
       </w:pPr>
-      <w:bookmarkStart w:id="35" w:name="_Toc242391262"/>
+      <w:bookmarkStart w:id="35" w:name="_Toc242394609"/>
       <w:r>
         <w:lastRenderedPageBreak/>
         <w:t>Milestones &amp; Reporting</w:t>
@@ -19146,7 +19153,7 @@
       <w:pPr>
         <w:pStyle w:val="2"/>
       </w:pPr>
-      <w:bookmarkStart w:id="36" w:name="_Toc242391263"/>
+      <w:bookmarkStart w:id="36" w:name="_Toc242394610"/>
       <w:r>
         <w:t>Updated milestones</w:t>
       </w:r>
@@ -19176,7 +19183,7 @@
         <w:t>struck-through text</w:t>
       </w:r>
       <w:r>
-        <w:t xml:space="preserve"> marks a task moved or replaced; owners are named for every task — Week 9 from the Jira board, Weeks 10–12 as proposed owners (*) to be confirmed at the weekly meeting. Ticket-level detail follows in Table 18.</w:t>
+        <w:t xml:space="preserve"> marks a task moved or replaced; owners are named for every task: Week 9 owners come from the Jira board, and Weeks 10–12 show proposed owners (*) to be confirmed at the weekly meeting. Ticket-level detail follows in Table 18.</w:t>
       </w:r>
     </w:p>
     <w:p>
@@ -19580,7 +19587,7 @@
                 <w:sz w:val="17"/>
                 <w:szCs w:val="17"/>
               </w:rPr>
-              <w:t>—</w:t>
+              <w:t>None</w:t>
             </w:r>
           </w:p>
         </w:tc>
@@ -20643,7 +20650,7 @@
       <w:pPr>
         <w:pStyle w:val="2"/>
       </w:pPr>
-      <w:bookmarkStart w:id="37" w:name="_Toc242391264"/>
+      <w:bookmarkStart w:id="37" w:name="_Toc242394611"/>
       <w:r>
         <w:t>Remaining work, dependencies and the critical path</w:t>
       </w:r>
@@ -20677,7 +20684,7 @@
           <w:noProof/>
         </w:rPr>
         <w:drawing>
-          <wp:inline distT="0" distB="0" distL="0" distR="0" wp14:anchorId="734CD3CF" wp14:editId="6566B098">
+          <wp:inline distT="0" distB="0" distL="0" distR="0" wp14:anchorId="73750A1A" wp14:editId="6C11755D">
             <wp:extent cx="5212080" cy="3803409"/>
             <wp:effectExtent l="0" t="0" r="0" b="0"/>
             <wp:docPr id="114" name="Figure 114"/>
@@ -20958,7 +20965,7 @@
                 <w:sz w:val="16"/>
                 <w:szCs w:val="16"/>
               </w:rPr>
-              <w:t>Provenance event record (F1) — CP</w:t>
+              <w:t>Provenance event record (F1) (CP)</w:t>
             </w:r>
           </w:p>
         </w:tc>
@@ -21150,7 +21157,7 @@
                 <w:sz w:val="16"/>
                 <w:szCs w:val="16"/>
               </w:rPr>
-              <w:t>— → H2, H3</w:t>
+              <w:t>None → H2, H3</w:t>
             </w:r>
           </w:p>
         </w:tc>
@@ -21770,7 +21777,7 @@
                 <w:sz w:val="16"/>
                 <w:szCs w:val="16"/>
               </w:rPr>
-              <w:t>— → I4</w:t>
+              <w:t>None → I4</w:t>
             </w:r>
           </w:p>
         </w:tc>
@@ -22142,7 +22149,7 @@
                 <w:sz w:val="16"/>
                 <w:szCs w:val="16"/>
               </w:rPr>
-              <w:t>—</w:t>
+              <w:t>None</w:t>
             </w:r>
           </w:p>
         </w:tc>
@@ -22266,7 +22273,7 @@
                 <w:sz w:val="16"/>
                 <w:szCs w:val="16"/>
               </w:rPr>
-              <w:t>— → SCRUM-40</w:t>
+              <w:t>None → SCRUM-40</w:t>
             </w:r>
           </w:p>
         </w:tc>
@@ -22322,7 +22329,7 @@
                 <w:sz w:val="16"/>
                 <w:szCs w:val="16"/>
               </w:rPr>
-              <w:t>Release gate (H3) — CP</w:t>
+              <w:t>Release gate (H3) (CP)</w:t>
             </w:r>
           </w:p>
         </w:tc>
@@ -22446,7 +22453,7 @@
                 <w:sz w:val="16"/>
                 <w:szCs w:val="16"/>
               </w:rPr>
-              <w:t>Release manifest (H2) — CP</w:t>
+              <w:t>Release manifest (H2) (CP)</w:t>
             </w:r>
           </w:p>
         </w:tc>
@@ -23686,7 +23693,7 @@
                 <w:sz w:val="16"/>
                 <w:szCs w:val="16"/>
               </w:rPr>
-              <w:t>Real-data release, policy, history screens (H6), P0 — CP</w:t>
+              <w:t>Real-data release, policy, history screens (H6), P0 (CP)</w:t>
             </w:r>
           </w:p>
         </w:tc>
@@ -23810,7 +23817,7 @@
                 <w:sz w:val="16"/>
                 <w:szCs w:val="16"/>
               </w:rPr>
-              <w:t>Integrity checks on provenance, roles, releases (I5) — CP</w:t>
+              <w:t>Integrity checks on provenance, roles, releases (I5) (CP)</w:t>
             </w:r>
           </w:p>
         </w:tc>
@@ -23934,7 +23941,7 @@
                 <w:sz w:val="16"/>
                 <w:szCs w:val="16"/>
               </w:rPr>
-              <w:t>Findings record with negative results (I5) — CP</w:t>
+              <w:t>Findings record with negative results (I5) (CP)</w:t>
             </w:r>
           </w:p>
         </w:tc>
@@ -24165,7 +24172,7 @@
                 <w:sz w:val="16"/>
                 <w:szCs w:val="16"/>
               </w:rPr>
-              <w:t>—</w:t>
+              <w:t>No ticket</w:t>
             </w:r>
           </w:p>
         </w:tc>
@@ -24374,7 +24381,7 @@
                 <w:sz w:val="16"/>
                 <w:szCs w:val="16"/>
               </w:rPr>
-              <w:t>—</w:t>
+              <w:t>None</w:t>
             </w:r>
           </w:p>
         </w:tc>
@@ -24389,7 +24396,7 @@
       <w:pPr>
         <w:pStyle w:val="2"/>
       </w:pPr>
-      <w:bookmarkStart w:id="38" w:name="_Toc242391265"/>
+      <w:bookmarkStart w:id="38" w:name="_Toc242394612"/>
       <w:r>
         <w:t>Who carries what</w:t>
       </w:r>
@@ -25401,7 +25408,7 @@
       <w:pPr>
         <w:pStyle w:val="2"/>
       </w:pPr>
-      <w:bookmarkStart w:id="39" w:name="_Toc242391266"/>
+      <w:bookmarkStart w:id="39" w:name="_Toc242394613"/>
       <w:r>
         <w:t>Slack, fallbacks and contingency</w:t>
       </w:r>
@@ -25426,7 +25433,7 @@
           <w:noProof/>
         </w:rPr>
         <w:drawing>
-          <wp:inline distT="0" distB="0" distL="0" distR="0" wp14:anchorId="2F91B5EC" wp14:editId="03FCFE7F">
+          <wp:inline distT="0" distB="0" distL="0" distR="0" wp14:anchorId="74D05C9B" wp14:editId="787D8ED5">
             <wp:extent cx="5212080" cy="1954530"/>
             <wp:effectExtent l="0" t="0" r="0" b="0"/>
             <wp:docPr id="115" name="Figure 115"/>
@@ -25921,7 +25928,7 @@
                 <w:sz w:val="16"/>
                 <w:szCs w:val="16"/>
               </w:rPr>
-              <w:t>—</w:t>
+              <w:t>Not needed</w:t>
             </w:r>
           </w:p>
         </w:tc>
@@ -26071,7 +26078,7 @@
       <w:pPr>
         <w:pStyle w:val="2"/>
       </w:pPr>
-      <w:bookmarkStart w:id="40" w:name="_Toc242391267"/>
+      <w:bookmarkStart w:id="40" w:name="_Toc242394614"/>
       <w:r>
         <w:t>Reporting and communication</w:t>
       </w:r>
@@ -26157,7 +26164,7 @@
       <w:pPr>
         <w:pStyle w:val="1"/>
       </w:pPr>
-      <w:bookmarkStart w:id="41" w:name="_Toc242391268"/>
+      <w:bookmarkStart w:id="41" w:name="_Toc242394615"/>
       <w:r>
         <w:t>Acknowledgement of AI Use</w:t>
       </w:r>
@@ -26184,7 +26191,7 @@
           <w:numId w:val="0"/>
         </w:numPr>
       </w:pPr>
-      <w:bookmarkStart w:id="42" w:name="_Toc242391269"/>
+      <w:bookmarkStart w:id="42" w:name="_Toc242394616"/>
       <w:r>
         <w:lastRenderedPageBreak/>
         <w:t>Appendix A. Identifiers and Terms</w:t>

</xml_diff>

<commit_message>
docs: name owners of past milestones and fix two sentences in the progress report
</commit_message>
<xml_diff>
--- a/info/CS57_Progress_Report.docx
+++ b/info/CS57_Progress_Report.docx
@@ -293,7 +293,7 @@
       <w:pPr>
         <w:pStyle w:val="PhDPreliminaryHeading"/>
       </w:pPr>
-      <w:bookmarkStart w:id="0" w:name="_Toc242395586"/>
+      <w:bookmarkStart w:id="0" w:name="_Toc242396855"/>
       <w:r>
         <w:lastRenderedPageBreak/>
         <w:t>Table of Contents</w:t>
@@ -339,7 +339,7 @@
         </w:rPr>
         <w:fldChar w:fldCharType="separate"/>
       </w:r>
-      <w:hyperlink w:anchor="_Toc242395586" w:history="1">
+      <w:hyperlink w:anchor="_Toc242396855" w:history="1">
         <w:r>
           <w:rPr>
             <w:rStyle w:val="a9"/>
@@ -362,7 +362,7 @@
           <w:rPr>
             <w:webHidden/>
           </w:rPr>
-          <w:instrText xml:space="preserve"> PAGEREF _Toc242395586 \h </w:instrText>
+          <w:instrText xml:space="preserve"> PAGEREF _Toc242396855 \h </w:instrText>
         </w:r>
         <w:r>
           <w:rPr>
@@ -405,7 +405,7 @@
           <w14:ligatures w14:val="standardContextual"/>
         </w:rPr>
       </w:pPr>
-      <w:hyperlink w:anchor="_Toc242395587" w:history="1">
+      <w:hyperlink w:anchor="_Toc242396856" w:history="1">
         <w:r>
           <w:rPr>
             <w:rStyle w:val="a9"/>
@@ -454,7 +454,7 @@
             <w:noProof/>
             <w:webHidden/>
           </w:rPr>
-          <w:instrText xml:space="preserve"> PAGEREF _Toc242395587 \h </w:instrText>
+          <w:instrText xml:space="preserve"> PAGEREF _Toc242396856 \h </w:instrText>
         </w:r>
         <w:r>
           <w:rPr>
@@ -497,7 +497,7 @@
           <w14:ligatures w14:val="standardContextual"/>
         </w:rPr>
       </w:pPr>
-      <w:hyperlink w:anchor="_Toc242395588" w:history="1">
+      <w:hyperlink w:anchor="_Toc242396857" w:history="1">
         <w:r>
           <w:rPr>
             <w:rStyle w:val="a9"/>
@@ -537,7 +537,7 @@
           <w:rPr>
             <w:webHidden/>
           </w:rPr>
-          <w:instrText xml:space="preserve"> PAGEREF _Toc242395588 \h </w:instrText>
+          <w:instrText xml:space="preserve"> PAGEREF _Toc242396857 \h </w:instrText>
         </w:r>
         <w:r>
           <w:rPr>
@@ -576,7 +576,7 @@
           <w14:ligatures w14:val="standardContextual"/>
         </w:rPr>
       </w:pPr>
-      <w:hyperlink w:anchor="_Toc242395589" w:history="1">
+      <w:hyperlink w:anchor="_Toc242396858" w:history="1">
         <w:r>
           <w:rPr>
             <w:rStyle w:val="a9"/>
@@ -616,7 +616,7 @@
           <w:rPr>
             <w:webHidden/>
           </w:rPr>
-          <w:instrText xml:space="preserve"> PAGEREF _Toc242395589 \h </w:instrText>
+          <w:instrText xml:space="preserve"> PAGEREF _Toc242396858 \h </w:instrText>
         </w:r>
         <w:r>
           <w:rPr>
@@ -655,7 +655,7 @@
           <w14:ligatures w14:val="standardContextual"/>
         </w:rPr>
       </w:pPr>
-      <w:hyperlink w:anchor="_Toc242395590" w:history="1">
+      <w:hyperlink w:anchor="_Toc242396859" w:history="1">
         <w:r>
           <w:rPr>
             <w:rStyle w:val="a9"/>
@@ -695,7 +695,7 @@
           <w:rPr>
             <w:webHidden/>
           </w:rPr>
-          <w:instrText xml:space="preserve"> PAGEREF _Toc242395590 \h </w:instrText>
+          <w:instrText xml:space="preserve"> PAGEREF _Toc242396859 \h </w:instrText>
         </w:r>
         <w:r>
           <w:rPr>
@@ -734,7 +734,7 @@
           <w14:ligatures w14:val="standardContextual"/>
         </w:rPr>
       </w:pPr>
-      <w:hyperlink w:anchor="_Toc242395591" w:history="1">
+      <w:hyperlink w:anchor="_Toc242396860" w:history="1">
         <w:r>
           <w:rPr>
             <w:rStyle w:val="a9"/>
@@ -774,7 +774,7 @@
           <w:rPr>
             <w:webHidden/>
           </w:rPr>
-          <w:instrText xml:space="preserve"> PAGEREF _Toc242395591 \h </w:instrText>
+          <w:instrText xml:space="preserve"> PAGEREF _Toc242396860 \h </w:instrText>
         </w:r>
         <w:r>
           <w:rPr>
@@ -813,7 +813,7 @@
           <w14:ligatures w14:val="standardContextual"/>
         </w:rPr>
       </w:pPr>
-      <w:hyperlink w:anchor="_Toc242395592" w:history="1">
+      <w:hyperlink w:anchor="_Toc242396861" w:history="1">
         <w:r>
           <w:rPr>
             <w:rStyle w:val="a9"/>
@@ -853,7 +853,7 @@
           <w:rPr>
             <w:webHidden/>
           </w:rPr>
-          <w:instrText xml:space="preserve"> PAGEREF _Toc242395592 \h </w:instrText>
+          <w:instrText xml:space="preserve"> PAGEREF _Toc242396861 \h </w:instrText>
         </w:r>
         <w:r>
           <w:rPr>
@@ -892,7 +892,7 @@
           <w14:ligatures w14:val="standardContextual"/>
         </w:rPr>
       </w:pPr>
-      <w:hyperlink w:anchor="_Toc242395593" w:history="1">
+      <w:hyperlink w:anchor="_Toc242396862" w:history="1">
         <w:r>
           <w:rPr>
             <w:rStyle w:val="a9"/>
@@ -932,7 +932,7 @@
           <w:rPr>
             <w:webHidden/>
           </w:rPr>
-          <w:instrText xml:space="preserve"> PAGEREF _Toc242395593 \h </w:instrText>
+          <w:instrText xml:space="preserve"> PAGEREF _Toc242396862 \h </w:instrText>
         </w:r>
         <w:r>
           <w:rPr>
@@ -971,7 +971,7 @@
           <w14:ligatures w14:val="standardContextual"/>
         </w:rPr>
       </w:pPr>
-      <w:hyperlink w:anchor="_Toc242395594" w:history="1">
+      <w:hyperlink w:anchor="_Toc242396863" w:history="1">
         <w:r>
           <w:rPr>
             <w:rStyle w:val="a9"/>
@@ -1011,7 +1011,7 @@
           <w:rPr>
             <w:webHidden/>
           </w:rPr>
-          <w:instrText xml:space="preserve"> PAGEREF _Toc242395594 \h </w:instrText>
+          <w:instrText xml:space="preserve"> PAGEREF _Toc242396863 \h </w:instrText>
         </w:r>
         <w:r>
           <w:rPr>
@@ -1050,7 +1050,7 @@
           <w14:ligatures w14:val="standardContextual"/>
         </w:rPr>
       </w:pPr>
-      <w:hyperlink w:anchor="_Toc242395595" w:history="1">
+      <w:hyperlink w:anchor="_Toc242396864" w:history="1">
         <w:r>
           <w:rPr>
             <w:rStyle w:val="a9"/>
@@ -1090,7 +1090,7 @@
           <w:rPr>
             <w:webHidden/>
           </w:rPr>
-          <w:instrText xml:space="preserve"> PAGEREF _Toc242395595 \h </w:instrText>
+          <w:instrText xml:space="preserve"> PAGEREF _Toc242396864 \h </w:instrText>
         </w:r>
         <w:r>
           <w:rPr>
@@ -1129,7 +1129,7 @@
           <w14:ligatures w14:val="standardContextual"/>
         </w:rPr>
       </w:pPr>
-      <w:hyperlink w:anchor="_Toc242395596" w:history="1">
+      <w:hyperlink w:anchor="_Toc242396865" w:history="1">
         <w:r>
           <w:rPr>
             <w:rStyle w:val="a9"/>
@@ -1169,7 +1169,7 @@
           <w:rPr>
             <w:webHidden/>
           </w:rPr>
-          <w:instrText xml:space="preserve"> PAGEREF _Toc242395596 \h </w:instrText>
+          <w:instrText xml:space="preserve"> PAGEREF _Toc242396865 \h </w:instrText>
         </w:r>
         <w:r>
           <w:rPr>
@@ -1208,7 +1208,7 @@
           <w14:ligatures w14:val="standardContextual"/>
         </w:rPr>
       </w:pPr>
-      <w:hyperlink w:anchor="_Toc242395597" w:history="1">
+      <w:hyperlink w:anchor="_Toc242396866" w:history="1">
         <w:r>
           <w:rPr>
             <w:rStyle w:val="a9"/>
@@ -1248,7 +1248,7 @@
           <w:rPr>
             <w:webHidden/>
           </w:rPr>
-          <w:instrText xml:space="preserve"> PAGEREF _Toc242395597 \h </w:instrText>
+          <w:instrText xml:space="preserve"> PAGEREF _Toc242396866 \h </w:instrText>
         </w:r>
         <w:r>
           <w:rPr>
@@ -1287,7 +1287,7 @@
           <w14:ligatures w14:val="standardContextual"/>
         </w:rPr>
       </w:pPr>
-      <w:hyperlink w:anchor="_Toc242395598" w:history="1">
+      <w:hyperlink w:anchor="_Toc242396867" w:history="1">
         <w:r>
           <w:rPr>
             <w:rStyle w:val="a9"/>
@@ -1327,7 +1327,7 @@
           <w:rPr>
             <w:webHidden/>
           </w:rPr>
-          <w:instrText xml:space="preserve"> PAGEREF _Toc242395598 \h </w:instrText>
+          <w:instrText xml:space="preserve"> PAGEREF _Toc242396867 \h </w:instrText>
         </w:r>
         <w:r>
           <w:rPr>
@@ -1366,7 +1366,7 @@
           <w14:ligatures w14:val="standardContextual"/>
         </w:rPr>
       </w:pPr>
-      <w:hyperlink w:anchor="_Toc242395599" w:history="1">
+      <w:hyperlink w:anchor="_Toc242396868" w:history="1">
         <w:r>
           <w:rPr>
             <w:rStyle w:val="a9"/>
@@ -1406,7 +1406,7 @@
           <w:rPr>
             <w:webHidden/>
           </w:rPr>
-          <w:instrText xml:space="preserve"> PAGEREF _Toc242395599 \h </w:instrText>
+          <w:instrText xml:space="preserve"> PAGEREF _Toc242396868 \h </w:instrText>
         </w:r>
         <w:r>
           <w:rPr>
@@ -1445,7 +1445,7 @@
           <w14:ligatures w14:val="standardContextual"/>
         </w:rPr>
       </w:pPr>
-      <w:hyperlink w:anchor="_Toc242395600" w:history="1">
+      <w:hyperlink w:anchor="_Toc242396869" w:history="1">
         <w:r>
           <w:rPr>
             <w:rStyle w:val="a9"/>
@@ -1485,7 +1485,7 @@
           <w:rPr>
             <w:webHidden/>
           </w:rPr>
-          <w:instrText xml:space="preserve"> PAGEREF _Toc242395600 \h </w:instrText>
+          <w:instrText xml:space="preserve"> PAGEREF _Toc242396869 \h </w:instrText>
         </w:r>
         <w:r>
           <w:rPr>
@@ -1524,7 +1524,7 @@
           <w14:ligatures w14:val="standardContextual"/>
         </w:rPr>
       </w:pPr>
-      <w:hyperlink w:anchor="_Toc242395601" w:history="1">
+      <w:hyperlink w:anchor="_Toc242396870" w:history="1">
         <w:r>
           <w:rPr>
             <w:rStyle w:val="a9"/>
@@ -1564,7 +1564,7 @@
           <w:rPr>
             <w:webHidden/>
           </w:rPr>
-          <w:instrText xml:space="preserve"> PAGEREF _Toc242395601 \h </w:instrText>
+          <w:instrText xml:space="preserve"> PAGEREF _Toc242396870 \h </w:instrText>
         </w:r>
         <w:r>
           <w:rPr>
@@ -1603,7 +1603,7 @@
           <w14:ligatures w14:val="standardContextual"/>
         </w:rPr>
       </w:pPr>
-      <w:hyperlink w:anchor="_Toc242395602" w:history="1">
+      <w:hyperlink w:anchor="_Toc242396871" w:history="1">
         <w:r>
           <w:rPr>
             <w:rStyle w:val="a9"/>
@@ -1643,7 +1643,7 @@
           <w:rPr>
             <w:webHidden/>
           </w:rPr>
-          <w:instrText xml:space="preserve"> PAGEREF _Toc242395602 \h </w:instrText>
+          <w:instrText xml:space="preserve"> PAGEREF _Toc242396871 \h </w:instrText>
         </w:r>
         <w:r>
           <w:rPr>
@@ -1682,7 +1682,7 @@
           <w14:ligatures w14:val="standardContextual"/>
         </w:rPr>
       </w:pPr>
-      <w:hyperlink w:anchor="_Toc242395603" w:history="1">
+      <w:hyperlink w:anchor="_Toc242396872" w:history="1">
         <w:r>
           <w:rPr>
             <w:rStyle w:val="a9"/>
@@ -1722,7 +1722,7 @@
           <w:rPr>
             <w:webHidden/>
           </w:rPr>
-          <w:instrText xml:space="preserve"> PAGEREF _Toc242395603 \h </w:instrText>
+          <w:instrText xml:space="preserve"> PAGEREF _Toc242396872 \h </w:instrText>
         </w:r>
         <w:r>
           <w:rPr>
@@ -1761,7 +1761,7 @@
           <w14:ligatures w14:val="standardContextual"/>
         </w:rPr>
       </w:pPr>
-      <w:hyperlink w:anchor="_Toc242395604" w:history="1">
+      <w:hyperlink w:anchor="_Toc242396873" w:history="1">
         <w:r>
           <w:rPr>
             <w:rStyle w:val="a9"/>
@@ -1801,7 +1801,7 @@
           <w:rPr>
             <w:webHidden/>
           </w:rPr>
-          <w:instrText xml:space="preserve"> PAGEREF _Toc242395604 \h </w:instrText>
+          <w:instrText xml:space="preserve"> PAGEREF _Toc242396873 \h </w:instrText>
         </w:r>
         <w:r>
           <w:rPr>
@@ -1840,7 +1840,7 @@
           <w14:ligatures w14:val="standardContextual"/>
         </w:rPr>
       </w:pPr>
-      <w:hyperlink w:anchor="_Toc242395605" w:history="1">
+      <w:hyperlink w:anchor="_Toc242396874" w:history="1">
         <w:r>
           <w:rPr>
             <w:rStyle w:val="a9"/>
@@ -1880,7 +1880,7 @@
           <w:rPr>
             <w:webHidden/>
           </w:rPr>
-          <w:instrText xml:space="preserve"> PAGEREF _Toc242395605 \h </w:instrText>
+          <w:instrText xml:space="preserve"> PAGEREF _Toc242396874 \h </w:instrText>
         </w:r>
         <w:r>
           <w:rPr>
@@ -1919,7 +1919,7 @@
           <w14:ligatures w14:val="standardContextual"/>
         </w:rPr>
       </w:pPr>
-      <w:hyperlink w:anchor="_Toc242395606" w:history="1">
+      <w:hyperlink w:anchor="_Toc242396875" w:history="1">
         <w:r>
           <w:rPr>
             <w:rStyle w:val="a9"/>
@@ -1959,7 +1959,7 @@
           <w:rPr>
             <w:webHidden/>
           </w:rPr>
-          <w:instrText xml:space="preserve"> PAGEREF _Toc242395606 \h </w:instrText>
+          <w:instrText xml:space="preserve"> PAGEREF _Toc242396875 \h </w:instrText>
         </w:r>
         <w:r>
           <w:rPr>
@@ -1998,7 +1998,7 @@
           <w14:ligatures w14:val="standardContextual"/>
         </w:rPr>
       </w:pPr>
-      <w:hyperlink w:anchor="_Toc242395607" w:history="1">
+      <w:hyperlink w:anchor="_Toc242396876" w:history="1">
         <w:r>
           <w:rPr>
             <w:rStyle w:val="a9"/>
@@ -2038,7 +2038,7 @@
           <w:rPr>
             <w:webHidden/>
           </w:rPr>
-          <w:instrText xml:space="preserve"> PAGEREF _Toc242395607 \h </w:instrText>
+          <w:instrText xml:space="preserve"> PAGEREF _Toc242396876 \h </w:instrText>
         </w:r>
         <w:r>
           <w:rPr>
@@ -2077,7 +2077,7 @@
           <w14:ligatures w14:val="standardContextual"/>
         </w:rPr>
       </w:pPr>
-      <w:hyperlink w:anchor="_Toc242395608" w:history="1">
+      <w:hyperlink w:anchor="_Toc242396877" w:history="1">
         <w:r>
           <w:rPr>
             <w:rStyle w:val="a9"/>
@@ -2117,7 +2117,7 @@
           <w:rPr>
             <w:webHidden/>
           </w:rPr>
-          <w:instrText xml:space="preserve"> PAGEREF _Toc242395608 \h </w:instrText>
+          <w:instrText xml:space="preserve"> PAGEREF _Toc242396877 \h </w:instrText>
         </w:r>
         <w:r>
           <w:rPr>
@@ -2160,7 +2160,7 @@
           <w14:ligatures w14:val="standardContextual"/>
         </w:rPr>
       </w:pPr>
-      <w:hyperlink w:anchor="_Toc242395609" w:history="1">
+      <w:hyperlink w:anchor="_Toc242396878" w:history="1">
         <w:r>
           <w:rPr>
             <w:rStyle w:val="a9"/>
@@ -2209,7 +2209,7 @@
             <w:noProof/>
             <w:webHidden/>
           </w:rPr>
-          <w:instrText xml:space="preserve"> PAGEREF _Toc242395609 \h </w:instrText>
+          <w:instrText xml:space="preserve"> PAGEREF _Toc242396878 \h </w:instrText>
         </w:r>
         <w:r>
           <w:rPr>
@@ -2252,7 +2252,7 @@
           <w14:ligatures w14:val="standardContextual"/>
         </w:rPr>
       </w:pPr>
-      <w:hyperlink w:anchor="_Toc242395610" w:history="1">
+      <w:hyperlink w:anchor="_Toc242396879" w:history="1">
         <w:r>
           <w:rPr>
             <w:rStyle w:val="a9"/>
@@ -2292,7 +2292,7 @@
           <w:rPr>
             <w:webHidden/>
           </w:rPr>
-          <w:instrText xml:space="preserve"> PAGEREF _Toc242395610 \h </w:instrText>
+          <w:instrText xml:space="preserve"> PAGEREF _Toc242396879 \h </w:instrText>
         </w:r>
         <w:r>
           <w:rPr>
@@ -2331,7 +2331,7 @@
           <w14:ligatures w14:val="standardContextual"/>
         </w:rPr>
       </w:pPr>
-      <w:hyperlink w:anchor="_Toc242395611" w:history="1">
+      <w:hyperlink w:anchor="_Toc242396880" w:history="1">
         <w:r>
           <w:rPr>
             <w:rStyle w:val="a9"/>
@@ -2371,7 +2371,7 @@
           <w:rPr>
             <w:webHidden/>
           </w:rPr>
-          <w:instrText xml:space="preserve"> PAGEREF _Toc242395611 \h </w:instrText>
+          <w:instrText xml:space="preserve"> PAGEREF _Toc242396880 \h </w:instrText>
         </w:r>
         <w:r>
           <w:rPr>
@@ -2410,7 +2410,7 @@
           <w14:ligatures w14:val="standardContextual"/>
         </w:rPr>
       </w:pPr>
-      <w:hyperlink w:anchor="_Toc242395612" w:history="1">
+      <w:hyperlink w:anchor="_Toc242396881" w:history="1">
         <w:r>
           <w:rPr>
             <w:rStyle w:val="a9"/>
@@ -2450,7 +2450,7 @@
           <w:rPr>
             <w:webHidden/>
           </w:rPr>
-          <w:instrText xml:space="preserve"> PAGEREF _Toc242395612 \h </w:instrText>
+          <w:instrText xml:space="preserve"> PAGEREF _Toc242396881 \h </w:instrText>
         </w:r>
         <w:r>
           <w:rPr>
@@ -2489,7 +2489,7 @@
           <w14:ligatures w14:val="standardContextual"/>
         </w:rPr>
       </w:pPr>
-      <w:hyperlink w:anchor="_Toc242395613" w:history="1">
+      <w:hyperlink w:anchor="_Toc242396882" w:history="1">
         <w:r>
           <w:rPr>
             <w:rStyle w:val="a9"/>
@@ -2529,7 +2529,7 @@
           <w:rPr>
             <w:webHidden/>
           </w:rPr>
-          <w:instrText xml:space="preserve"> PAGEREF _Toc242395613 \h </w:instrText>
+          <w:instrText xml:space="preserve"> PAGEREF _Toc242396882 \h </w:instrText>
         </w:r>
         <w:r>
           <w:rPr>
@@ -2568,7 +2568,7 @@
           <w14:ligatures w14:val="standardContextual"/>
         </w:rPr>
       </w:pPr>
-      <w:hyperlink w:anchor="_Toc242395614" w:history="1">
+      <w:hyperlink w:anchor="_Toc242396883" w:history="1">
         <w:r>
           <w:rPr>
             <w:rStyle w:val="a9"/>
@@ -2608,7 +2608,7 @@
           <w:rPr>
             <w:webHidden/>
           </w:rPr>
-          <w:instrText xml:space="preserve"> PAGEREF _Toc242395614 \h </w:instrText>
+          <w:instrText xml:space="preserve"> PAGEREF _Toc242396883 \h </w:instrText>
         </w:r>
         <w:r>
           <w:rPr>
@@ -2651,7 +2651,7 @@
           <w14:ligatures w14:val="standardContextual"/>
         </w:rPr>
       </w:pPr>
-      <w:hyperlink w:anchor="_Toc242395615" w:history="1">
+      <w:hyperlink w:anchor="_Toc242396884" w:history="1">
         <w:r>
           <w:rPr>
             <w:rStyle w:val="a9"/>
@@ -2700,7 +2700,7 @@
             <w:noProof/>
             <w:webHidden/>
           </w:rPr>
-          <w:instrText xml:space="preserve"> PAGEREF _Toc242395615 \h </w:instrText>
+          <w:instrText xml:space="preserve"> PAGEREF _Toc242396884 \h </w:instrText>
         </w:r>
         <w:r>
           <w:rPr>
@@ -2743,7 +2743,7 @@
           <w14:ligatures w14:val="standardContextual"/>
         </w:rPr>
       </w:pPr>
-      <w:hyperlink w:anchor="_Toc242395616" w:history="1">
+      <w:hyperlink w:anchor="_Toc242396885" w:history="1">
         <w:r>
           <w:rPr>
             <w:rStyle w:val="a9"/>
@@ -2783,7 +2783,7 @@
           <w:rPr>
             <w:webHidden/>
           </w:rPr>
-          <w:instrText xml:space="preserve"> PAGEREF _Toc242395616 \h </w:instrText>
+          <w:instrText xml:space="preserve"> PAGEREF _Toc242396885 \h </w:instrText>
         </w:r>
         <w:r>
           <w:rPr>
@@ -2822,7 +2822,7 @@
           <w14:ligatures w14:val="standardContextual"/>
         </w:rPr>
       </w:pPr>
-      <w:hyperlink w:anchor="_Toc242395617" w:history="1">
+      <w:hyperlink w:anchor="_Toc242396886" w:history="1">
         <w:r>
           <w:rPr>
             <w:rStyle w:val="a9"/>
@@ -2862,7 +2862,7 @@
           <w:rPr>
             <w:webHidden/>
           </w:rPr>
-          <w:instrText xml:space="preserve"> PAGEREF _Toc242395617 \h </w:instrText>
+          <w:instrText xml:space="preserve"> PAGEREF _Toc242396886 \h </w:instrText>
         </w:r>
         <w:r>
           <w:rPr>
@@ -2901,7 +2901,7 @@
           <w14:ligatures w14:val="standardContextual"/>
         </w:rPr>
       </w:pPr>
-      <w:hyperlink w:anchor="_Toc242395618" w:history="1">
+      <w:hyperlink w:anchor="_Toc242396887" w:history="1">
         <w:r>
           <w:rPr>
             <w:rStyle w:val="a9"/>
@@ -2941,7 +2941,7 @@
           <w:rPr>
             <w:webHidden/>
           </w:rPr>
-          <w:instrText xml:space="preserve"> PAGEREF _Toc242395618 \h </w:instrText>
+          <w:instrText xml:space="preserve"> PAGEREF _Toc242396887 \h </w:instrText>
         </w:r>
         <w:r>
           <w:rPr>
@@ -2980,7 +2980,7 @@
           <w14:ligatures w14:val="standardContextual"/>
         </w:rPr>
       </w:pPr>
-      <w:hyperlink w:anchor="_Toc242395619" w:history="1">
+      <w:hyperlink w:anchor="_Toc242396888" w:history="1">
         <w:r>
           <w:rPr>
             <w:rStyle w:val="a9"/>
@@ -3020,7 +3020,7 @@
           <w:rPr>
             <w:webHidden/>
           </w:rPr>
-          <w:instrText xml:space="preserve"> PAGEREF _Toc242395619 \h </w:instrText>
+          <w:instrText xml:space="preserve"> PAGEREF _Toc242396888 \h </w:instrText>
         </w:r>
         <w:r>
           <w:rPr>
@@ -3063,7 +3063,7 @@
           <w14:ligatures w14:val="standardContextual"/>
         </w:rPr>
       </w:pPr>
-      <w:hyperlink w:anchor="_Toc242395620" w:history="1">
+      <w:hyperlink w:anchor="_Toc242396889" w:history="1">
         <w:r>
           <w:rPr>
             <w:rStyle w:val="a9"/>
@@ -3112,7 +3112,7 @@
             <w:noProof/>
             <w:webHidden/>
           </w:rPr>
-          <w:instrText xml:space="preserve"> PAGEREF _Toc242395620 \h </w:instrText>
+          <w:instrText xml:space="preserve"> PAGEREF _Toc242396889 \h </w:instrText>
         </w:r>
         <w:r>
           <w:rPr>
@@ -3155,7 +3155,7 @@
           <w14:ligatures w14:val="standardContextual"/>
         </w:rPr>
       </w:pPr>
-      <w:hyperlink w:anchor="_Toc242395621" w:history="1">
+      <w:hyperlink w:anchor="_Toc242396890" w:history="1">
         <w:r>
           <w:rPr>
             <w:rStyle w:val="a9"/>
@@ -3195,7 +3195,7 @@
           <w:rPr>
             <w:webHidden/>
           </w:rPr>
-          <w:instrText xml:space="preserve"> PAGEREF _Toc242395621 \h </w:instrText>
+          <w:instrText xml:space="preserve"> PAGEREF _Toc242396890 \h </w:instrText>
         </w:r>
         <w:r>
           <w:rPr>
@@ -3234,7 +3234,7 @@
           <w14:ligatures w14:val="standardContextual"/>
         </w:rPr>
       </w:pPr>
-      <w:hyperlink w:anchor="_Toc242395622" w:history="1">
+      <w:hyperlink w:anchor="_Toc242396891" w:history="1">
         <w:r>
           <w:rPr>
             <w:rStyle w:val="a9"/>
@@ -3274,7 +3274,7 @@
           <w:rPr>
             <w:webHidden/>
           </w:rPr>
-          <w:instrText xml:space="preserve"> PAGEREF _Toc242395622 \h </w:instrText>
+          <w:instrText xml:space="preserve"> PAGEREF _Toc242396891 \h </w:instrText>
         </w:r>
         <w:r>
           <w:rPr>
@@ -3313,7 +3313,7 @@
           <w14:ligatures w14:val="standardContextual"/>
         </w:rPr>
       </w:pPr>
-      <w:hyperlink w:anchor="_Toc242395623" w:history="1">
+      <w:hyperlink w:anchor="_Toc242396892" w:history="1">
         <w:r>
           <w:rPr>
             <w:rStyle w:val="a9"/>
@@ -3353,7 +3353,7 @@
           <w:rPr>
             <w:webHidden/>
           </w:rPr>
-          <w:instrText xml:space="preserve"> PAGEREF _Toc242395623 \h </w:instrText>
+          <w:instrText xml:space="preserve"> PAGEREF _Toc242396892 \h </w:instrText>
         </w:r>
         <w:r>
           <w:rPr>
@@ -3392,7 +3392,7 @@
           <w14:ligatures w14:val="standardContextual"/>
         </w:rPr>
       </w:pPr>
-      <w:hyperlink w:anchor="_Toc242395624" w:history="1">
+      <w:hyperlink w:anchor="_Toc242396893" w:history="1">
         <w:r>
           <w:rPr>
             <w:rStyle w:val="a9"/>
@@ -3432,7 +3432,7 @@
           <w:rPr>
             <w:webHidden/>
           </w:rPr>
-          <w:instrText xml:space="preserve"> PAGEREF _Toc242395624 \h </w:instrText>
+          <w:instrText xml:space="preserve"> PAGEREF _Toc242396893 \h </w:instrText>
         </w:r>
         <w:r>
           <w:rPr>
@@ -3471,7 +3471,7 @@
           <w14:ligatures w14:val="standardContextual"/>
         </w:rPr>
       </w:pPr>
-      <w:hyperlink w:anchor="_Toc242395625" w:history="1">
+      <w:hyperlink w:anchor="_Toc242396894" w:history="1">
         <w:r>
           <w:rPr>
             <w:rStyle w:val="a9"/>
@@ -3511,7 +3511,7 @@
           <w:rPr>
             <w:webHidden/>
           </w:rPr>
-          <w:instrText xml:space="preserve"> PAGEREF _Toc242395625 \h </w:instrText>
+          <w:instrText xml:space="preserve"> PAGEREF _Toc242396894 \h </w:instrText>
         </w:r>
         <w:r>
           <w:rPr>
@@ -3554,7 +3554,7 @@
           <w14:ligatures w14:val="standardContextual"/>
         </w:rPr>
       </w:pPr>
-      <w:hyperlink w:anchor="_Toc242395626" w:history="1">
+      <w:hyperlink w:anchor="_Toc242396895" w:history="1">
         <w:r>
           <w:rPr>
             <w:rStyle w:val="a9"/>
@@ -3603,7 +3603,7 @@
             <w:noProof/>
             <w:webHidden/>
           </w:rPr>
-          <w:instrText xml:space="preserve"> PAGEREF _Toc242395626 \h </w:instrText>
+          <w:instrText xml:space="preserve"> PAGEREF _Toc242396895 \h </w:instrText>
         </w:r>
         <w:r>
           <w:rPr>
@@ -3650,7 +3650,7 @@
           <w14:ligatures w14:val="standardContextual"/>
         </w:rPr>
       </w:pPr>
-      <w:hyperlink w:anchor="_Toc242395627" w:history="1">
+      <w:hyperlink w:anchor="_Toc242396896" w:history="1">
         <w:r>
           <w:rPr>
             <w:rStyle w:val="a9"/>
@@ -3677,7 +3677,7 @@
             <w:noProof/>
             <w:webHidden/>
           </w:rPr>
-          <w:instrText xml:space="preserve"> PAGEREF _Toc242395627 \h </w:instrText>
+          <w:instrText xml:space="preserve"> PAGEREF _Toc242396896 \h </w:instrText>
         </w:r>
         <w:r>
           <w:rPr>
@@ -3746,7 +3746,7 @@
       <w:pPr>
         <w:pStyle w:val="1"/>
       </w:pPr>
-      <w:bookmarkStart w:id="1" w:name="_Toc242395587"/>
+      <w:bookmarkStart w:id="1" w:name="_Toc242396856"/>
       <w:r>
         <w:lastRenderedPageBreak/>
         <w:t>Progress &amp; Achievements</w:t>
@@ -3780,7 +3780,7 @@
       <w:pPr>
         <w:pStyle w:val="2"/>
       </w:pPr>
-      <w:bookmarkStart w:id="2" w:name="_Toc242395588"/>
+      <w:bookmarkStart w:id="2" w:name="_Toc242396857"/>
       <w:r>
         <w:t>The project in brief</w:t>
       </w:r>
@@ -3900,7 +3900,7 @@
       <w:pPr>
         <w:pStyle w:val="2"/>
       </w:pPr>
-      <w:bookmarkStart w:id="3" w:name="_Toc242395589"/>
+      <w:bookmarkStart w:id="3" w:name="_Toc242396858"/>
       <w:r>
         <w:t>Summary: are we on track?</w:t>
       </w:r>
@@ -4420,7 +4420,7 @@
       <w:pPr>
         <w:pStyle w:val="2"/>
       </w:pPr>
-      <w:bookmarkStart w:id="4" w:name="_Toc242395590"/>
+      <w:bookmarkStart w:id="4" w:name="_Toc242396859"/>
       <w:r>
         <w:t>Who the platform is for</w:t>
       </w:r>
@@ -4431,7 +4431,7 @@
         <w:pStyle w:val="ReportNormal"/>
       </w:pPr>
       <w:r>
-        <w:t>Hej serves six kinds of user inside a client organisation (Table 2). Each holds one or more roles, and every action they take is checked on the server against those roles. The client, Arc Intelligence, owns the platform and decides product questions; it is a stakeholder rather than a user. Every story in the backlog serves at least one of these users, and the rest of Section 1 follows their needs.</w:t>
+        <w:t>Hej serves seven kinds of user inside a client organisation (Table 2). Each holds one or more roles, and every action they take is checked on the server against those roles. The client, Arc Intelligence, owns the platform and decides product questions; it is a stakeholder rather than a user. Every story in the backlog serves at least one of these users, and the rest of Section 1 follows their needs.</w:t>
       </w:r>
     </w:p>
     <w:p>
@@ -5047,7 +5047,7 @@
       <w:pPr>
         <w:pStyle w:val="2"/>
       </w:pPr>
-      <w:bookmarkStart w:id="5" w:name="_Toc242395591"/>
+      <w:bookmarkStart w:id="5" w:name="_Toc242396860"/>
       <w:r>
         <w:t>From user needs to sprints</w:t>
       </w:r>
@@ -6109,7 +6109,7 @@
         </w:rPr>
         <w:lastRenderedPageBreak/>
         <w:drawing>
-          <wp:inline distT="0" distB="0" distL="0" distR="0" wp14:anchorId="512F90F4" wp14:editId="28D8B862">
+          <wp:inline distT="0" distB="0" distL="0" distR="0" wp14:anchorId="553E7057" wp14:editId="5768ABB8">
             <wp:extent cx="5212080" cy="4366877"/>
             <wp:effectExtent l="0" t="0" r="0" b="0"/>
             <wp:docPr id="101" name="Figure 101"/>
@@ -6157,7 +6157,7 @@
       <w:pPr>
         <w:pStyle w:val="2"/>
       </w:pPr>
-      <w:bookmarkStart w:id="6" w:name="_Toc242395592"/>
+      <w:bookmarkStart w:id="6" w:name="_Toc242396861"/>
       <w:r>
         <w:t>Sprint by sprint: what was built and what was solved</w:t>
       </w:r>
@@ -6781,7 +6781,7 @@
       <w:pPr>
         <w:pStyle w:val="2"/>
       </w:pPr>
-      <w:bookmarkStart w:id="7" w:name="_Toc242395593"/>
+      <w:bookmarkStart w:id="7" w:name="_Toc242396862"/>
       <w:r>
         <w:t>Front end: what each user can now do</w:t>
       </w:r>
@@ -6799,7 +6799,7 @@
       <w:pPr>
         <w:pStyle w:val="3"/>
       </w:pPr>
-      <w:bookmarkStart w:id="8" w:name="_Toc242395594"/>
+      <w:bookmarkStart w:id="8" w:name="_Toc242396863"/>
       <w:r>
         <w:t>Administrator and invitee</w:t>
       </w:r>
@@ -6827,7 +6827,7 @@
           <w:noProof/>
         </w:rPr>
         <w:drawing>
-          <wp:inline distT="0" distB="0" distL="0" distR="0" wp14:anchorId="1D2655FB" wp14:editId="62BD3182">
+          <wp:inline distT="0" distB="0" distL="0" distR="0" wp14:anchorId="6590A42F" wp14:editId="78F77FF4">
             <wp:extent cx="4754880" cy="2971800"/>
             <wp:effectExtent l="0" t="0" r="0" b="0"/>
             <wp:docPr id="102" name="Figure 102"/>
@@ -6875,7 +6875,7 @@
       <w:pPr>
         <w:pStyle w:val="3"/>
       </w:pPr>
-      <w:bookmarkStart w:id="9" w:name="_Toc242395595"/>
+      <w:bookmarkStart w:id="9" w:name="_Toc242396864"/>
       <w:r>
         <w:t>Project manager and task owner</w:t>
       </w:r>
@@ -6904,10 +6904,10 @@
         <w:t>Recorded</w:t>
       </w:r>
       <w:r>
-        <w:t>, stored and shown until the story that enforces them lands (for example the Expert Gate, G2, in Week 10) (#25, #37). Task setup now chooses the annotation surface, such as classification or text spans, and the AI model (#36); defines labels with their meanings (#27); and uploads JSONL, JSON, CSV or text files, choosing per file which fields become the item that annotators and the AI see (#42). The task header carries activate, pause, resume and complete controls (#41); the AI run shows batch progress and e</w:t>
-      </w:r>
-      <w:r>
-        <w:t>ach item's job status (#7, #32); and a finalised item can be reopened by the project owner with a reason (#46).</w:t>
+        <w:t>, stored and shown until the story that enforces them lands, such as the Expert Gate (G2) in Week 10 (#25, #37). In task setup the owner now chooses the annotation surface, such as classification or text spans, and the AI model (#36); defines labels with their meanings (#27); and uploads JSONL, JSON, CSV or text files, choosing per file which fields become the item that annotators and the AI see (#42). The task header carries activate, pause, resume and complete controls (#41); the AI run shows batch progre</w:t>
+      </w:r>
+      <w:r>
+        <w:t>ss and each item's job status (#7, #32); and a finalised item can be reopened by the project owner with a reason (#46).</w:t>
       </w:r>
     </w:p>
     <w:p>
@@ -6921,7 +6921,7 @@
         </w:rPr>
         <w:lastRenderedPageBreak/>
         <w:drawing>
-          <wp:inline distT="0" distB="0" distL="0" distR="0" wp14:anchorId="0F213254" wp14:editId="07947BCA">
+          <wp:inline distT="0" distB="0" distL="0" distR="0" wp14:anchorId="49F4AE86" wp14:editId="4AD82053">
             <wp:extent cx="5120640" cy="3031183"/>
             <wp:effectExtent l="0" t="0" r="0" b="0"/>
             <wp:docPr id="103" name="Figure 103"/>
@@ -6969,7 +6969,7 @@
       <w:pPr>
         <w:pStyle w:val="3"/>
       </w:pPr>
-      <w:bookmarkStart w:id="10" w:name="_Toc242395596"/>
+      <w:bookmarkStart w:id="10" w:name="_Toc242396865"/>
       <w:r>
         <w:t>Annotator</w:t>
       </w:r>
@@ -6997,7 +6997,7 @@
         </w:rPr>
         <w:lastRenderedPageBreak/>
         <w:drawing>
-          <wp:inline distT="0" distB="0" distL="0" distR="0" wp14:anchorId="665D9B7E" wp14:editId="302329EF">
+          <wp:inline distT="0" distB="0" distL="0" distR="0" wp14:anchorId="605CDB3B" wp14:editId="6553406C">
             <wp:extent cx="5120640" cy="3222991"/>
             <wp:effectExtent l="0" t="0" r="0" b="0"/>
             <wp:docPr id="104" name="Figure 104"/>
@@ -7045,7 +7045,7 @@
       <w:pPr>
         <w:pStyle w:val="3"/>
       </w:pPr>
-      <w:bookmarkStart w:id="11" w:name="_Toc242395597"/>
+      <w:bookmarkStart w:id="11" w:name="_Toc242396866"/>
       <w:r>
         <w:t>Reviewer</w:t>
       </w:r>
@@ -7073,7 +7073,7 @@
         </w:rPr>
         <w:lastRenderedPageBreak/>
         <w:drawing>
-          <wp:inline distT="0" distB="0" distL="0" distR="0" wp14:anchorId="500C84A6" wp14:editId="0B49B172">
+          <wp:inline distT="0" distB="0" distL="0" distR="0" wp14:anchorId="45DB4ED8" wp14:editId="096C859F">
             <wp:extent cx="5120640" cy="3096768"/>
             <wp:effectExtent l="0" t="0" r="0" b="0"/>
             <wp:docPr id="105" name="Figure 105"/>
@@ -7127,7 +7127,7 @@
           <w:noProof/>
         </w:rPr>
         <w:drawing>
-          <wp:inline distT="0" distB="0" distL="0" distR="0" wp14:anchorId="25290D6D" wp14:editId="32F4CC1D">
+          <wp:inline distT="0" distB="0" distL="0" distR="0" wp14:anchorId="234ECD60" wp14:editId="2129A096">
             <wp:extent cx="5120640" cy="3096768"/>
             <wp:effectExtent l="0" t="0" r="0" b="0"/>
             <wp:docPr id="106" name="Figure 106"/>
@@ -7175,7 +7175,7 @@
       <w:pPr>
         <w:pStyle w:val="3"/>
       </w:pPr>
-      <w:bookmarkStart w:id="12" w:name="_Toc242395598"/>
+      <w:bookmarkStart w:id="12" w:name="_Toc242396867"/>
       <w:r>
         <w:t>Expert</w:t>
       </w:r>
@@ -7203,7 +7203,7 @@
           <w:noProof/>
         </w:rPr>
         <w:drawing>
-          <wp:inline distT="0" distB="0" distL="0" distR="0" wp14:anchorId="7447533E" wp14:editId="6F516223">
+          <wp:inline distT="0" distB="0" distL="0" distR="0" wp14:anchorId="5502639F" wp14:editId="57B4AF64">
             <wp:extent cx="5120640" cy="1471448"/>
             <wp:effectExtent l="0" t="0" r="0" b="0"/>
             <wp:docPr id="107" name="Figure 107"/>
@@ -7257,7 +7257,7 @@
           <w:noProof/>
         </w:rPr>
         <w:drawing>
-          <wp:inline distT="0" distB="0" distL="0" distR="0" wp14:anchorId="202ED938" wp14:editId="4050009A">
+          <wp:inline distT="0" distB="0" distL="0" distR="0" wp14:anchorId="49B966FE" wp14:editId="68B10C0B">
             <wp:extent cx="5120640" cy="1227755"/>
             <wp:effectExtent l="0" t="0" r="0" b="0"/>
             <wp:docPr id="108" name="Figure 108"/>
@@ -7305,7 +7305,7 @@
       <w:pPr>
         <w:pStyle w:val="2"/>
       </w:pPr>
-      <w:bookmarkStart w:id="13" w:name="_Toc242395599"/>
+      <w:bookmarkStart w:id="13" w:name="_Toc242396868"/>
       <w:r>
         <w:t>Back end and data</w:t>
       </w:r>
@@ -7315,7 +7315,7 @@
       <w:pPr>
         <w:pStyle w:val="3"/>
       </w:pPr>
-      <w:bookmarkStart w:id="14" w:name="_Toc242395600"/>
+      <w:bookmarkStart w:id="14" w:name="_Toc242396869"/>
       <w:r>
         <w:t>The dataset</w:t>
       </w:r>
@@ -7759,7 +7759,7 @@
       <w:pPr>
         <w:pStyle w:val="3"/>
       </w:pPr>
-      <w:bookmarkStart w:id="15" w:name="_Toc242395601"/>
+      <w:bookmarkStart w:id="15" w:name="_Toc242396870"/>
       <w:r>
         <w:lastRenderedPageBreak/>
         <w:t>AI: external models, not trained by us</w:t>
@@ -7784,7 +7784,7 @@
       <w:pPr>
         <w:pStyle w:val="3"/>
       </w:pPr>
-      <w:bookmarkStart w:id="16" w:name="_Toc242395602"/>
+      <w:bookmarkStart w:id="16" w:name="_Toc242396871"/>
       <w:r>
         <w:t>How the back end supports the front end</w:t>
       </w:r>
@@ -8550,7 +8550,7 @@
       <w:pPr>
         <w:pStyle w:val="3"/>
       </w:pPr>
-      <w:bookmarkStart w:id="17" w:name="_Toc242395603"/>
+      <w:bookmarkStart w:id="17" w:name="_Toc242396872"/>
       <w:r>
         <w:t>Back-end scripts and services used in operations</w:t>
       </w:r>
@@ -8986,7 +8986,7 @@
       <w:pPr>
         <w:pStyle w:val="3"/>
       </w:pPr>
-      <w:bookmarkStart w:id="18" w:name="_Toc242395604"/>
+      <w:bookmarkStart w:id="18" w:name="_Toc242396873"/>
       <w:r>
         <w:t>Records, quality and inherited defects</w:t>
       </w:r>
@@ -9014,7 +9014,7 @@
         </w:rPr>
         <w:lastRenderedPageBreak/>
         <w:drawing>
-          <wp:inline distT="0" distB="0" distL="0" distR="0" wp14:anchorId="5833E3D1" wp14:editId="59B7BAE4">
+          <wp:inline distT="0" distB="0" distL="0" distR="0" wp14:anchorId="6B27DFCE" wp14:editId="73C1CB8F">
             <wp:extent cx="3108960" cy="4880344"/>
             <wp:effectExtent l="0" t="0" r="0" b="0"/>
             <wp:docPr id="109" name="Figure 109"/>
@@ -9607,7 +9607,7 @@
       <w:pPr>
         <w:pStyle w:val="2"/>
       </w:pPr>
-      <w:bookmarkStart w:id="19" w:name="_Toc242395605"/>
+      <w:bookmarkStart w:id="19" w:name="_Toc242396874"/>
       <w:r>
         <w:t>Deliverables and the MVP</w:t>
       </w:r>
@@ -10192,7 +10192,7 @@
       <w:pPr>
         <w:pStyle w:val="3"/>
       </w:pPr>
-      <w:bookmarkStart w:id="20" w:name="_Toc242395606"/>
+      <w:bookmarkStart w:id="20" w:name="_Toc242396875"/>
       <w:r>
         <w:lastRenderedPageBreak/>
         <w:t>The MVP: complete, tested and working</w:t>
@@ -10913,7 +10913,7 @@
       <w:pPr>
         <w:pStyle w:val="2"/>
       </w:pPr>
-      <w:bookmarkStart w:id="21" w:name="_Toc242395607"/>
+      <w:bookmarkStart w:id="21" w:name="_Toc242396876"/>
       <w:r>
         <w:t>Progress by epic</w:t>
       </w:r>
@@ -10944,7 +10944,7 @@
           <w:noProof/>
         </w:rPr>
         <w:drawing>
-          <wp:inline distT="0" distB="0" distL="0" distR="0" wp14:anchorId="7889A13B" wp14:editId="52FB3D8F">
+          <wp:inline distT="0" distB="0" distL="0" distR="0" wp14:anchorId="6CAB122D" wp14:editId="79E53178">
             <wp:extent cx="5212080" cy="2461260"/>
             <wp:effectExtent l="0" t="0" r="0" b="0"/>
             <wp:docPr id="110" name="Figure 110"/>
@@ -10992,7 +10992,7 @@
       <w:pPr>
         <w:pStyle w:val="2"/>
       </w:pPr>
-      <w:bookmarkStart w:id="22" w:name="_Toc242395608"/>
+      <w:bookmarkStart w:id="22" w:name="_Toc242396877"/>
       <w:r>
         <w:t>How we work</w:t>
       </w:r>
@@ -11090,7 +11090,7 @@
       <w:pPr>
         <w:pStyle w:val="1"/>
       </w:pPr>
-      <w:bookmarkStart w:id="23" w:name="_Toc242395609"/>
+      <w:bookmarkStart w:id="23" w:name="_Toc242396878"/>
       <w:r>
         <w:t>Obstacles</w:t>
       </w:r>
@@ -11111,7 +11111,7 @@
       <w:pPr>
         <w:pStyle w:val="2"/>
       </w:pPr>
-      <w:bookmarkStart w:id="24" w:name="_Toc242395610"/>
+      <w:bookmarkStart w:id="24" w:name="_Toc242396879"/>
       <w:r>
         <w:lastRenderedPageBreak/>
         <w:t>Obstacles met so far</w:t>
@@ -12169,7 +12169,7 @@
       <w:pPr>
         <w:pStyle w:val="2"/>
       </w:pPr>
-      <w:bookmarkStart w:id="25" w:name="_Toc242395611"/>
+      <w:bookmarkStart w:id="25" w:name="_Toc242396880"/>
       <w:r>
         <w:t>Challenges by sprint and story</w:t>
       </w:r>
@@ -13218,7 +13218,7 @@
       <w:pPr>
         <w:pStyle w:val="2"/>
       </w:pPr>
-      <w:bookmarkStart w:id="26" w:name="_Toc242395612"/>
+      <w:bookmarkStart w:id="26" w:name="_Toc242396881"/>
       <w:r>
         <w:t>Risks ahead</w:t>
       </w:r>
@@ -13242,7 +13242,7 @@
           <w:noProof/>
         </w:rPr>
         <w:drawing>
-          <wp:inline distT="0" distB="0" distL="0" distR="0" wp14:anchorId="0B756ACC" wp14:editId="328ED167">
+          <wp:inline distT="0" distB="0" distL="0" distR="0" wp14:anchorId="68A7C2CD" wp14:editId="06E91635">
             <wp:extent cx="3291840" cy="2351314"/>
             <wp:effectExtent l="0" t="0" r="0" b="0"/>
             <wp:docPr id="111" name="Figure 111"/>
@@ -14421,7 +14421,7 @@
       <w:pPr>
         <w:pStyle w:val="2"/>
       </w:pPr>
-      <w:bookmarkStart w:id="27" w:name="_Toc242395613"/>
+      <w:bookmarkStart w:id="27" w:name="_Toc242396882"/>
       <w:r>
         <w:t>Dependencies</w:t>
       </w:r>
@@ -15320,7 +15320,7 @@
       <w:pPr>
         <w:pStyle w:val="2"/>
       </w:pPr>
-      <w:bookmarkStart w:id="28" w:name="_Toc242395614"/>
+      <w:bookmarkStart w:id="28" w:name="_Toc242396883"/>
       <w:r>
         <w:t>Lessons learned</w:t>
       </w:r>
@@ -15408,7 +15408,7 @@
       <w:pPr>
         <w:pStyle w:val="1"/>
       </w:pPr>
-      <w:bookmarkStart w:id="29" w:name="_Toc242395615"/>
+      <w:bookmarkStart w:id="29" w:name="_Toc242396884"/>
       <w:r>
         <w:lastRenderedPageBreak/>
         <w:t>Deviation to Timeline</w:t>
@@ -15419,7 +15419,7 @@
       <w:pPr>
         <w:pStyle w:val="2"/>
       </w:pPr>
-      <w:bookmarkStart w:id="30" w:name="_Toc242395616"/>
+      <w:bookmarkStart w:id="30" w:name="_Toc242396885"/>
       <w:r>
         <w:t>The baseline</w:t>
       </w:r>
@@ -15446,7 +15446,7 @@
           <w:noProof/>
         </w:rPr>
         <w:drawing>
-          <wp:inline distT="0" distB="0" distL="0" distR="0" wp14:anchorId="2C042639" wp14:editId="363B2F53">
+          <wp:inline distT="0" distB="0" distL="0" distR="0" wp14:anchorId="370599AA" wp14:editId="6CE4E140">
             <wp:extent cx="5212080" cy="3040380"/>
             <wp:effectExtent l="0" t="0" r="0" b="0"/>
             <wp:docPr id="112" name="Figure 112"/>
@@ -15508,7 +15508,7 @@
       <w:pPr>
         <w:pStyle w:val="2"/>
       </w:pPr>
-      <w:bookmarkStart w:id="31" w:name="_Toc242395617"/>
+      <w:bookmarkStart w:id="31" w:name="_Toc242396886"/>
       <w:r>
         <w:t>What moved, and why</w:t>
       </w:r>
@@ -15533,7 +15533,7 @@
         </w:rPr>
         <w:lastRenderedPageBreak/>
         <w:drawing>
-          <wp:inline distT="0" distB="0" distL="0" distR="0" wp14:anchorId="17935C18" wp14:editId="0B40CF80">
+          <wp:inline distT="0" distB="0" distL="0" distR="0" wp14:anchorId="23A253EE" wp14:editId="257A98B8">
             <wp:extent cx="5212080" cy="4155577"/>
             <wp:effectExtent l="0" t="0" r="0" b="0"/>
             <wp:docPr id="113" name="Figure 113"/>
@@ -16621,7 +16621,7 @@
       <w:pPr>
         <w:pStyle w:val="2"/>
       </w:pPr>
-      <w:bookmarkStart w:id="32" w:name="_Toc242395618"/>
+      <w:bookmarkStart w:id="32" w:name="_Toc242396887"/>
       <w:r>
         <w:t>Carry-over between sprints</w:t>
       </w:r>
@@ -16642,7 +16642,7 @@
       <w:pPr>
         <w:pStyle w:val="2"/>
       </w:pPr>
-      <w:bookmarkStart w:id="33" w:name="_Toc242395619"/>
+      <w:bookmarkStart w:id="33" w:name="_Toc242396888"/>
       <w:r>
         <w:t>Impact on the project</w:t>
       </w:r>
@@ -16709,7 +16709,7 @@
       <w:pPr>
         <w:pStyle w:val="1"/>
       </w:pPr>
-      <w:bookmarkStart w:id="34" w:name="_Toc242395620"/>
+      <w:bookmarkStart w:id="34" w:name="_Toc242396889"/>
       <w:r>
         <w:t>Milestones &amp; Reporting</w:t>
       </w:r>
@@ -16719,7 +16719,7 @@
       <w:pPr>
         <w:pStyle w:val="2"/>
       </w:pPr>
-      <w:bookmarkStart w:id="35" w:name="_Toc242395621"/>
+      <w:bookmarkStart w:id="35" w:name="_Toc242396890"/>
       <w:r>
         <w:t>Updated milestones</w:t>
       </w:r>
@@ -16749,7 +16749,7 @@
         <w:t>struck-through text</w:t>
       </w:r>
       <w:r>
-        <w:t xml:space="preserve"> marks a task moved or replaced; owners are named for every task: Week 9 owners come from the Jira board, and Weeks 10–12 show proposed owners (*) to be confirmed at the weekly meeting. Ticket-level detail follows in Table 17.</w:t>
+        <w:t xml:space="preserve"> marks a task moved or replaced; owners are named for every task: past work by the member who delivered it, Week 9 from the Jira board, and Weeks 10–12 as proposed owners (*) to be confirmed at the weekly meeting. Ticket-level detail follows in Table 17.</w:t>
       </w:r>
     </w:p>
     <w:p>
@@ -16893,7 +16893,7 @@
                 <w:sz w:val="17"/>
                 <w:szCs w:val="17"/>
               </w:rPr>
-              <w:t>Project kick-off and team introductions; research on the brief; repository and workspace access</w:t>
+              <w:t>Project kick-off and team introductions; research on the brief; repository and workspace access (whole team)</w:t>
             </w:r>
           </w:p>
         </w:tc>
@@ -16986,7 +16986,7 @@
                 <w:sz w:val="17"/>
                 <w:szCs w:val="17"/>
               </w:rPr>
-              <w:t>)</w:t>
+              <w:t>) (whole team)</w:t>
             </w:r>
           </w:p>
         </w:tc>
@@ -17057,14 +17057,14 @@
                 <w:sz w:val="17"/>
                 <w:szCs w:val="17"/>
               </w:rPr>
-              <w:t>Milestone: Proposal.</w:t>
+              <w:t>Milestone: Proposal</w:t>
             </w:r>
             <w:r>
               <w:rPr>
                 <w:sz w:val="17"/>
                 <w:szCs w:val="17"/>
               </w:rPr>
-              <w:t xml:space="preserve"> Backlog of 59 stories; pull-request review workflow; </w:t>
+              <w:t xml:space="preserve"> (whole team). Backlog of 59 stories (Hanchen); pull-request review workflow (Hanchen, Jingwei); </w:t>
             </w:r>
             <w:r>
               <w:rPr>
@@ -17167,7 +17167,7 @@
                 <w:sz w:val="17"/>
                 <w:szCs w:val="17"/>
               </w:rPr>
-              <w:t xml:space="preserve">; fix cross-project write scoping (G3); </w:t>
+              <w:t xml:space="preserve">; fix cross-project write scoping (G3, Jingwei); </w:t>
             </w:r>
             <w:r>
               <w:rPr>
@@ -17175,7 +17175,7 @@
                 <w:sz w:val="17"/>
                 <w:szCs w:val="17"/>
               </w:rPr>
-              <w:t>added: draft ownership (D6), legacy review writes retired (D2), AI provider integration (C1, C3)</w:t>
+              <w:t>added: draft ownership (D6, Hanchen), legacy review writes retired (D2, Jingwei), AI provider integration (C1, C3, Michael)</w:t>
             </w:r>
           </w:p>
         </w:tc>
@@ -17245,7 +17245,7 @@
                 <w:sz w:val="17"/>
                 <w:szCs w:val="17"/>
               </w:rPr>
-              <w:t xml:space="preserve">Core backend: atomic draft submission (D5); </w:t>
+              <w:t xml:space="preserve">Core backend: atomic draft submission (D5, Hanchen); </w:t>
             </w:r>
             <w:r>
               <w:rPr>
@@ -17315,7 +17315,7 @@
                 <w:sz w:val="17"/>
                 <w:szCs w:val="17"/>
               </w:rPr>
-              <w:t>added: PostgreSQL and two-database CI, work-queue API (D8), project policy (B2), AI batch jobs (C2)</w:t>
+              <w:t>added: PostgreSQL and two-database CI (Parth), work-queue API (D8, Kanishka), project policy (B2, Jingwei), AI batch jobs (C2, Michael), invitations (G5, Tim)</w:t>
             </w:r>
           </w:p>
         </w:tc>
@@ -17417,7 +17417,7 @@
                 <w:sz w:val="17"/>
                 <w:szCs w:val="17"/>
               </w:rPr>
-              <w:t xml:space="preserve">. Dataset ingestion transactionality (B5); AI module integration (C2); export/completion rule (B6); task lifecycle (B4); </w:t>
+              <w:t xml:space="preserve">. Dataset ingestion transactionality (B5, Kanishka, Dishank); AI module integration (C2, Michael); export/completion rule (B6, Dishank); task lifecycle (B4, Dishank); </w:t>
             </w:r>
             <w:r>
               <w:rPr>
@@ -17425,7 +17425,7 @@
                 <w:sz w:val="17"/>
                 <w:szCs w:val="17"/>
               </w:rPr>
-              <w:t>added: JSONL import (B7), annotation surfaces (B8), review chooser (D4, D8)</w:t>
+              <w:t>added: JSONL import (B7, Yi), annotation surfaces (B8, Yi), review names its submission (D4, Jingwei), work panel and submission chooser (D8, Hanchen), member management (J3, Tim)</w:t>
             </w:r>
           </w:p>
         </w:tc>
@@ -17496,7 +17496,7 @@
                 <w:sz w:val="17"/>
                 <w:szCs w:val="17"/>
               </w:rPr>
-              <w:t>New sprint: scenario testing (3 bugs fixed and page load cut from 2,969 to ~560 ms); evaluation harness (I1); casebook structure (I2, draft); answer versions (F3); owner reopens a final item (D9); blind second review (D7); disputes (E3/E4) paused on issue #40</w:t>
+              <w:t>New sprint: scenario testing (whole team; 3 bugs fixed); page load cut from 2,969 to ~560 ms (A6, Hanchen); evaluation harness (I1, Jingwei); casebook structure (I2, Hanchen, draft); answer versions (F3, Hanchen); owner reopens a final item (D9, Jingwei); blind second review (D7, Parth); available-work list (D8, Kanishka); invitee acceptance (J3, Tim); disputes (E3/E4, Yi) paused on issue #40</w:t>
             </w:r>
           </w:p>
         </w:tc>
@@ -17543,6 +17543,7 @@
                 <w:sz w:val="17"/>
                 <w:szCs w:val="17"/>
               </w:rPr>
+              <w:lastRenderedPageBreak/>
               <w:t>Week 9</w:t>
             </w:r>
           </w:p>
@@ -17675,7 +17676,6 @@
                 <w:sz w:val="17"/>
                 <w:szCs w:val="17"/>
               </w:rPr>
-              <w:lastRenderedPageBreak/>
               <w:t>Week 10</w:t>
             </w:r>
           </w:p>
@@ -18030,7 +18030,7 @@
       <w:pPr>
         <w:pStyle w:val="2"/>
       </w:pPr>
-      <w:bookmarkStart w:id="36" w:name="_Toc242395622"/>
+      <w:bookmarkStart w:id="36" w:name="_Toc242396891"/>
       <w:r>
         <w:t>Remaining work, dependencies and the critical path</w:t>
       </w:r>
@@ -18064,7 +18064,7 @@
         </w:rPr>
         <w:lastRenderedPageBreak/>
         <w:drawing>
-          <wp:inline distT="0" distB="0" distL="0" distR="0" wp14:anchorId="50651F9D" wp14:editId="527ABA21">
+          <wp:inline distT="0" distB="0" distL="0" distR="0" wp14:anchorId="6B419AB7" wp14:editId="4ED95072">
             <wp:extent cx="5212080" cy="3803409"/>
             <wp:effectExtent l="0" t="0" r="0" b="0"/>
             <wp:docPr id="114" name="Figure 114"/>
@@ -21167,7 +21167,7 @@
       <w:pPr>
         <w:pStyle w:val="2"/>
       </w:pPr>
-      <w:bookmarkStart w:id="37" w:name="_Toc242395623"/>
+      <w:bookmarkStart w:id="37" w:name="_Toc242396892"/>
       <w:r>
         <w:t>Who carries what</w:t>
       </w:r>
@@ -22110,7 +22110,7 @@
       <w:pPr>
         <w:pStyle w:val="2"/>
       </w:pPr>
-      <w:bookmarkStart w:id="38" w:name="_Toc242395624"/>
+      <w:bookmarkStart w:id="38" w:name="_Toc242396893"/>
       <w:r>
         <w:t>Slack, fallbacks and contingency</w:t>
       </w:r>
@@ -22138,7 +22138,7 @@
           <w:noProof/>
         </w:rPr>
         <w:drawing>
-          <wp:inline distT="0" distB="0" distL="0" distR="0" wp14:anchorId="494353A3" wp14:editId="36EC7147">
+          <wp:inline distT="0" distB="0" distL="0" distR="0" wp14:anchorId="01F009E6" wp14:editId="70B85FEB">
             <wp:extent cx="5212080" cy="1954530"/>
             <wp:effectExtent l="0" t="0" r="0" b="0"/>
             <wp:docPr id="115" name="Figure 115"/>
@@ -22718,7 +22718,7 @@
       <w:pPr>
         <w:pStyle w:val="2"/>
       </w:pPr>
-      <w:bookmarkStart w:id="39" w:name="_Toc242395625"/>
+      <w:bookmarkStart w:id="39" w:name="_Toc242396894"/>
       <w:r>
         <w:lastRenderedPageBreak/>
         <w:t>Reporting and communication</w:t>
@@ -22785,7 +22785,7 @@
       <w:pPr>
         <w:pStyle w:val="1"/>
       </w:pPr>
-      <w:bookmarkStart w:id="40" w:name="_Toc242395626"/>
+      <w:bookmarkStart w:id="40" w:name="_Toc242396895"/>
       <w:r>
         <w:t>Acknowledgement of AI Use</w:t>
       </w:r>
@@ -22803,7 +22803,7 @@
       <w:pPr>
         <w:pStyle w:val="PhDAppendicesBibliography"/>
       </w:pPr>
-      <w:bookmarkStart w:id="41" w:name="_Toc242395627"/>
+      <w:bookmarkStart w:id="41" w:name="_Toc242396896"/>
       <w:r>
         <w:t>Appendix A. Identifiers and Terms</w:t>
       </w:r>

</xml_diff>

<commit_message>
docs: main text of the progress report uses the template's font sizes
</commit_message>
<xml_diff>
--- a/info/CS57_Progress_Report.docx
+++ b/info/CS57_Progress_Report.docx
@@ -283,7 +283,7 @@
       <w:pPr>
         <w:pStyle w:val="PhDPreliminaryHeading"/>
       </w:pPr>
-      <w:bookmarkStart w:id="0" w:name="_Toc242478572"/>
+      <w:bookmarkStart w:id="0" w:name="_Toc242479055"/>
       <w:r>
         <w:lastRenderedPageBreak/>
         <w:t>Table of Contents</w:t>
@@ -329,7 +329,7 @@
         </w:rPr>
         <w:fldChar w:fldCharType="separate"/>
       </w:r>
-      <w:hyperlink w:anchor="_Toc242478572" w:history="1">
+      <w:hyperlink w:anchor="_Toc242479055" w:history="1">
         <w:r>
           <w:rPr>
             <w:rStyle w:val="a9"/>
@@ -352,7 +352,7 @@
           <w:rPr>
             <w:webHidden/>
           </w:rPr>
-          <w:instrText xml:space="preserve"> PAGEREF _Toc242478572 \h </w:instrText>
+          <w:instrText xml:space="preserve"> PAGEREF _Toc242479055 \h </w:instrText>
         </w:r>
         <w:r>
           <w:rPr>
@@ -395,7 +395,7 @@
           <w14:ligatures w14:val="standardContextual"/>
         </w:rPr>
       </w:pPr>
-      <w:hyperlink w:anchor="_Toc242478573" w:history="1">
+      <w:hyperlink w:anchor="_Toc242479056" w:history="1">
         <w:r>
           <w:rPr>
             <w:rStyle w:val="a9"/>
@@ -444,7 +444,7 @@
             <w:noProof/>
             <w:webHidden/>
           </w:rPr>
-          <w:instrText xml:space="preserve"> PAGEREF _Toc242478573 \h </w:instrText>
+          <w:instrText xml:space="preserve"> PAGEREF _Toc242479056 \h </w:instrText>
         </w:r>
         <w:r>
           <w:rPr>
@@ -487,7 +487,7 @@
           <w14:ligatures w14:val="standardContextual"/>
         </w:rPr>
       </w:pPr>
-      <w:hyperlink w:anchor="_Toc242478574" w:history="1">
+      <w:hyperlink w:anchor="_Toc242479057" w:history="1">
         <w:r>
           <w:rPr>
             <w:rStyle w:val="a9"/>
@@ -527,7 +527,7 @@
           <w:rPr>
             <w:webHidden/>
           </w:rPr>
-          <w:instrText xml:space="preserve"> PAGEREF _Toc242478574 \h </w:instrText>
+          <w:instrText xml:space="preserve"> PAGEREF _Toc242479057 \h </w:instrText>
         </w:r>
         <w:r>
           <w:rPr>
@@ -566,7 +566,7 @@
           <w14:ligatures w14:val="standardContextual"/>
         </w:rPr>
       </w:pPr>
-      <w:hyperlink w:anchor="_Toc242478575" w:history="1">
+      <w:hyperlink w:anchor="_Toc242479058" w:history="1">
         <w:r>
           <w:rPr>
             <w:rStyle w:val="a9"/>
@@ -606,7 +606,7 @@
           <w:rPr>
             <w:webHidden/>
           </w:rPr>
-          <w:instrText xml:space="preserve"> PAGEREF _Toc242478575 \h </w:instrText>
+          <w:instrText xml:space="preserve"> PAGEREF _Toc242479058 \h </w:instrText>
         </w:r>
         <w:r>
           <w:rPr>
@@ -645,7 +645,7 @@
           <w14:ligatures w14:val="standardContextual"/>
         </w:rPr>
       </w:pPr>
-      <w:hyperlink w:anchor="_Toc242478576" w:history="1">
+      <w:hyperlink w:anchor="_Toc242479059" w:history="1">
         <w:r>
           <w:rPr>
             <w:rStyle w:val="a9"/>
@@ -685,7 +685,7 @@
           <w:rPr>
             <w:webHidden/>
           </w:rPr>
-          <w:instrText xml:space="preserve"> PAGEREF _Toc242478576 \h </w:instrText>
+          <w:instrText xml:space="preserve"> PAGEREF _Toc242479059 \h </w:instrText>
         </w:r>
         <w:r>
           <w:rPr>
@@ -702,7 +702,7 @@
           <w:rPr>
             <w:webHidden/>
           </w:rPr>
-          <w:t>2</w:t>
+          <w:t>3</w:t>
         </w:r>
         <w:r>
           <w:rPr>
@@ -724,7 +724,7 @@
           <w14:ligatures w14:val="standardContextual"/>
         </w:rPr>
       </w:pPr>
-      <w:hyperlink w:anchor="_Toc242478577" w:history="1">
+      <w:hyperlink w:anchor="_Toc242479060" w:history="1">
         <w:r>
           <w:rPr>
             <w:rStyle w:val="a9"/>
@@ -764,7 +764,7 @@
           <w:rPr>
             <w:webHidden/>
           </w:rPr>
-          <w:instrText xml:space="preserve"> PAGEREF _Toc242478577 \h </w:instrText>
+          <w:instrText xml:space="preserve"> PAGEREF _Toc242479060 \h </w:instrText>
         </w:r>
         <w:r>
           <w:rPr>
@@ -803,7 +803,7 @@
           <w14:ligatures w14:val="standardContextual"/>
         </w:rPr>
       </w:pPr>
-      <w:hyperlink w:anchor="_Toc242478578" w:history="1">
+      <w:hyperlink w:anchor="_Toc242479061" w:history="1">
         <w:r>
           <w:rPr>
             <w:rStyle w:val="a9"/>
@@ -843,7 +843,7 @@
           <w:rPr>
             <w:webHidden/>
           </w:rPr>
-          <w:instrText xml:space="preserve"> PAGEREF _Toc242478578 \h </w:instrText>
+          <w:instrText xml:space="preserve"> PAGEREF _Toc242479061 \h </w:instrText>
         </w:r>
         <w:r>
           <w:rPr>
@@ -882,7 +882,7 @@
           <w14:ligatures w14:val="standardContextual"/>
         </w:rPr>
       </w:pPr>
-      <w:hyperlink w:anchor="_Toc242478579" w:history="1">
+      <w:hyperlink w:anchor="_Toc242479062" w:history="1">
         <w:r>
           <w:rPr>
             <w:rStyle w:val="a9"/>
@@ -922,7 +922,7 @@
           <w:rPr>
             <w:webHidden/>
           </w:rPr>
-          <w:instrText xml:space="preserve"> PAGEREF _Toc242478579 \h </w:instrText>
+          <w:instrText xml:space="preserve"> PAGEREF _Toc242479062 \h </w:instrText>
         </w:r>
         <w:r>
           <w:rPr>
@@ -939,7 +939,7 @@
           <w:rPr>
             <w:webHidden/>
           </w:rPr>
-          <w:t>3</w:t>
+          <w:t>4</w:t>
         </w:r>
         <w:r>
           <w:rPr>
@@ -961,7 +961,7 @@
           <w14:ligatures w14:val="standardContextual"/>
         </w:rPr>
       </w:pPr>
-      <w:hyperlink w:anchor="_Toc242478580" w:history="1">
+      <w:hyperlink w:anchor="_Toc242479063" w:history="1">
         <w:r>
           <w:rPr>
             <w:rStyle w:val="a9"/>
@@ -1001,7 +1001,7 @@
           <w:rPr>
             <w:webHidden/>
           </w:rPr>
-          <w:instrText xml:space="preserve"> PAGEREF _Toc242478580 \h </w:instrText>
+          <w:instrText xml:space="preserve"> PAGEREF _Toc242479063 \h </w:instrText>
         </w:r>
         <w:r>
           <w:rPr>
@@ -1018,7 +1018,7 @@
           <w:rPr>
             <w:webHidden/>
           </w:rPr>
-          <w:t>3</w:t>
+          <w:t>4</w:t>
         </w:r>
         <w:r>
           <w:rPr>
@@ -1040,7 +1040,7 @@
           <w14:ligatures w14:val="standardContextual"/>
         </w:rPr>
       </w:pPr>
-      <w:hyperlink w:anchor="_Toc242478581" w:history="1">
+      <w:hyperlink w:anchor="_Toc242479064" w:history="1">
         <w:r>
           <w:rPr>
             <w:rStyle w:val="a9"/>
@@ -1080,7 +1080,7 @@
           <w:rPr>
             <w:webHidden/>
           </w:rPr>
-          <w:instrText xml:space="preserve"> PAGEREF _Toc242478581 \h </w:instrText>
+          <w:instrText xml:space="preserve"> PAGEREF _Toc242479064 \h </w:instrText>
         </w:r>
         <w:r>
           <w:rPr>
@@ -1097,7 +1097,7 @@
           <w:rPr>
             <w:webHidden/>
           </w:rPr>
-          <w:t>3</w:t>
+          <w:t>4</w:t>
         </w:r>
         <w:r>
           <w:rPr>
@@ -1119,7 +1119,7 @@
           <w14:ligatures w14:val="standardContextual"/>
         </w:rPr>
       </w:pPr>
-      <w:hyperlink w:anchor="_Toc242478582" w:history="1">
+      <w:hyperlink w:anchor="_Toc242479065" w:history="1">
         <w:r>
           <w:rPr>
             <w:rStyle w:val="a9"/>
@@ -1159,7 +1159,7 @@
           <w:rPr>
             <w:webHidden/>
           </w:rPr>
-          <w:instrText xml:space="preserve"> PAGEREF _Toc242478582 \h </w:instrText>
+          <w:instrText xml:space="preserve"> PAGEREF _Toc242479065 \h </w:instrText>
         </w:r>
         <w:r>
           <w:rPr>
@@ -1176,7 +1176,7 @@
           <w:rPr>
             <w:webHidden/>
           </w:rPr>
-          <w:t>4</w:t>
+          <w:t>5</w:t>
         </w:r>
         <w:r>
           <w:rPr>
@@ -1198,7 +1198,7 @@
           <w14:ligatures w14:val="standardContextual"/>
         </w:rPr>
       </w:pPr>
-      <w:hyperlink w:anchor="_Toc242478583" w:history="1">
+      <w:hyperlink w:anchor="_Toc242479066" w:history="1">
         <w:r>
           <w:rPr>
             <w:rStyle w:val="a9"/>
@@ -1238,7 +1238,7 @@
           <w:rPr>
             <w:webHidden/>
           </w:rPr>
-          <w:instrText xml:space="preserve"> PAGEREF _Toc242478583 \h </w:instrText>
+          <w:instrText xml:space="preserve"> PAGEREF _Toc242479066 \h </w:instrText>
         </w:r>
         <w:r>
           <w:rPr>
@@ -1255,7 +1255,7 @@
           <w:rPr>
             <w:webHidden/>
           </w:rPr>
-          <w:t>4</w:t>
+          <w:t>5</w:t>
         </w:r>
         <w:r>
           <w:rPr>
@@ -1277,7 +1277,7 @@
           <w14:ligatures w14:val="standardContextual"/>
         </w:rPr>
       </w:pPr>
-      <w:hyperlink w:anchor="_Toc242478584" w:history="1">
+      <w:hyperlink w:anchor="_Toc242479067" w:history="1">
         <w:r>
           <w:rPr>
             <w:rStyle w:val="a9"/>
@@ -1317,7 +1317,7 @@
           <w:rPr>
             <w:webHidden/>
           </w:rPr>
-          <w:instrText xml:space="preserve"> PAGEREF _Toc242478584 \h </w:instrText>
+          <w:instrText xml:space="preserve"> PAGEREF _Toc242479067 \h </w:instrText>
         </w:r>
         <w:r>
           <w:rPr>
@@ -1334,7 +1334,7 @@
           <w:rPr>
             <w:webHidden/>
           </w:rPr>
-          <w:t>4</w:t>
+          <w:t>5</w:t>
         </w:r>
         <w:r>
           <w:rPr>
@@ -1356,7 +1356,7 @@
           <w14:ligatures w14:val="standardContextual"/>
         </w:rPr>
       </w:pPr>
-      <w:hyperlink w:anchor="_Toc242478585" w:history="1">
+      <w:hyperlink w:anchor="_Toc242479068" w:history="1">
         <w:r>
           <w:rPr>
             <w:rStyle w:val="a9"/>
@@ -1396,7 +1396,7 @@
           <w:rPr>
             <w:webHidden/>
           </w:rPr>
-          <w:instrText xml:space="preserve"> PAGEREF _Toc242478585 \h </w:instrText>
+          <w:instrText xml:space="preserve"> PAGEREF _Toc242479068 \h </w:instrText>
         </w:r>
         <w:r>
           <w:rPr>
@@ -1413,7 +1413,7 @@
           <w:rPr>
             <w:webHidden/>
           </w:rPr>
-          <w:t>4</w:t>
+          <w:t>5</w:t>
         </w:r>
         <w:r>
           <w:rPr>
@@ -1435,7 +1435,7 @@
           <w14:ligatures w14:val="standardContextual"/>
         </w:rPr>
       </w:pPr>
-      <w:hyperlink w:anchor="_Toc242478586" w:history="1">
+      <w:hyperlink w:anchor="_Toc242479069" w:history="1">
         <w:r>
           <w:rPr>
             <w:rStyle w:val="a9"/>
@@ -1475,7 +1475,7 @@
           <w:rPr>
             <w:webHidden/>
           </w:rPr>
-          <w:instrText xml:space="preserve"> PAGEREF _Toc242478586 \h </w:instrText>
+          <w:instrText xml:space="preserve"> PAGEREF _Toc242479069 \h </w:instrText>
         </w:r>
         <w:r>
           <w:rPr>
@@ -1492,7 +1492,7 @@
           <w:rPr>
             <w:webHidden/>
           </w:rPr>
-          <w:t>4</w:t>
+          <w:t>5</w:t>
         </w:r>
         <w:r>
           <w:rPr>
@@ -1514,7 +1514,7 @@
           <w14:ligatures w14:val="standardContextual"/>
         </w:rPr>
       </w:pPr>
-      <w:hyperlink w:anchor="_Toc242478587" w:history="1">
+      <w:hyperlink w:anchor="_Toc242479070" w:history="1">
         <w:r>
           <w:rPr>
             <w:rStyle w:val="a9"/>
@@ -1554,7 +1554,7 @@
           <w:rPr>
             <w:webHidden/>
           </w:rPr>
-          <w:instrText xml:space="preserve"> PAGEREF _Toc242478587 \h </w:instrText>
+          <w:instrText xml:space="preserve"> PAGEREF _Toc242479070 \h </w:instrText>
         </w:r>
         <w:r>
           <w:rPr>
@@ -1571,7 +1571,7 @@
           <w:rPr>
             <w:webHidden/>
           </w:rPr>
-          <w:t>5</w:t>
+          <w:t>6</w:t>
         </w:r>
         <w:r>
           <w:rPr>
@@ -1593,7 +1593,7 @@
           <w14:ligatures w14:val="standardContextual"/>
         </w:rPr>
       </w:pPr>
-      <w:hyperlink w:anchor="_Toc242478588" w:history="1">
+      <w:hyperlink w:anchor="_Toc242479071" w:history="1">
         <w:r>
           <w:rPr>
             <w:rStyle w:val="a9"/>
@@ -1633,7 +1633,7 @@
           <w:rPr>
             <w:webHidden/>
           </w:rPr>
-          <w:instrText xml:space="preserve"> PAGEREF _Toc242478588 \h </w:instrText>
+          <w:instrText xml:space="preserve"> PAGEREF _Toc242479071 \h </w:instrText>
         </w:r>
         <w:r>
           <w:rPr>
@@ -1650,7 +1650,7 @@
           <w:rPr>
             <w:webHidden/>
           </w:rPr>
-          <w:t>5</w:t>
+          <w:t>6</w:t>
         </w:r>
         <w:r>
           <w:rPr>
@@ -1672,7 +1672,7 @@
           <w14:ligatures w14:val="standardContextual"/>
         </w:rPr>
       </w:pPr>
-      <w:hyperlink w:anchor="_Toc242478589" w:history="1">
+      <w:hyperlink w:anchor="_Toc242479072" w:history="1">
         <w:r>
           <w:rPr>
             <w:rStyle w:val="a9"/>
@@ -1712,7 +1712,7 @@
           <w:rPr>
             <w:webHidden/>
           </w:rPr>
-          <w:instrText xml:space="preserve"> PAGEREF _Toc242478589 \h </w:instrText>
+          <w:instrText xml:space="preserve"> PAGEREF _Toc242479072 \h </w:instrText>
         </w:r>
         <w:r>
           <w:rPr>
@@ -1729,7 +1729,7 @@
           <w:rPr>
             <w:webHidden/>
           </w:rPr>
-          <w:t>5</w:t>
+          <w:t>6</w:t>
         </w:r>
         <w:r>
           <w:rPr>
@@ -1751,7 +1751,7 @@
           <w14:ligatures w14:val="standardContextual"/>
         </w:rPr>
       </w:pPr>
-      <w:hyperlink w:anchor="_Toc242478590" w:history="1">
+      <w:hyperlink w:anchor="_Toc242479073" w:history="1">
         <w:r>
           <w:rPr>
             <w:rStyle w:val="a9"/>
@@ -1791,7 +1791,7 @@
           <w:rPr>
             <w:webHidden/>
           </w:rPr>
-          <w:instrText xml:space="preserve"> PAGEREF _Toc242478590 \h </w:instrText>
+          <w:instrText xml:space="preserve"> PAGEREF _Toc242479073 \h </w:instrText>
         </w:r>
         <w:r>
           <w:rPr>
@@ -1808,7 +1808,7 @@
           <w:rPr>
             <w:webHidden/>
           </w:rPr>
-          <w:t>5</w:t>
+          <w:t>6</w:t>
         </w:r>
         <w:r>
           <w:rPr>
@@ -1830,7 +1830,7 @@
           <w14:ligatures w14:val="standardContextual"/>
         </w:rPr>
       </w:pPr>
-      <w:hyperlink w:anchor="_Toc242478591" w:history="1">
+      <w:hyperlink w:anchor="_Toc242479074" w:history="1">
         <w:r>
           <w:rPr>
             <w:rStyle w:val="a9"/>
@@ -1870,7 +1870,7 @@
           <w:rPr>
             <w:webHidden/>
           </w:rPr>
-          <w:instrText xml:space="preserve"> PAGEREF _Toc242478591 \h </w:instrText>
+          <w:instrText xml:space="preserve"> PAGEREF _Toc242479074 \h </w:instrText>
         </w:r>
         <w:r>
           <w:rPr>
@@ -1887,7 +1887,7 @@
           <w:rPr>
             <w:webHidden/>
           </w:rPr>
-          <w:t>5</w:t>
+          <w:t>6</w:t>
         </w:r>
         <w:r>
           <w:rPr>
@@ -1909,7 +1909,7 @@
           <w14:ligatures w14:val="standardContextual"/>
         </w:rPr>
       </w:pPr>
-      <w:hyperlink w:anchor="_Toc242478592" w:history="1">
+      <w:hyperlink w:anchor="_Toc242479075" w:history="1">
         <w:r>
           <w:rPr>
             <w:rStyle w:val="a9"/>
@@ -1949,7 +1949,7 @@
           <w:rPr>
             <w:webHidden/>
           </w:rPr>
-          <w:instrText xml:space="preserve"> PAGEREF _Toc242478592 \h </w:instrText>
+          <w:instrText xml:space="preserve"> PAGEREF _Toc242479075 \h </w:instrText>
         </w:r>
         <w:r>
           <w:rPr>
@@ -1966,7 +1966,7 @@
           <w:rPr>
             <w:webHidden/>
           </w:rPr>
-          <w:t>5</w:t>
+          <w:t>7</w:t>
         </w:r>
         <w:r>
           <w:rPr>
@@ -1992,7 +1992,7 @@
           <w14:ligatures w14:val="standardContextual"/>
         </w:rPr>
       </w:pPr>
-      <w:hyperlink w:anchor="_Toc242478593" w:history="1">
+      <w:hyperlink w:anchor="_Toc242479076" w:history="1">
         <w:r>
           <w:rPr>
             <w:rStyle w:val="a9"/>
@@ -2041,7 +2041,7 @@
             <w:noProof/>
             <w:webHidden/>
           </w:rPr>
-          <w:instrText xml:space="preserve"> PAGEREF _Toc242478593 \h </w:instrText>
+          <w:instrText xml:space="preserve"> PAGEREF _Toc242479076 \h </w:instrText>
         </w:r>
         <w:r>
           <w:rPr>
@@ -2061,7 +2061,7 @@
             <w:noProof/>
             <w:webHidden/>
           </w:rPr>
-          <w:t>6</w:t>
+          <w:t>7</w:t>
         </w:r>
         <w:r>
           <w:rPr>
@@ -2084,7 +2084,7 @@
           <w14:ligatures w14:val="standardContextual"/>
         </w:rPr>
       </w:pPr>
-      <w:hyperlink w:anchor="_Toc242478594" w:history="1">
+      <w:hyperlink w:anchor="_Toc242479077" w:history="1">
         <w:r>
           <w:rPr>
             <w:rStyle w:val="a9"/>
@@ -2124,7 +2124,7 @@
           <w:rPr>
             <w:webHidden/>
           </w:rPr>
-          <w:instrText xml:space="preserve"> PAGEREF _Toc242478594 \h </w:instrText>
+          <w:instrText xml:space="preserve"> PAGEREF _Toc242479077 \h </w:instrText>
         </w:r>
         <w:r>
           <w:rPr>
@@ -2141,7 +2141,7 @@
           <w:rPr>
             <w:webHidden/>
           </w:rPr>
-          <w:t>6</w:t>
+          <w:t>7</w:t>
         </w:r>
         <w:r>
           <w:rPr>
@@ -2163,7 +2163,7 @@
           <w14:ligatures w14:val="standardContextual"/>
         </w:rPr>
       </w:pPr>
-      <w:hyperlink w:anchor="_Toc242478595" w:history="1">
+      <w:hyperlink w:anchor="_Toc242479078" w:history="1">
         <w:r>
           <w:rPr>
             <w:rStyle w:val="a9"/>
@@ -2203,7 +2203,7 @@
           <w:rPr>
             <w:webHidden/>
           </w:rPr>
-          <w:instrText xml:space="preserve"> PAGEREF _Toc242478595 \h </w:instrText>
+          <w:instrText xml:space="preserve"> PAGEREF _Toc242479078 \h </w:instrText>
         </w:r>
         <w:r>
           <w:rPr>
@@ -2220,7 +2220,7 @@
           <w:rPr>
             <w:webHidden/>
           </w:rPr>
-          <w:t>6</w:t>
+          <w:t>7</w:t>
         </w:r>
         <w:r>
           <w:rPr>
@@ -2242,7 +2242,7 @@
           <w14:ligatures w14:val="standardContextual"/>
         </w:rPr>
       </w:pPr>
-      <w:hyperlink w:anchor="_Toc242478596" w:history="1">
+      <w:hyperlink w:anchor="_Toc242479079" w:history="1">
         <w:r>
           <w:rPr>
             <w:rStyle w:val="a9"/>
@@ -2282,7 +2282,7 @@
           <w:rPr>
             <w:webHidden/>
           </w:rPr>
-          <w:instrText xml:space="preserve"> PAGEREF _Toc242478596 \h </w:instrText>
+          <w:instrText xml:space="preserve"> PAGEREF _Toc242479079 \h </w:instrText>
         </w:r>
         <w:r>
           <w:rPr>
@@ -2299,7 +2299,7 @@
           <w:rPr>
             <w:webHidden/>
           </w:rPr>
-          <w:t>6</w:t>
+          <w:t>8</w:t>
         </w:r>
         <w:r>
           <w:rPr>
@@ -2321,7 +2321,7 @@
           <w14:ligatures w14:val="standardContextual"/>
         </w:rPr>
       </w:pPr>
-      <w:hyperlink w:anchor="_Toc242478597" w:history="1">
+      <w:hyperlink w:anchor="_Toc242479080" w:history="1">
         <w:r>
           <w:rPr>
             <w:rStyle w:val="a9"/>
@@ -2361,7 +2361,7 @@
           <w:rPr>
             <w:webHidden/>
           </w:rPr>
-          <w:instrText xml:space="preserve"> PAGEREF _Toc242478597 \h </w:instrText>
+          <w:instrText xml:space="preserve"> PAGEREF _Toc242479080 \h </w:instrText>
         </w:r>
         <w:r>
           <w:rPr>
@@ -2378,7 +2378,7 @@
           <w:rPr>
             <w:webHidden/>
           </w:rPr>
-          <w:t>6</w:t>
+          <w:t>8</w:t>
         </w:r>
         <w:r>
           <w:rPr>
@@ -2404,7 +2404,7 @@
           <w14:ligatures w14:val="standardContextual"/>
         </w:rPr>
       </w:pPr>
-      <w:hyperlink w:anchor="_Toc242478598" w:history="1">
+      <w:hyperlink w:anchor="_Toc242479081" w:history="1">
         <w:r>
           <w:rPr>
             <w:rStyle w:val="a9"/>
@@ -2453,7 +2453,7 @@
             <w:noProof/>
             <w:webHidden/>
           </w:rPr>
-          <w:instrText xml:space="preserve"> PAGEREF _Toc242478598 \h </w:instrText>
+          <w:instrText xml:space="preserve"> PAGEREF _Toc242479081 \h </w:instrText>
         </w:r>
         <w:r>
           <w:rPr>
@@ -2473,7 +2473,7 @@
             <w:noProof/>
             <w:webHidden/>
           </w:rPr>
-          <w:t>6</w:t>
+          <w:t>8</w:t>
         </w:r>
         <w:r>
           <w:rPr>
@@ -2496,7 +2496,7 @@
           <w14:ligatures w14:val="standardContextual"/>
         </w:rPr>
       </w:pPr>
-      <w:hyperlink w:anchor="_Toc242478599" w:history="1">
+      <w:hyperlink w:anchor="_Toc242479082" w:history="1">
         <w:r>
           <w:rPr>
             <w:rStyle w:val="a9"/>
@@ -2536,7 +2536,7 @@
           <w:rPr>
             <w:webHidden/>
           </w:rPr>
-          <w:instrText xml:space="preserve"> PAGEREF _Toc242478599 \h </w:instrText>
+          <w:instrText xml:space="preserve"> PAGEREF _Toc242479082 \h </w:instrText>
         </w:r>
         <w:r>
           <w:rPr>
@@ -2553,7 +2553,7 @@
           <w:rPr>
             <w:webHidden/>
           </w:rPr>
-          <w:t>6</w:t>
+          <w:t>8</w:t>
         </w:r>
         <w:r>
           <w:rPr>
@@ -2575,7 +2575,7 @@
           <w14:ligatures w14:val="standardContextual"/>
         </w:rPr>
       </w:pPr>
-      <w:hyperlink w:anchor="_Toc242478600" w:history="1">
+      <w:hyperlink w:anchor="_Toc242479083" w:history="1">
         <w:r>
           <w:rPr>
             <w:rStyle w:val="a9"/>
@@ -2615,7 +2615,7 @@
           <w:rPr>
             <w:webHidden/>
           </w:rPr>
-          <w:instrText xml:space="preserve"> PAGEREF _Toc242478600 \h </w:instrText>
+          <w:instrText xml:space="preserve"> PAGEREF _Toc242479083 \h </w:instrText>
         </w:r>
         <w:r>
           <w:rPr>
@@ -2632,7 +2632,7 @@
           <w:rPr>
             <w:webHidden/>
           </w:rPr>
-          <w:t>7</w:t>
+          <w:t>9</w:t>
         </w:r>
         <w:r>
           <w:rPr>
@@ -2654,7 +2654,7 @@
           <w14:ligatures w14:val="standardContextual"/>
         </w:rPr>
       </w:pPr>
-      <w:hyperlink w:anchor="_Toc242478601" w:history="1">
+      <w:hyperlink w:anchor="_Toc242479084" w:history="1">
         <w:r>
           <w:rPr>
             <w:rStyle w:val="a9"/>
@@ -2694,7 +2694,7 @@
           <w:rPr>
             <w:webHidden/>
           </w:rPr>
-          <w:instrText xml:space="preserve"> PAGEREF _Toc242478601 \h </w:instrText>
+          <w:instrText xml:space="preserve"> PAGEREF _Toc242479084 \h </w:instrText>
         </w:r>
         <w:r>
           <w:rPr>
@@ -2711,7 +2711,7 @@
           <w:rPr>
             <w:webHidden/>
           </w:rPr>
-          <w:t>7</w:t>
+          <w:t>9</w:t>
         </w:r>
         <w:r>
           <w:rPr>
@@ -2737,7 +2737,7 @@
           <w14:ligatures w14:val="standardContextual"/>
         </w:rPr>
       </w:pPr>
-      <w:hyperlink w:anchor="_Toc242478602" w:history="1">
+      <w:hyperlink w:anchor="_Toc242479085" w:history="1">
         <w:r>
           <w:rPr>
             <w:rStyle w:val="a9"/>
@@ -2786,7 +2786,7 @@
             <w:noProof/>
             <w:webHidden/>
           </w:rPr>
-          <w:instrText xml:space="preserve"> PAGEREF _Toc242478602 \h </w:instrText>
+          <w:instrText xml:space="preserve"> PAGEREF _Toc242479085 \h </w:instrText>
         </w:r>
         <w:r>
           <w:rPr>
@@ -2806,7 +2806,7 @@
             <w:noProof/>
             <w:webHidden/>
           </w:rPr>
-          <w:t>7</w:t>
+          <w:t>9</w:t>
         </w:r>
         <w:r>
           <w:rPr>
@@ -2829,7 +2829,7 @@
           <w14:ligatures w14:val="standardContextual"/>
         </w:rPr>
       </w:pPr>
-      <w:hyperlink w:anchor="_Toc242478603" w:history="1">
+      <w:hyperlink w:anchor="_Toc242479086" w:history="1">
         <w:r>
           <w:rPr>
             <w:rStyle w:val="a9"/>
@@ -2869,7 +2869,7 @@
           <w:rPr>
             <w:webHidden/>
           </w:rPr>
-          <w:instrText xml:space="preserve"> PAGEREF _Toc242478603 \h </w:instrText>
+          <w:instrText xml:space="preserve"> PAGEREF _Toc242479086 \h </w:instrText>
         </w:r>
         <w:r>
           <w:rPr>
@@ -2886,7 +2886,7 @@
           <w:rPr>
             <w:webHidden/>
           </w:rPr>
-          <w:t>7</w:t>
+          <w:t>9</w:t>
         </w:r>
         <w:r>
           <w:rPr>
@@ -2908,7 +2908,7 @@
           <w14:ligatures w14:val="standardContextual"/>
         </w:rPr>
       </w:pPr>
-      <w:hyperlink w:anchor="_Toc242478604" w:history="1">
+      <w:hyperlink w:anchor="_Toc242479087" w:history="1">
         <w:r>
           <w:rPr>
             <w:rStyle w:val="a9"/>
@@ -2948,7 +2948,7 @@
           <w:rPr>
             <w:webHidden/>
           </w:rPr>
-          <w:instrText xml:space="preserve"> PAGEREF _Toc242478604 \h </w:instrText>
+          <w:instrText xml:space="preserve"> PAGEREF _Toc242479087 \h </w:instrText>
         </w:r>
         <w:r>
           <w:rPr>
@@ -2965,7 +2965,7 @@
           <w:rPr>
             <w:webHidden/>
           </w:rPr>
-          <w:t>8</w:t>
+          <w:t>10</w:t>
         </w:r>
         <w:r>
           <w:rPr>
@@ -2987,7 +2987,7 @@
           <w14:ligatures w14:val="standardContextual"/>
         </w:rPr>
       </w:pPr>
-      <w:hyperlink w:anchor="_Toc242478605" w:history="1">
+      <w:hyperlink w:anchor="_Toc242479088" w:history="1">
         <w:r>
           <w:rPr>
             <w:rStyle w:val="a9"/>
@@ -3027,7 +3027,7 @@
           <w:rPr>
             <w:webHidden/>
           </w:rPr>
-          <w:instrText xml:space="preserve"> PAGEREF _Toc242478605 \h </w:instrText>
+          <w:instrText xml:space="preserve"> PAGEREF _Toc242479088 \h </w:instrText>
         </w:r>
         <w:r>
           <w:rPr>
@@ -3044,7 +3044,7 @@
           <w:rPr>
             <w:webHidden/>
           </w:rPr>
-          <w:t>8</w:t>
+          <w:t>10</w:t>
         </w:r>
         <w:r>
           <w:rPr>
@@ -3066,7 +3066,7 @@
           <w14:ligatures w14:val="standardContextual"/>
         </w:rPr>
       </w:pPr>
-      <w:hyperlink w:anchor="_Toc242478606" w:history="1">
+      <w:hyperlink w:anchor="_Toc242479089" w:history="1">
         <w:r>
           <w:rPr>
             <w:rStyle w:val="a9"/>
@@ -3106,7 +3106,7 @@
           <w:rPr>
             <w:webHidden/>
           </w:rPr>
-          <w:instrText xml:space="preserve"> PAGEREF _Toc242478606 \h </w:instrText>
+          <w:instrText xml:space="preserve"> PAGEREF _Toc242479089 \h </w:instrText>
         </w:r>
         <w:r>
           <w:rPr>
@@ -3123,7 +3123,7 @@
           <w:rPr>
             <w:webHidden/>
           </w:rPr>
-          <w:t>8</w:t>
+          <w:t>10</w:t>
         </w:r>
         <w:r>
           <w:rPr>
@@ -3145,7 +3145,7 @@
           <w14:ligatures w14:val="standardContextual"/>
         </w:rPr>
       </w:pPr>
-      <w:hyperlink w:anchor="_Toc242478607" w:history="1">
+      <w:hyperlink w:anchor="_Toc242479090" w:history="1">
         <w:r>
           <w:rPr>
             <w:rStyle w:val="a9"/>
@@ -3185,7 +3185,7 @@
           <w:rPr>
             <w:webHidden/>
           </w:rPr>
-          <w:instrText xml:space="preserve"> PAGEREF _Toc242478607 \h </w:instrText>
+          <w:instrText xml:space="preserve"> PAGEREF _Toc242479090 \h </w:instrText>
         </w:r>
         <w:r>
           <w:rPr>
@@ -3202,7 +3202,7 @@
           <w:rPr>
             <w:webHidden/>
           </w:rPr>
-          <w:t>8</w:t>
+          <w:t>11</w:t>
         </w:r>
         <w:r>
           <w:rPr>
@@ -3228,7 +3228,7 @@
           <w14:ligatures w14:val="standardContextual"/>
         </w:rPr>
       </w:pPr>
-      <w:hyperlink w:anchor="_Toc242478608" w:history="1">
+      <w:hyperlink w:anchor="_Toc242479091" w:history="1">
         <w:r>
           <w:rPr>
             <w:rStyle w:val="a9"/>
@@ -3277,7 +3277,7 @@
             <w:noProof/>
             <w:webHidden/>
           </w:rPr>
-          <w:instrText xml:space="preserve"> PAGEREF _Toc242478608 \h </w:instrText>
+          <w:instrText xml:space="preserve"> PAGEREF _Toc242479091 \h </w:instrText>
         </w:r>
         <w:r>
           <w:rPr>
@@ -3297,7 +3297,7 @@
             <w:noProof/>
             <w:webHidden/>
           </w:rPr>
-          <w:t>9</w:t>
+          <w:t>11</w:t>
         </w:r>
         <w:r>
           <w:rPr>
@@ -3324,7 +3324,7 @@
           <w14:ligatures w14:val="standardContextual"/>
         </w:rPr>
       </w:pPr>
-      <w:hyperlink w:anchor="_Toc242478609" w:history="1">
+      <w:hyperlink w:anchor="_Toc242479092" w:history="1">
         <w:r>
           <w:rPr>
             <w:rStyle w:val="a9"/>
@@ -3351,7 +3351,7 @@
             <w:noProof/>
             <w:webHidden/>
           </w:rPr>
-          <w:instrText xml:space="preserve"> PAGEREF _Toc242478609 \h </w:instrText>
+          <w:instrText xml:space="preserve"> PAGEREF _Toc242479092 \h </w:instrText>
         </w:r>
         <w:r>
           <w:rPr>
@@ -3371,7 +3371,7 @@
             <w:noProof/>
             <w:webHidden/>
           </w:rPr>
-          <w:t>10</w:t>
+          <w:t>12</w:t>
         </w:r>
         <w:r>
           <w:rPr>
@@ -3394,7 +3394,7 @@
           <w14:ligatures w14:val="standardContextual"/>
         </w:rPr>
       </w:pPr>
-      <w:hyperlink w:anchor="_Toc242478610" w:history="1">
+      <w:hyperlink w:anchor="_Toc242479093" w:history="1">
         <w:r>
           <w:rPr>
             <w:rStyle w:val="a9"/>
@@ -3417,7 +3417,7 @@
           <w:rPr>
             <w:webHidden/>
           </w:rPr>
-          <w:instrText xml:space="preserve"> PAGEREF _Toc242478610 \h </w:instrText>
+          <w:instrText xml:space="preserve"> PAGEREF _Toc242479093 \h </w:instrText>
         </w:r>
         <w:r>
           <w:rPr>
@@ -3434,7 +3434,7 @@
           <w:rPr>
             <w:webHidden/>
           </w:rPr>
-          <w:t>10</w:t>
+          <w:t>12</w:t>
         </w:r>
         <w:r>
           <w:rPr>
@@ -3456,7 +3456,7 @@
           <w14:ligatures w14:val="standardContextual"/>
         </w:rPr>
       </w:pPr>
-      <w:hyperlink w:anchor="_Toc242478611" w:history="1">
+      <w:hyperlink w:anchor="_Toc242479094" w:history="1">
         <w:r>
           <w:rPr>
             <w:rStyle w:val="a9"/>
@@ -3479,7 +3479,7 @@
           <w:rPr>
             <w:webHidden/>
           </w:rPr>
-          <w:instrText xml:space="preserve"> PAGEREF _Toc242478611 \h </w:instrText>
+          <w:instrText xml:space="preserve"> PAGEREF _Toc242479094 \h </w:instrText>
         </w:r>
         <w:r>
           <w:rPr>
@@ -3496,7 +3496,7 @@
           <w:rPr>
             <w:webHidden/>
           </w:rPr>
-          <w:t>18</w:t>
+          <w:t>20</w:t>
         </w:r>
         <w:r>
           <w:rPr>
@@ -3518,7 +3518,7 @@
           <w14:ligatures w14:val="standardContextual"/>
         </w:rPr>
       </w:pPr>
-      <w:hyperlink w:anchor="_Toc242478612" w:history="1">
+      <w:hyperlink w:anchor="_Toc242479095" w:history="1">
         <w:r>
           <w:rPr>
             <w:rStyle w:val="a9"/>
@@ -3541,7 +3541,7 @@
           <w:rPr>
             <w:webHidden/>
           </w:rPr>
-          <w:instrText xml:space="preserve"> PAGEREF _Toc242478612 \h </w:instrText>
+          <w:instrText xml:space="preserve"> PAGEREF _Toc242479095 \h </w:instrText>
         </w:r>
         <w:r>
           <w:rPr>
@@ -3558,7 +3558,7 @@
           <w:rPr>
             <w:webHidden/>
           </w:rPr>
-          <w:t>21</w:t>
+          <w:t>23</w:t>
         </w:r>
         <w:r>
           <w:rPr>
@@ -3580,7 +3580,7 @@
           <w14:ligatures w14:val="standardContextual"/>
         </w:rPr>
       </w:pPr>
-      <w:hyperlink w:anchor="_Toc242478613" w:history="1">
+      <w:hyperlink w:anchor="_Toc242479096" w:history="1">
         <w:r>
           <w:rPr>
             <w:rStyle w:val="a9"/>
@@ -3603,7 +3603,7 @@
           <w:rPr>
             <w:webHidden/>
           </w:rPr>
-          <w:instrText xml:space="preserve"> PAGEREF _Toc242478613 \h </w:instrText>
+          <w:instrText xml:space="preserve"> PAGEREF _Toc242479096 \h </w:instrText>
         </w:r>
         <w:r>
           <w:rPr>
@@ -3620,7 +3620,7 @@
           <w:rPr>
             <w:webHidden/>
           </w:rPr>
-          <w:t>22</w:t>
+          <w:t>24</w:t>
         </w:r>
         <w:r>
           <w:rPr>
@@ -3646,7 +3646,7 @@
           <w14:ligatures w14:val="standardContextual"/>
         </w:rPr>
       </w:pPr>
-      <w:hyperlink w:anchor="_Toc242478614" w:history="1">
+      <w:hyperlink w:anchor="_Toc242479097" w:history="1">
         <w:r>
           <w:rPr>
             <w:rStyle w:val="a9"/>
@@ -3673,7 +3673,7 @@
             <w:noProof/>
             <w:webHidden/>
           </w:rPr>
-          <w:instrText xml:space="preserve"> PAGEREF _Toc242478614 \h </w:instrText>
+          <w:instrText xml:space="preserve"> PAGEREF _Toc242479097 \h </w:instrText>
         </w:r>
         <w:r>
           <w:rPr>
@@ -3693,7 +3693,7 @@
             <w:noProof/>
             <w:webHidden/>
           </w:rPr>
-          <w:t>26</w:t>
+          <w:t>28</w:t>
         </w:r>
         <w:r>
           <w:rPr>
@@ -3720,7 +3720,7 @@
           <w14:ligatures w14:val="standardContextual"/>
         </w:rPr>
       </w:pPr>
-      <w:hyperlink w:anchor="_Toc242478615" w:history="1">
+      <w:hyperlink w:anchor="_Toc242479098" w:history="1">
         <w:r>
           <w:rPr>
             <w:rStyle w:val="a9"/>
@@ -3747,7 +3747,7 @@
             <w:noProof/>
             <w:webHidden/>
           </w:rPr>
-          <w:instrText xml:space="preserve"> PAGEREF _Toc242478615 \h </w:instrText>
+          <w:instrText xml:space="preserve"> PAGEREF _Toc242479098 \h </w:instrText>
         </w:r>
         <w:r>
           <w:rPr>
@@ -3767,7 +3767,7 @@
             <w:noProof/>
             <w:webHidden/>
           </w:rPr>
-          <w:t>26</w:t>
+          <w:t>28</w:t>
         </w:r>
         <w:r>
           <w:rPr>
@@ -3815,18 +3815,10 @@
     <w:p>
       <w:pPr>
         <w:pStyle w:val="1"/>
-        <w:rPr>
-          <w:sz w:val="22"/>
-          <w:szCs w:val="22"/>
-        </w:rPr>
       </w:pPr>
       <w:bookmarkStart w:id="1" w:name="sec_1"/>
-      <w:bookmarkStart w:id="2" w:name="_Toc242478573"/>
-      <w:r>
-        <w:rPr>
-          <w:sz w:val="24"/>
-          <w:szCs w:val="24"/>
-        </w:rPr>
+      <w:bookmarkStart w:id="2" w:name="_Toc242479056"/>
+      <w:r>
         <w:lastRenderedPageBreak/>
         <w:t>Progress &amp; Achievements</w:t>
       </w:r>
@@ -3836,49 +3828,28 @@
     <w:p>
       <w:pPr>
         <w:pStyle w:val="ReportNormal"/>
-        <w:rPr>
-          <w:sz w:val="18"/>
-          <w:szCs w:val="18"/>
-        </w:rPr>
-      </w:pPr>
-      <w:r>
-        <w:rPr>
-          <w:sz w:val="20"/>
-          <w:szCs w:val="20"/>
-        </w:rPr>
+      </w:pPr>
+      <w:r>
         <w:t xml:space="preserve">This report records team CS-57's progress at the start of Week 9 (8 October 2026). It concentrates on what has been done </w:t>
       </w:r>
       <w:r>
         <w:rPr>
           <w:b/>
           <w:bCs/>
-          <w:sz w:val="20"/>
-          <w:szCs w:val="20"/>
         </w:rPr>
         <w:t>since our Week 5 proposal</w:t>
       </w:r>
       <w:r>
-        <w:rPr>
-          <w:sz w:val="20"/>
-          <w:szCs w:val="20"/>
-        </w:rPr>
         <w:t>, that is, in the four sprints from 7 September to 7 October, and on the plan to the end of semester. Section 1 starts from the people who use the platform and follows each of their needs through the tickets and sprints that met it, then describes the front end, the back end and the data, and shows that the minimum viable product works. Section 2 covers the obstacles met, sprint by sprint, and the risks ahead; Section 3 where the timeline has moved and why; Section 4 the updated plan, milestones and reporting. Section 5 acknowledges the use of AI tools, Appendix A collects every figure and table, and each reference to one links to it; Appendix B explains the identifiers used throughout. Unless stated otherwise, every statement about the software refers to the main branch of the team's GitHub repository (USYD-CS-Capstone/hej) at commit 1dcbcdf of 7 October 2026.</w:t>
       </w:r>
     </w:p>
     <w:p>
       <w:pPr>
         <w:pStyle w:val="2"/>
-        <w:rPr>
-          <w:sz w:val="18"/>
-          <w:szCs w:val="18"/>
-        </w:rPr>
       </w:pPr>
       <w:bookmarkStart w:id="3" w:name="sec_1_1"/>
-      <w:bookmarkStart w:id="4" w:name="_Toc242478574"/>
-      <w:r>
-        <w:rPr>
-          <w:sz w:val="20"/>
-        </w:rPr>
+      <w:bookmarkStart w:id="4" w:name="_Toc242479057"/>
+      <w:r>
         <w:t>The project in brief</w:t>
       </w:r>
       <w:bookmarkEnd w:id="3"/>
@@ -3887,397 +3858,213 @@
     <w:p>
       <w:pPr>
         <w:pStyle w:val="ReportNormal"/>
-        <w:rPr>
-          <w:sz w:val="18"/>
-          <w:szCs w:val="18"/>
-        </w:rPr>
-      </w:pPr>
-      <w:r>
-        <w:rPr>
-          <w:sz w:val="20"/>
-          <w:szCs w:val="20"/>
-        </w:rPr>
+      </w:pPr>
+      <w:r>
         <w:t>Human Evaluation and Judgement (</w:t>
       </w:r>
       <w:r>
-        <w:rPr>
-          <w:sz w:val="20"/>
-          <w:szCs w:val="20"/>
-        </w:rPr>
         <w:t>Hej</w:t>
       </w:r>
       <w:r>
-        <w:rPr>
-          <w:sz w:val="20"/>
-          <w:szCs w:val="20"/>
-        </w:rPr>
         <w:t>)</w:t>
       </w:r>
       <w:r>
-        <w:rPr>
-          <w:sz w:val="20"/>
-          <w:szCs w:val="20"/>
-        </w:rPr>
         <w:t xml:space="preserve"> is Arc Intelligence's platform for producing labelled datasets for AI. </w:t>
       </w:r>
       <w:r>
-        <w:rPr>
-          <w:sz w:val="20"/>
-          <w:szCs w:val="20"/>
-        </w:rPr>
         <w:t>Its core workflow is that annotators label items (for example, assigning a topic to a news headline), reviewers accept or reject that work, and an expert settles disagreements.</w:t>
       </w:r>
       <w:r>
-        <w:rPr>
-          <w:sz w:val="20"/>
-          <w:szCs w:val="20"/>
-        </w:rPr>
         <w:t xml:space="preserve"> </w:t>
       </w:r>
       <w:hyperlink w:anchor="sec_1_3" w:history="1">
         <w:r>
           <w:rPr>
             <w:rStyle w:val="a9"/>
-            <w:sz w:val="20"/>
-            <w:szCs w:val="20"/>
           </w:rPr>
           <w:t>Section 1.3</w:t>
         </w:r>
       </w:hyperlink>
       <w:r>
-        <w:rPr>
-          <w:sz w:val="20"/>
-          <w:szCs w:val="20"/>
-        </w:rPr>
         <w:t xml:space="preserve"> describes the other users and the features they rely on.</w:t>
       </w:r>
       <w:r>
-        <w:rPr>
-          <w:sz w:val="20"/>
-          <w:szCs w:val="20"/>
-        </w:rPr>
         <w:t xml:space="preserve"> </w:t>
       </w:r>
       <w:r>
-        <w:rPr>
-          <w:sz w:val="20"/>
-          <w:szCs w:val="20"/>
-        </w:rPr>
         <w:t>The team inherited a working but immature codebase: a Next.js</w:t>
       </w:r>
       <w:r>
-        <w:rPr>
-          <w:sz w:val="20"/>
-          <w:szCs w:val="20"/>
-        </w:rPr>
         <w:t xml:space="preserve"> web application and a </w:t>
       </w:r>
       <w:bookmarkStart w:id="5" w:name="_Int_3yHXeuHC"/>
       <w:r>
-        <w:rPr>
-          <w:sz w:val="20"/>
-          <w:szCs w:val="20"/>
-        </w:rPr>
         <w:t>FastAPI</w:t>
       </w:r>
       <w:bookmarkEnd w:id="5"/>
       <w:r>
-        <w:rPr>
-          <w:sz w:val="20"/>
-          <w:szCs w:val="20"/>
-        </w:rPr>
         <w:t xml:space="preserve"> service with a relational database</w:t>
       </w:r>
       <w:r>
-        <w:rPr>
-          <w:sz w:val="20"/>
-          <w:szCs w:val="20"/>
-        </w:rPr>
         <w:t>.</w:t>
       </w:r>
       <w:r>
-        <w:rPr>
-          <w:sz w:val="20"/>
-          <w:szCs w:val="20"/>
-        </w:rPr>
         <w:t xml:space="preserve"> </w:t>
       </w:r>
       <w:r>
-        <w:rPr>
-          <w:sz w:val="20"/>
-          <w:szCs w:val="20"/>
-        </w:rPr>
         <w:t xml:space="preserve">From the </w:t>
       </w:r>
       <w:r>
-        <w:rPr>
-          <w:sz w:val="20"/>
-          <w:szCs w:val="20"/>
-        </w:rPr>
         <w:t>kick-off</w:t>
       </w:r>
       <w:r>
-        <w:rPr>
-          <w:sz w:val="20"/>
-          <w:szCs w:val="20"/>
-        </w:rPr>
         <w:t xml:space="preserve"> meeting with the client, </w:t>
       </w:r>
       <w:r>
-        <w:rPr>
-          <w:sz w:val="20"/>
-          <w:szCs w:val="20"/>
-        </w:rPr>
         <w:t>it was clear that the key to success is making the dataset’s provenance complete and defensible, rather than making labelling faster.</w:t>
       </w:r>
       <w:r>
-        <w:rPr>
-          <w:sz w:val="20"/>
-          <w:szCs w:val="20"/>
-        </w:rPr>
         <w:t xml:space="preserve"> This means f</w:t>
       </w:r>
       <w:r>
-        <w:rPr>
-          <w:sz w:val="20"/>
-          <w:szCs w:val="20"/>
-        </w:rPr>
         <w:t>or every item in a released dataset</w:t>
       </w:r>
       <w:r>
-        <w:rPr>
-          <w:sz w:val="20"/>
-          <w:szCs w:val="20"/>
-        </w:rPr>
         <w:t>,</w:t>
       </w:r>
       <w:r>
-        <w:rPr>
-          <w:sz w:val="20"/>
-          <w:szCs w:val="20"/>
-        </w:rPr>
         <w:t xml:space="preserve"> the platform must be able to answer </w:t>
       </w:r>
       <w:r>
         <w:rPr>
           <w:i/>
           <w:iCs/>
-          <w:sz w:val="20"/>
-          <w:szCs w:val="20"/>
         </w:rPr>
         <w:t>how did this label get here</w:t>
       </w:r>
       <w:r>
-        <w:rPr>
-          <w:sz w:val="20"/>
-          <w:szCs w:val="20"/>
-        </w:rPr>
         <w:t xml:space="preserve">: who annotated it, what the AI suggested and whether the person accepted it, who reviewed it, how any disagreement was settled and under which guideline. It must also refuse to release data that cannot answer. </w:t>
       </w:r>
     </w:p>
     <w:p>
       <w:pPr>
         <w:pStyle w:val="ReportNormal"/>
-        <w:rPr>
-          <w:sz w:val="18"/>
-          <w:szCs w:val="18"/>
-        </w:rPr>
-      </w:pPr>
-      <w:r>
-        <w:rPr>
-          <w:sz w:val="20"/>
-          <w:szCs w:val="20"/>
-        </w:rPr>
+      </w:pPr>
+      <w:r>
         <w:t>The client’s brief groups the required features into six pillars, which the team uses to organise its work:</w:t>
       </w:r>
       <w:r>
-        <w:rPr>
-          <w:sz w:val="20"/>
-          <w:szCs w:val="20"/>
-        </w:rPr>
         <w:t xml:space="preserve"> </w:t>
       </w:r>
       <w:r>
         <w:rPr>
           <w:b/>
           <w:bCs/>
-          <w:sz w:val="20"/>
-          <w:szCs w:val="20"/>
         </w:rPr>
         <w:t>Govern</w:t>
       </w:r>
       <w:r>
-        <w:rPr>
-          <w:sz w:val="20"/>
-          <w:szCs w:val="20"/>
-        </w:rPr>
         <w:t xml:space="preserve"> (</w:t>
       </w:r>
       <w:r>
-        <w:rPr>
-          <w:sz w:val="20"/>
-          <w:szCs w:val="20"/>
-        </w:rPr>
         <w:t xml:space="preserve">organisation management, </w:t>
       </w:r>
       <w:r>
-        <w:rPr>
-          <w:sz w:val="20"/>
-          <w:szCs w:val="20"/>
-        </w:rPr>
         <w:t xml:space="preserve">roles and policies), </w:t>
       </w:r>
       <w:r>
         <w:rPr>
           <w:b/>
           <w:bCs/>
-          <w:sz w:val="20"/>
-          <w:szCs w:val="20"/>
         </w:rPr>
         <w:t>Assist</w:t>
       </w:r>
       <w:r>
-        <w:rPr>
-          <w:sz w:val="20"/>
-          <w:szCs w:val="20"/>
-        </w:rPr>
         <w:t xml:space="preserve"> (AI suggestions), </w:t>
       </w:r>
       <w:r>
         <w:rPr>
           <w:b/>
           <w:bCs/>
-          <w:sz w:val="20"/>
-          <w:szCs w:val="20"/>
         </w:rPr>
         <w:t>Record</w:t>
       </w:r>
       <w:r>
-        <w:rPr>
-          <w:sz w:val="20"/>
-          <w:szCs w:val="20"/>
-        </w:rPr>
         <w:t xml:space="preserve"> (provenance), </w:t>
       </w:r>
       <w:r>
         <w:rPr>
           <w:b/>
           <w:bCs/>
-          <w:sz w:val="20"/>
-          <w:szCs w:val="20"/>
         </w:rPr>
         <w:t>Adjudicate</w:t>
       </w:r>
       <w:r>
-        <w:rPr>
-          <w:sz w:val="20"/>
-          <w:szCs w:val="20"/>
-        </w:rPr>
         <w:t xml:space="preserve"> (review and disputes</w:t>
       </w:r>
       <w:r>
-        <w:rPr>
-          <w:sz w:val="20"/>
-          <w:szCs w:val="20"/>
-        </w:rPr>
         <w:t xml:space="preserve"> handling</w:t>
       </w:r>
       <w:r>
-        <w:rPr>
-          <w:sz w:val="20"/>
-          <w:szCs w:val="20"/>
-        </w:rPr>
         <w:t xml:space="preserve">), </w:t>
       </w:r>
       <w:r>
         <w:rPr>
           <w:b/>
           <w:bCs/>
-          <w:sz w:val="20"/>
-          <w:szCs w:val="20"/>
         </w:rPr>
         <w:t>Release</w:t>
       </w:r>
       <w:r>
-        <w:rPr>
-          <w:sz w:val="20"/>
-          <w:szCs w:val="20"/>
-        </w:rPr>
         <w:t xml:space="preserve"> (gated, immutable releases) and </w:t>
       </w:r>
       <w:r>
         <w:rPr>
           <w:b/>
           <w:bCs/>
-          <w:sz w:val="20"/>
-          <w:szCs w:val="20"/>
         </w:rPr>
         <w:t>Evaluate</w:t>
       </w:r>
       <w:r>
-        <w:rPr>
-          <w:sz w:val="20"/>
-          <w:szCs w:val="20"/>
-        </w:rPr>
-        <w:t xml:space="preserve"> (repeatable measurement). Text annotation is the committed demonstration path; image, audio and video must keep working but are not extended.</w:t>
+        <w:t xml:space="preserve"> (repeatable </w:t>
+      </w:r>
+      <w:r>
+        <w:lastRenderedPageBreak/>
+        <w:t>measurement). Text annotation is the committed demonstration path; image, audio and video must keep working but are not extended.</w:t>
       </w:r>
     </w:p>
     <w:p>
       <w:pPr>
         <w:pStyle w:val="ReportNormal"/>
-        <w:rPr>
-          <w:sz w:val="18"/>
-          <w:szCs w:val="18"/>
-        </w:rPr>
       </w:pPr>
       <w:r>
         <w:rPr>
           <w:b/>
           <w:bCs/>
-          <w:sz w:val="20"/>
-          <w:szCs w:val="20"/>
         </w:rPr>
         <w:t>How progress is measured.</w:t>
       </w:r>
       <w:r>
-        <w:rPr>
-          <w:sz w:val="20"/>
-          <w:szCs w:val="20"/>
-        </w:rPr>
         <w:t xml:space="preserve"> The scope is a backlog of user stories grouped into eleven epics, A to K (for example story D5, </w:t>
       </w:r>
       <w:r>
         <w:rPr>
           <w:i/>
           <w:iCs/>
-          <w:sz w:val="20"/>
-          <w:szCs w:val="20"/>
         </w:rPr>
         <w:t>finalised work cannot be overwritten</w:t>
       </w:r>
       <w:r>
-        <w:rPr>
-          <w:sz w:val="20"/>
-          <w:szCs w:val="20"/>
-        </w:rPr>
         <w:t>). Each story is broken into Jira tickets (SCRUM-n), and each ticket is delivered through a GitHub pull request (#n) that a team member other than the author reviews before it is merged. Work is estimated in units (u): one unit is two to three subtasks, and one Jira story point equals one unit. A story counts as complete only when it meets our Definition of Done: demonstrable in the running application, shipped with tests, any linked defect proven fixed by a test that fails on the old code, documentation updated, and reviewed by someone other than its author.</w:t>
       </w:r>
     </w:p>
     <w:p>
       <w:pPr>
         <w:pStyle w:val="2"/>
-        <w:rPr>
-          <w:sz w:val="18"/>
-          <w:szCs w:val="18"/>
-        </w:rPr>
       </w:pPr>
       <w:bookmarkStart w:id="6" w:name="sec_1_2"/>
-      <w:bookmarkStart w:id="7" w:name="_Toc242478575"/>
-      <w:r>
-        <w:rPr>
-          <w:sz w:val="20"/>
-        </w:rPr>
-        <w:lastRenderedPageBreak/>
+      <w:bookmarkStart w:id="7" w:name="_Toc242479058"/>
+      <w:r>
         <w:t>Summary: are we on track?</w:t>
       </w:r>
       <w:bookmarkEnd w:id="6"/>
@@ -4286,224 +4073,135 @@
     <w:p>
       <w:pPr>
         <w:pStyle w:val="ReportNormal"/>
-        <w:rPr>
-          <w:sz w:val="18"/>
-          <w:szCs w:val="18"/>
-        </w:rPr>
-      </w:pPr>
-      <w:r>
-        <w:rPr>
-          <w:sz w:val="20"/>
-          <w:szCs w:val="20"/>
-        </w:rPr>
+      </w:pPr>
+      <w:r>
         <w:t>In short, yes for the end-of-semester deliverables, with one critical path that needs watching:</w:t>
       </w:r>
     </w:p>
     <w:p>
       <w:pPr>
         <w:pStyle w:val="PhDBullet"/>
-        <w:rPr>
-          <w:sz w:val="18"/>
-          <w:szCs w:val="18"/>
-        </w:rPr>
       </w:pPr>
       <w:r>
         <w:rPr>
           <w:b/>
           <w:bCs/>
-          <w:sz w:val="20"/>
-          <w:szCs w:val="20"/>
         </w:rPr>
         <w:t>The MVP is complete, tested and working.</w:t>
       </w:r>
       <w:r>
-        <w:rPr>
-          <w:sz w:val="20"/>
-          <w:szCs w:val="20"/>
-        </w:rPr>
         <w:t xml:space="preserve"> The core workflow agreed with the client at Status Check 1 runs end to end on the client's text data, from inviting members to exporting finalised items, and is covered by automated and end-to-end tests that all pass on main (</w:t>
       </w:r>
       <w:hyperlink w:anchor="sec_1_8" w:history="1">
         <w:r>
           <w:rPr>
             <w:rStyle w:val="a9"/>
-            <w:sz w:val="20"/>
-            <w:szCs w:val="20"/>
           </w:rPr>
           <w:t>Section 1.8</w:t>
         </w:r>
       </w:hyperlink>
       <w:r>
-        <w:rPr>
-          <w:sz w:val="20"/>
-          <w:szCs w:val="20"/>
-        </w:rPr>
         <w:t>).</w:t>
       </w:r>
     </w:p>
     <w:p>
       <w:pPr>
         <w:pStyle w:val="PhDBullet"/>
-        <w:rPr>
-          <w:sz w:val="18"/>
-          <w:szCs w:val="18"/>
-        </w:rPr>
       </w:pPr>
       <w:r>
         <w:rPr>
           <w:b/>
           <w:bCs/>
-          <w:sz w:val="20"/>
-          <w:szCs w:val="20"/>
         </w:rPr>
         <w:t>On schedule overall.</w:t>
       </w:r>
       <w:r>
-        <w:rPr>
-          <w:sz w:val="20"/>
-          <w:szCs w:val="20"/>
-        </w:rPr>
         <w:t xml:space="preserve"> Build work ends on 28 October (Week 11) as planned; the remaining days go to the technical report, decision records and demonstration. No proposal deliverable has been dropped.</w:t>
       </w:r>
     </w:p>
     <w:p>
       <w:pPr>
         <w:pStyle w:val="PhDBullet"/>
-        <w:rPr>
-          <w:sz w:val="18"/>
-          <w:szCs w:val="18"/>
-        </w:rPr>
       </w:pPr>
       <w:r>
         <w:rPr>
           <w:b/>
           <w:bCs/>
-          <w:sz w:val="20"/>
-          <w:szCs w:val="20"/>
         </w:rPr>
         <w:t>Ahead of plan:</w:t>
       </w:r>
       <w:r>
-        <w:rPr>
-          <w:sz w:val="20"/>
-          <w:szCs w:val="20"/>
-        </w:rPr>
         <w:t xml:space="preserve"> the core annotation workflow, AI assistance and governance started one to two weeks earlier than the proposal scheduled, on top of engineering foundations delivered on time (</w:t>
       </w:r>
       <w:hyperlink w:anchor="sec_3_2" w:history="1">
         <w:r>
           <w:rPr>
             <w:rStyle w:val="a9"/>
-            <w:sz w:val="20"/>
-            <w:szCs w:val="20"/>
           </w:rPr>
           <w:t>Section 3.2</w:t>
         </w:r>
       </w:hyperlink>
       <w:r>
-        <w:rPr>
-          <w:sz w:val="20"/>
-          <w:szCs w:val="20"/>
-        </w:rPr>
         <w:t>).</w:t>
       </w:r>
     </w:p>
     <w:p>
       <w:pPr>
         <w:pStyle w:val="PhDBullet"/>
-        <w:rPr>
-          <w:sz w:val="18"/>
-          <w:szCs w:val="18"/>
-        </w:rPr>
       </w:pPr>
       <w:r>
         <w:rPr>
           <w:b/>
           <w:bCs/>
-          <w:sz w:val="20"/>
-          <w:szCs w:val="20"/>
         </w:rPr>
         <w:t>About one week behind plan, and protected:</w:t>
       </w:r>
       <w:r>
-        <w:rPr>
-          <w:sz w:val="20"/>
-          <w:szCs w:val="20"/>
-        </w:rPr>
         <w:t xml:space="preserve"> provenance and release, which extend the MVP to the full brief. This is the critical path; the replan of 1 October moved the provenance record from Week 11 to Week 9 so the release gate can be built on it (</w:t>
       </w:r>
       <w:hyperlink w:anchor="sec_3_3" w:history="1">
         <w:r>
           <w:rPr>
             <w:rStyle w:val="a9"/>
-            <w:sz w:val="20"/>
-            <w:szCs w:val="20"/>
           </w:rPr>
           <w:t>Sections 3.3</w:t>
         </w:r>
       </w:hyperlink>
       <w:r>
-        <w:rPr>
-          <w:sz w:val="20"/>
-          <w:szCs w:val="20"/>
-        </w:rPr>
         <w:t xml:space="preserve"> and 4.2</w:t>
       </w:r>
       <w:r>
-        <w:rPr>
-          <w:sz w:val="20"/>
-          <w:szCs w:val="20"/>
-        </w:rPr>
         <w:t>).</w:t>
       </w:r>
     </w:p>
     <w:p>
       <w:pPr>
         <w:pStyle w:val="PhDBullet"/>
-        <w:rPr>
-          <w:sz w:val="18"/>
-          <w:szCs w:val="18"/>
-        </w:rPr>
       </w:pPr>
       <w:r>
         <w:rPr>
           <w:b/>
           <w:bCs/>
-          <w:sz w:val="20"/>
-          <w:szCs w:val="20"/>
         </w:rPr>
         <w:t>Recovered:</w:t>
       </w:r>
       <w:r>
-        <w:rPr>
-          <w:sz w:val="20"/>
-          <w:szCs w:val="20"/>
-        </w:rPr>
         <w:t xml:space="preserve"> evaluation was at zero at Status Check 2 (23 September); the harness is now merged and the casebook is in progress.</w:t>
       </w:r>
     </w:p>
     <w:p>
       <w:pPr>
         <w:pStyle w:val="PhDBullet"/>
-        <w:rPr>
-          <w:sz w:val="18"/>
-          <w:szCs w:val="18"/>
-        </w:rPr>
       </w:pPr>
       <w:r>
         <w:rPr>
           <w:b/>
           <w:bCs/>
-          <w:sz w:val="20"/>
-          <w:szCs w:val="20"/>
         </w:rPr>
+        <w:lastRenderedPageBreak/>
         <w:t>Unblocked:</w:t>
       </w:r>
       <w:r>
-        <w:rPr>
-          <w:sz w:val="20"/>
-          <w:szCs w:val="20"/>
-        </w:rPr>
         <w:t xml:space="preserve"> the dispute record (stories E3/E4) was paused from 3 to 9 October on an open product question; it now follows the team’s two-level proposal, and PR #48 is approved to merge in Week 9 (obstacle O4, risk R2).</w:t>
       </w:r>
     </w:p>
@@ -4518,17 +4216,10 @@
     <w:p>
       <w:pPr>
         <w:pStyle w:val="2"/>
-        <w:rPr>
-          <w:sz w:val="18"/>
-          <w:szCs w:val="18"/>
-        </w:rPr>
       </w:pPr>
       <w:bookmarkStart w:id="8" w:name="sec_1_3"/>
-      <w:bookmarkStart w:id="9" w:name="_Toc242478576"/>
-      <w:r>
-        <w:rPr>
-          <w:sz w:val="20"/>
-        </w:rPr>
+      <w:bookmarkStart w:id="9" w:name="_Toc242479059"/>
+      <w:r>
         <w:t>Who the platform is for</w:t>
       </w:r>
       <w:bookmarkEnd w:id="8"/>
@@ -4537,51 +4228,29 @@
     <w:p>
       <w:pPr>
         <w:pStyle w:val="ReportNormal"/>
-        <w:rPr>
-          <w:sz w:val="18"/>
-          <w:szCs w:val="18"/>
-        </w:rPr>
-      </w:pPr>
-      <w:r>
-        <w:rPr>
-          <w:sz w:val="20"/>
-          <w:szCs w:val="20"/>
-        </w:rPr>
+      </w:pPr>
+      <w:r>
         <w:t>Hej serves seven types of user inside a client organisation (</w:t>
       </w:r>
       <w:hyperlink w:anchor="table_2" w:history="1">
         <w:r>
           <w:rPr>
             <w:rStyle w:val="a9"/>
-            <w:sz w:val="20"/>
-            <w:szCs w:val="20"/>
           </w:rPr>
           <w:t>Table 2</w:t>
         </w:r>
       </w:hyperlink>
       <w:r>
-        <w:rPr>
-          <w:sz w:val="20"/>
-          <w:szCs w:val="20"/>
-        </w:rPr>
         <w:t>). Each holds one or more roles, and every action they take is checked on the server against those roles. The client, Arc Intelligence, owns the platform and decides product questions; it is a stakeholder rather than a user. Every story in the backlog serves at least one of these users, and the rest of Section 1 follows their needs.</w:t>
       </w:r>
     </w:p>
     <w:p>
       <w:pPr>
         <w:pStyle w:val="2"/>
-        <w:rPr>
-          <w:sz w:val="18"/>
-          <w:szCs w:val="18"/>
-        </w:rPr>
       </w:pPr>
       <w:bookmarkStart w:id="10" w:name="sec_1_4"/>
-      <w:bookmarkStart w:id="11" w:name="_Toc242478577"/>
-      <w:r>
-        <w:rPr>
-          <w:sz w:val="20"/>
-        </w:rPr>
-        <w:lastRenderedPageBreak/>
+      <w:bookmarkStart w:id="11" w:name="_Toc242479060"/>
+      <w:r>
         <w:t>From user needs to sprints</w:t>
       </w:r>
       <w:bookmarkEnd w:id="10"/>
@@ -4590,132 +4259,69 @@
     <w:p>
       <w:pPr>
         <w:pStyle w:val="ReportNormal"/>
-        <w:rPr>
-          <w:sz w:val="18"/>
-          <w:szCs w:val="18"/>
-        </w:rPr>
       </w:pPr>
       <w:hyperlink w:anchor="table_3" w:history="1">
         <w:r>
           <w:rPr>
             <w:rStyle w:val="a9"/>
-            <w:sz w:val="20"/>
-            <w:szCs w:val="20"/>
           </w:rPr>
           <w:t>Table 3</w:t>
         </w:r>
       </w:hyperlink>
       <w:r>
-        <w:rPr>
-          <w:sz w:val="20"/>
-          <w:szCs w:val="20"/>
-        </w:rPr>
         <w:t xml:space="preserve"> shows how each user type’s needs (columns 1 and 2) translate into user stories (column 3) and the corresponding back-end and front-end work (columns 4 and 5). </w:t>
       </w:r>
       <w:hyperlink w:anchor="figure_1" w:history="1">
         <w:r>
           <w:rPr>
             <w:rStyle w:val="a9"/>
-            <w:sz w:val="20"/>
-            <w:szCs w:val="20"/>
           </w:rPr>
           <w:t>Figure 1</w:t>
         </w:r>
       </w:hyperlink>
       <w:r>
-        <w:rPr>
-          <w:sz w:val="20"/>
-          <w:szCs w:val="20"/>
-        </w:rPr>
         <w:t xml:space="preserve"> shows the same work </w:t>
       </w:r>
       <w:r>
-        <w:rPr>
-          <w:sz w:val="20"/>
-          <w:szCs w:val="20"/>
-        </w:rPr>
         <w:t>in a</w:t>
       </w:r>
       <w:r>
-        <w:rPr>
-          <w:sz w:val="20"/>
-          <w:szCs w:val="20"/>
-        </w:rPr>
         <w:t xml:space="preserve"> sprint calendar</w:t>
       </w:r>
       <w:r>
-        <w:rPr>
-          <w:sz w:val="20"/>
-          <w:szCs w:val="20"/>
-        </w:rPr>
         <w:t xml:space="preserve"> format</w:t>
       </w:r>
       <w:r>
-        <w:rPr>
-          <w:sz w:val="20"/>
-          <w:szCs w:val="20"/>
-        </w:rPr>
         <w:t xml:space="preserve">, one </w:t>
       </w:r>
       <w:r>
-        <w:rPr>
-          <w:sz w:val="20"/>
-          <w:szCs w:val="20"/>
-        </w:rPr>
         <w:t>swim lane</w:t>
       </w:r>
       <w:r>
-        <w:rPr>
-          <w:sz w:val="20"/>
-          <w:szCs w:val="20"/>
-        </w:rPr>
         <w:t xml:space="preserve"> per user</w:t>
       </w:r>
       <w:r>
-        <w:rPr>
-          <w:sz w:val="20"/>
-          <w:szCs w:val="20"/>
-        </w:rPr>
         <w:t xml:space="preserve"> type</w:t>
       </w:r>
       <w:r>
-        <w:rPr>
-          <w:sz w:val="20"/>
-          <w:szCs w:val="20"/>
-        </w:rPr>
         <w:t xml:space="preserve">. </w:t>
       </w:r>
     </w:p>
     <w:p>
       <w:pPr>
         <w:pStyle w:val="ReportNormal"/>
-        <w:rPr>
-          <w:sz w:val="18"/>
-          <w:szCs w:val="18"/>
-        </w:rPr>
-      </w:pPr>
-      <w:r>
-        <w:rPr>
-          <w:sz w:val="20"/>
-          <w:szCs w:val="20"/>
-        </w:rPr>
+      </w:pPr>
+      <w:r>
         <w:t>For example, an administrator needs to invite new users into an organisation (G5, J3). The team first fixed the inherited invitation API, where every acceptance failed because the endpoint read the wrong token field and invitations were stored as already accepted (SCRUM-8, #16, W7). The member-management screens were then built on it in the following sprint (SCRUM-90, #28, W8), and the client's rule that roles are chosen at invitation, with the invitee accepting on screen, followed in the break (SCRUM-115, #56). In general, the API and data model land first and the screens follow, which is why many user needs span two sprints.</w:t>
       </w:r>
     </w:p>
     <w:p>
       <w:pPr>
         <w:pStyle w:val="2"/>
-        <w:rPr>
-          <w:sz w:val="18"/>
-          <w:szCs w:val="18"/>
-        </w:rPr>
       </w:pPr>
       <w:bookmarkStart w:id="12" w:name="sec_1_5"/>
-      <w:bookmarkStart w:id="13" w:name="_Toc242478578"/>
-      <w:r>
-        <w:rPr>
-          <w:sz w:val="20"/>
-        </w:rPr>
+      <w:bookmarkStart w:id="13" w:name="_Toc242479061"/>
+      <w:r>
         <w:t>Sprint by sprint: what was built and what was solved</w:t>
       </w:r>
       <w:bookmarkEnd w:id="12"/>
@@ -4724,74 +4330,47 @@
     <w:p>
       <w:pPr>
         <w:pStyle w:val="ReportNormal"/>
-        <w:rPr>
-          <w:sz w:val="18"/>
-          <w:szCs w:val="18"/>
-        </w:rPr>
       </w:pPr>
       <w:hyperlink w:anchor="table_4" w:history="1">
         <w:r>
           <w:rPr>
             <w:rStyle w:val="a9"/>
-            <w:sz w:val="20"/>
-            <w:szCs w:val="20"/>
           </w:rPr>
           <w:t>Table 4</w:t>
         </w:r>
       </w:hyperlink>
       <w:r>
-        <w:rPr>
-          <w:sz w:val="20"/>
-          <w:szCs w:val="20"/>
-        </w:rPr>
-        <w:t xml:space="preserve"> reads the same work against our Jira sprints: each sprint's goal, its planned and completed load, what it built and the problems it solved. Many of those problems are defects from our audit of the inherited code </w:t>
-      </w:r>
-      <w:r>
-        <w:rPr>
-          <w:sz w:val="20"/>
-          <w:szCs w:val="20"/>
-        </w:rPr>
+        <w:t xml:space="preserve"> reads the same work against our Jira sprints: each sprint's goal, its planned and completed load, what it built and the problems it solved. Many of those </w:t>
+      </w:r>
+      <w:r>
+        <w:lastRenderedPageBreak/>
+        <w:t xml:space="preserve">problems are defects from our audit of the inherited code </w:t>
+      </w:r>
+      <w:r>
         <w:t>(numbered as in our audit of 30 inherited defects)</w:t>
       </w:r>
       <w:r>
-        <w:rPr>
-          <w:sz w:val="20"/>
-          <w:szCs w:val="20"/>
-        </w:rPr>
         <w:t xml:space="preserve">; others were found while building or reviewing. The challenges met inside each sprint are in </w:t>
       </w:r>
       <w:hyperlink w:anchor="sec_2_2" w:history="1">
         <w:r>
           <w:rPr>
             <w:rStyle w:val="a9"/>
-            <w:sz w:val="20"/>
-            <w:szCs w:val="20"/>
           </w:rPr>
           <w:t>Section 2.2</w:t>
         </w:r>
       </w:hyperlink>
       <w:r>
-        <w:rPr>
-          <w:sz w:val="20"/>
-          <w:szCs w:val="20"/>
-        </w:rPr>
         <w:t>.</w:t>
       </w:r>
     </w:p>
     <w:p>
       <w:pPr>
         <w:pStyle w:val="2"/>
-        <w:rPr>
-          <w:sz w:val="18"/>
-          <w:szCs w:val="18"/>
-        </w:rPr>
       </w:pPr>
       <w:bookmarkStart w:id="14" w:name="sec_1_6"/>
-      <w:bookmarkStart w:id="15" w:name="_Toc242478579"/>
-      <w:r>
-        <w:rPr>
-          <w:sz w:val="20"/>
-        </w:rPr>
+      <w:bookmarkStart w:id="15" w:name="_Toc242479062"/>
+      <w:r>
         <w:t>Front end: what each user can now do</w:t>
       </w:r>
       <w:bookmarkEnd w:id="14"/>
@@ -4800,34 +4379,18 @@
     <w:p>
       <w:pPr>
         <w:pStyle w:val="ReportNormal"/>
-        <w:rPr>
-          <w:sz w:val="18"/>
-          <w:szCs w:val="18"/>
-        </w:rPr>
-      </w:pPr>
-      <w:r>
-        <w:rPr>
-          <w:sz w:val="20"/>
-          <w:szCs w:val="20"/>
-        </w:rPr>
+      </w:pPr>
+      <w:r>
         <w:t>This section describes, user by user, what the web application now lets each person do and what we changed to support it. The screenshots were taken on 8 October from the main branch running locally, using the client's AG News text dataset: one project with two tasks, one annotated by two people per item and one given an AI first pass by a local Llama 3 model. Names such as Dana Lee, Frank Ng and Bob Johnson are seeded test accounts.</w:t>
       </w:r>
     </w:p>
     <w:p>
       <w:pPr>
         <w:pStyle w:val="3"/>
-        <w:rPr>
-          <w:sz w:val="18"/>
-          <w:szCs w:val="18"/>
-        </w:rPr>
       </w:pPr>
       <w:bookmarkStart w:id="16" w:name="sec_1_6_1"/>
-      <w:bookmarkStart w:id="17" w:name="_Toc242478580"/>
-      <w:r>
-        <w:rPr>
-          <w:sz w:val="20"/>
-          <w:szCs w:val="20"/>
-        </w:rPr>
+      <w:bookmarkStart w:id="17" w:name="_Toc242479063"/>
+      <w:r>
         <w:t>Administrator and invitee</w:t>
       </w:r>
       <w:bookmarkEnd w:id="16"/>
@@ -4836,191 +4399,89 @@
     <w:p>
       <w:pPr>
         <w:pStyle w:val="ReportNormal"/>
-        <w:rPr>
-          <w:sz w:val="18"/>
-          <w:szCs w:val="18"/>
-        </w:rPr>
-      </w:pPr>
-      <w:r>
-        <w:rPr>
-          <w:sz w:val="20"/>
-          <w:szCs w:val="20"/>
-        </w:rPr>
+      </w:pPr>
+      <w:r>
         <w:t>The members page (</w:t>
       </w:r>
       <w:hyperlink w:anchor="figure_2" w:history="1">
         <w:r>
           <w:rPr>
             <w:rStyle w:val="a9"/>
-            <w:sz w:val="20"/>
-            <w:szCs w:val="20"/>
           </w:rPr>
           <w:t>Figure 2</w:t>
         </w:r>
       </w:hyperlink>
       <w:r>
-        <w:rPr>
-          <w:sz w:val="20"/>
-          <w:szCs w:val="20"/>
-        </w:rPr>
         <w:t>) lists everyone in the organisation with their account status, membership status and roles</w:t>
       </w:r>
       <w:r>
-        <w:rPr>
-          <w:sz w:val="20"/>
-          <w:szCs w:val="20"/>
-        </w:rPr>
         <w:t>. The team has implemented the feature for</w:t>
       </w:r>
       <w:r>
-        <w:rPr>
-          <w:sz w:val="20"/>
-          <w:szCs w:val="20"/>
-        </w:rPr>
         <w:t xml:space="preserve"> the administrator</w:t>
       </w:r>
       <w:r>
-        <w:rPr>
-          <w:sz w:val="20"/>
-          <w:szCs w:val="20"/>
-        </w:rPr>
         <w:t xml:space="preserve"> to</w:t>
       </w:r>
       <w:r>
-        <w:rPr>
-          <w:sz w:val="20"/>
-          <w:szCs w:val="20"/>
-        </w:rPr>
         <w:t xml:space="preserve"> create users, </w:t>
       </w:r>
       <w:r>
-        <w:rPr>
-          <w:sz w:val="20"/>
-          <w:szCs w:val="20"/>
-        </w:rPr>
         <w:t xml:space="preserve">configure </w:t>
       </w:r>
       <w:r>
-        <w:rPr>
-          <w:sz w:val="20"/>
-          <w:szCs w:val="20"/>
-        </w:rPr>
         <w:t xml:space="preserve">roles and </w:t>
       </w:r>
       <w:r>
-        <w:rPr>
-          <w:sz w:val="20"/>
-          <w:szCs w:val="20"/>
-        </w:rPr>
         <w:t xml:space="preserve">account </w:t>
       </w:r>
       <w:r>
-        <w:rPr>
-          <w:sz w:val="20"/>
-          <w:szCs w:val="20"/>
-        </w:rPr>
         <w:t xml:space="preserve">status, and remove members (SCRUM-90, </w:t>
       </w:r>
       <w:r>
-        <w:rPr>
-          <w:sz w:val="20"/>
-          <w:szCs w:val="20"/>
-        </w:rPr>
         <w:t>PR</w:t>
       </w:r>
       <w:r>
-        <w:rPr>
-          <w:sz w:val="20"/>
-          <w:szCs w:val="20"/>
-        </w:rPr>
         <w:t xml:space="preserve">#28). </w:t>
       </w:r>
       <w:r>
-        <w:rPr>
-          <w:sz w:val="20"/>
-          <w:szCs w:val="20"/>
-        </w:rPr>
         <w:t>As a functional requirement communicated from the client, all invited users must have at least one role.</w:t>
       </w:r>
       <w:r>
-        <w:rPr>
-          <w:sz w:val="20"/>
-          <w:szCs w:val="20"/>
-        </w:rPr>
         <w:t xml:space="preserve"> </w:t>
       </w:r>
       <w:r>
-        <w:rPr>
-          <w:sz w:val="20"/>
-          <w:szCs w:val="20"/>
-        </w:rPr>
         <w:t>T</w:t>
       </w:r>
       <w:r>
-        <w:rPr>
-          <w:sz w:val="20"/>
-          <w:szCs w:val="20"/>
-        </w:rPr>
         <w:t xml:space="preserve">he invitee </w:t>
       </w:r>
       <w:r>
-        <w:rPr>
-          <w:sz w:val="20"/>
-          <w:szCs w:val="20"/>
-        </w:rPr>
         <w:t>would be able to view and accept</w:t>
       </w:r>
       <w:r>
-        <w:rPr>
-          <w:sz w:val="20"/>
-          <w:szCs w:val="20"/>
-        </w:rPr>
         <w:t xml:space="preserve"> pending invitation</w:t>
       </w:r>
       <w:r>
-        <w:rPr>
-          <w:sz w:val="20"/>
-          <w:szCs w:val="20"/>
-        </w:rPr>
         <w:t>s</w:t>
       </w:r>
       <w:r>
-        <w:rPr>
-          <w:sz w:val="20"/>
-          <w:szCs w:val="20"/>
-        </w:rPr>
         <w:t xml:space="preserve">, receiving exactly those roles (SCRUM-115, </w:t>
       </w:r>
       <w:r>
-        <w:rPr>
-          <w:sz w:val="20"/>
-          <w:szCs w:val="20"/>
-        </w:rPr>
         <w:t>PR</w:t>
       </w:r>
       <w:r>
-        <w:rPr>
-          <w:sz w:val="20"/>
-          <w:szCs w:val="20"/>
-        </w:rPr>
         <w:t>#56). Two front-end faults found in review were fixed on the way: reissuing an invitation could undo an acceptance, and switching organisation could let a late response overwrite the new organisation's data.</w:t>
       </w:r>
     </w:p>
     <w:p>
       <w:pPr>
         <w:pStyle w:val="3"/>
-        <w:rPr>
-          <w:sz w:val="18"/>
-          <w:szCs w:val="18"/>
-        </w:rPr>
       </w:pPr>
       <w:bookmarkStart w:id="18" w:name="sec_1_6_2"/>
-      <w:bookmarkStart w:id="19" w:name="_Toc242478581"/>
-      <w:r>
-        <w:rPr>
-          <w:sz w:val="20"/>
-          <w:szCs w:val="20"/>
-        </w:rPr>
+      <w:bookmarkStart w:id="19" w:name="_Toc242479064"/>
+      <w:r>
         <w:t>Project manager and task owner</w:t>
       </w:r>
       <w:bookmarkEnd w:id="18"/>
@@ -5029,91 +4490,50 @@
     <w:p>
       <w:pPr>
         <w:pStyle w:val="ReportNormal"/>
-        <w:rPr>
-          <w:sz w:val="18"/>
-          <w:szCs w:val="18"/>
-        </w:rPr>
-      </w:pPr>
-      <w:r>
-        <w:rPr>
-          <w:sz w:val="20"/>
-          <w:szCs w:val="20"/>
-        </w:rPr>
+      </w:pPr>
+      <w:r>
         <w:t>The policy page (</w:t>
       </w:r>
       <w:hyperlink w:anchor="figure_3" w:history="1">
         <w:r>
           <w:rPr>
             <w:rStyle w:val="a9"/>
-            <w:sz w:val="20"/>
-            <w:szCs w:val="20"/>
           </w:rPr>
           <w:t>Figure 3</w:t>
         </w:r>
       </w:hyperlink>
       <w:r>
-        <w:rPr>
-          <w:sz w:val="20"/>
-          <w:szCs w:val="20"/>
-        </w:rPr>
         <w:t xml:space="preserve">) shows the organisation's defaults and the project's own review policy, and marks which values are </w:t>
       </w:r>
       <w:r>
         <w:rPr>
           <w:i/>
           <w:iCs/>
-          <w:sz w:val="20"/>
-          <w:szCs w:val="20"/>
         </w:rPr>
         <w:t>Enforced</w:t>
       </w:r>
       <w:r>
-        <w:rPr>
-          <w:sz w:val="20"/>
-          <w:szCs w:val="20"/>
-        </w:rPr>
         <w:t xml:space="preserve">, meaning they already change what the workflow allows, and which are </w:t>
       </w:r>
       <w:r>
         <w:rPr>
           <w:i/>
           <w:iCs/>
-          <w:sz w:val="20"/>
-          <w:szCs w:val="20"/>
         </w:rPr>
         <w:t>Recorded</w:t>
       </w:r>
       <w:r>
-        <w:rPr>
-          <w:sz w:val="20"/>
-          <w:szCs w:val="20"/>
-        </w:rPr>
-        <w:t xml:space="preserve">, stored and shown until the story that enforces them lands, such as the Expert Gate (G2) in Week 10 (#25, #37). In task setup the owner now chooses the annotation surface, such as </w:t>
-      </w:r>
-      <w:r>
-        <w:rPr>
-          <w:sz w:val="20"/>
-          <w:szCs w:val="20"/>
-        </w:rPr>
-        <w:lastRenderedPageBreak/>
-        <w:t>classification or text spans, and the AI model (#36); defines labels with their meanings (#27); and uploads JSONL, JSON, CSV or text files, choosing per file which fields become the item that annotators and the AI see (#42). The task header carries activate, pause, resume and complete controls (#41); the AI run shows batch progress and each item's job status (#7, #32); and a finalised item can be reopened by the project owner with a reason (#46).</w:t>
+        <w:t>, stored and shown until the story that enforces them lands, such as the Expert Gate (G2) in Week 10 (#25, #37). In task setup the owner now chooses the annotation surface, such as classification or text spans, and the AI model (#36); defines labels with their meanings (#27); and uploads JSONL, JSON, CSV or text files, choosing per file which fields become the item that annotators and the AI see (#42). The task header carries activate, pause, resume and complete controls (#41); the AI run shows batch progress and each item's job status (#7, #32); and a finalised item can be reopened by the project owner with a reason (#46).</w:t>
       </w:r>
     </w:p>
     <w:p>
       <w:pPr>
         <w:pStyle w:val="3"/>
-        <w:rPr>
-          <w:sz w:val="18"/>
-          <w:szCs w:val="18"/>
-        </w:rPr>
       </w:pPr>
       <w:bookmarkStart w:id="20" w:name="sec_1_6_3"/>
-      <w:bookmarkStart w:id="21" w:name="_Toc242478582"/>
-      <w:r>
-        <w:rPr>
-          <w:sz w:val="20"/>
-          <w:szCs w:val="20"/>
-        </w:rPr>
+      <w:bookmarkStart w:id="21" w:name="_Toc242479065"/>
+      <w:r>
+        <w:lastRenderedPageBreak/>
         <w:t>Annotator</w:t>
       </w:r>
       <w:bookmarkEnd w:id="20"/>
@@ -5122,58 +4542,32 @@
     <w:p>
       <w:pPr>
         <w:pStyle w:val="ReportNormal"/>
-        <w:rPr>
-          <w:sz w:val="18"/>
-          <w:szCs w:val="18"/>
-        </w:rPr>
-      </w:pPr>
-      <w:r>
-        <w:rPr>
-          <w:sz w:val="20"/>
-          <w:szCs w:val="20"/>
-        </w:rPr>
+      </w:pPr>
+      <w:r>
         <w:t>The annotator's work list (</w:t>
       </w:r>
       <w:hyperlink w:anchor="figure_4" w:history="1">
         <w:r>
           <w:rPr>
             <w:rStyle w:val="a9"/>
-            <w:sz w:val="20"/>
-            <w:szCs w:val="20"/>
           </w:rPr>
           <w:t>Figure 4</w:t>
         </w:r>
       </w:hyperlink>
       <w:r>
-        <w:rPr>
-          <w:sz w:val="20"/>
-          <w:szCs w:val="20"/>
-        </w:rPr>
         <w:t xml:space="preserve">) shows only items their role allows and how many of the required human submissions each has. An item showing "2 of 2 submitted" has its Annotate button </w:t>
       </w:r>
       <w:r>
-        <w:rPr>
-          <w:sz w:val="20"/>
-          <w:szCs w:val="20"/>
-        </w:rPr>
         <w:t>greyed out, while one showing "0 of 2" is open for work (#49). Opening an item brings up the work panel, which no longer shows colleagues' drafts or answers, keeps edits on returned work instead of reverting them, and reports any refusal in the server's own words (#43). The Annotate and Review pages now load in about half a second rather than three (#54).</w:t>
       </w:r>
     </w:p>
     <w:p>
       <w:pPr>
         <w:pStyle w:val="3"/>
-        <w:rPr>
-          <w:sz w:val="18"/>
-          <w:szCs w:val="18"/>
-        </w:rPr>
       </w:pPr>
       <w:bookmarkStart w:id="22" w:name="sec_1_6_4"/>
-      <w:bookmarkStart w:id="23" w:name="_Toc242478583"/>
-      <w:r>
-        <w:rPr>
-          <w:sz w:val="20"/>
-          <w:szCs w:val="20"/>
-        </w:rPr>
+      <w:bookmarkStart w:id="23" w:name="_Toc242479066"/>
+      <w:r>
         <w:t>Reviewer</w:t>
       </w:r>
       <w:bookmarkEnd w:id="22"/>
@@ -5182,68 +4576,40 @@
     <w:p>
       <w:pPr>
         <w:pStyle w:val="ReportNormal"/>
-        <w:rPr>
-          <w:sz w:val="18"/>
-          <w:szCs w:val="18"/>
-        </w:rPr>
-      </w:pPr>
-      <w:r>
-        <w:rPr>
-          <w:sz w:val="20"/>
-          <w:szCs w:val="20"/>
-        </w:rPr>
+      </w:pPr>
+      <w:r>
         <w:t>The review panel (</w:t>
       </w:r>
       <w:hyperlink w:anchor="figure_5" w:history="1">
         <w:r>
           <w:rPr>
             <w:rStyle w:val="a9"/>
-            <w:sz w:val="20"/>
-            <w:szCs w:val="20"/>
           </w:rPr>
           <w:t>Figure 5</w:t>
         </w:r>
       </w:hyperlink>
       <w:r>
-        <w:rPr>
-          <w:sz w:val="20"/>
-          <w:szCs w:val="20"/>
-        </w:rPr>
         <w:t>) lists the submissions awaiting this reviewer on an item, by author, and the reviewer picks one; the decision is recorded against that submission only (#34, #44). The panel shows the task's review policy, which here requires one approval and a justification for every decision, and offers accept, adjust, reject and escalate. On an AI-assisted task the AI's answer arrives for review in the same panel, labelled as AI-assisted (</w:t>
       </w:r>
       <w:hyperlink w:anchor="figure_6" w:history="1">
         <w:r>
           <w:rPr>
             <w:rStyle w:val="a9"/>
-            <w:sz w:val="20"/>
-            <w:szCs w:val="20"/>
           </w:rPr>
           <w:t>Figure 6</w:t>
         </w:r>
       </w:hyperlink>
       <w:r>
-        <w:rPr>
-          <w:sz w:val="20"/>
-          <w:szCs w:val="20"/>
-        </w:rPr>
         <w:t>). A sampled share of submissions is shown to a second reviewer who cannot see the first decision until their own is in (#53).</w:t>
       </w:r>
     </w:p>
     <w:p>
       <w:pPr>
         <w:pStyle w:val="3"/>
-        <w:rPr>
-          <w:sz w:val="18"/>
-          <w:szCs w:val="18"/>
-        </w:rPr>
       </w:pPr>
       <w:bookmarkStart w:id="24" w:name="sec_1_6_5"/>
-      <w:bookmarkStart w:id="25" w:name="_Toc242478584"/>
-      <w:r>
-        <w:rPr>
-          <w:sz w:val="20"/>
-          <w:szCs w:val="20"/>
-        </w:rPr>
+      <w:bookmarkStart w:id="25" w:name="_Toc242479067"/>
+      <w:r>
         <w:t>Expert</w:t>
       </w:r>
       <w:bookmarkEnd w:id="24"/>
@@ -5252,67 +4618,40 @@
     <w:p>
       <w:pPr>
         <w:pStyle w:val="ReportNormal"/>
-        <w:rPr>
-          <w:sz w:val="18"/>
-          <w:szCs w:val="18"/>
-        </w:rPr>
-      </w:pPr>
-      <w:r>
-        <w:rPr>
-          <w:sz w:val="20"/>
-          <w:szCs w:val="20"/>
-        </w:rPr>
+      </w:pPr>
+      <w:r>
         <w:t>The dispute desk (</w:t>
       </w:r>
       <w:hyperlink w:anchor="figure_7" w:history="1">
         <w:r>
           <w:rPr>
             <w:rStyle w:val="a9"/>
-            <w:sz w:val="20"/>
-            <w:szCs w:val="20"/>
           </w:rPr>
           <w:t>Figure 7</w:t>
         </w:r>
       </w:hyperlink>
       <w:r>
-        <w:rPr>
-          <w:sz w:val="20"/>
-          <w:szCs w:val="20"/>
-        </w:rPr>
         <w:t>) lists items escalated to an expert, with the reviewer's reason, and records the expert's decision, either to finalise the item or to send it back to the annotator, together with a note. The server refuses the decision from anyone who annotated, reviewed or routed the item, administrators included (#45, #53). Once the expert rules, the item joins the task's finalised list (</w:t>
       </w:r>
       <w:hyperlink w:anchor="figure_8" w:history="1">
         <w:r>
           <w:rPr>
             <w:rStyle w:val="a9"/>
-            <w:sz w:val="20"/>
-            <w:szCs w:val="20"/>
           </w:rPr>
           <w:t>Figure 8</w:t>
         </w:r>
       </w:hyperlink>
       <w:r>
-        <w:rPr>
-          <w:sz w:val="20"/>
-          <w:szCs w:val="20"/>
-        </w:rPr>
         <w:t>) and can be exported. The client's refined three-outcome ruling and the dedicated dispute screens are Week 9–10 work.</w:t>
       </w:r>
     </w:p>
     <w:p>
       <w:pPr>
         <w:pStyle w:val="2"/>
-        <w:rPr>
-          <w:sz w:val="18"/>
-          <w:szCs w:val="18"/>
-        </w:rPr>
       </w:pPr>
       <w:bookmarkStart w:id="26" w:name="sec_1_7"/>
-      <w:bookmarkStart w:id="27" w:name="_Toc242478585"/>
-      <w:r>
-        <w:rPr>
-          <w:sz w:val="20"/>
-        </w:rPr>
+      <w:bookmarkStart w:id="27" w:name="_Toc242479068"/>
+      <w:r>
         <w:t>Back end and data</w:t>
       </w:r>
       <w:bookmarkEnd w:id="26"/>
@@ -5321,18 +4660,10 @@
     <w:p>
       <w:pPr>
         <w:pStyle w:val="3"/>
-        <w:rPr>
-          <w:sz w:val="18"/>
-          <w:szCs w:val="18"/>
-        </w:rPr>
       </w:pPr>
       <w:bookmarkStart w:id="28" w:name="sec_1_7_1"/>
-      <w:bookmarkStart w:id="29" w:name="_Toc242478586"/>
-      <w:r>
-        <w:rPr>
-          <w:sz w:val="20"/>
-          <w:szCs w:val="20"/>
-        </w:rPr>
+      <w:bookmarkStart w:id="29" w:name="_Toc242479069"/>
+      <w:r>
         <w:t>The dataset</w:t>
       </w:r>
       <w:bookmarkEnd w:id="28"/>
@@ -5341,116 +4672,73 @@
     <w:p>
       <w:pPr>
         <w:pStyle w:val="ReportNormal"/>
-        <w:rPr>
-          <w:sz w:val="18"/>
-          <w:szCs w:val="18"/>
-        </w:rPr>
-      </w:pPr>
-      <w:r>
-        <w:rPr>
-          <w:sz w:val="20"/>
-          <w:szCs w:val="20"/>
-        </w:rPr>
+      </w:pPr>
+      <w:r>
         <w:t>No new data is collected. The client supplied about 4 GB in four modalities (</w:t>
       </w:r>
       <w:hyperlink w:anchor="table_5" w:history="1">
         <w:r>
           <w:rPr>
             <w:rStyle w:val="a9"/>
-            <w:sz w:val="20"/>
-            <w:szCs w:val="20"/>
           </w:rPr>
           <w:t>Table 5</w:t>
         </w:r>
       </w:hyperlink>
       <w:r>
-        <w:rPr>
-          <w:sz w:val="20"/>
-          <w:szCs w:val="20"/>
-        </w:rPr>
         <w:t xml:space="preserve">), each a task-aligned subset: a </w:t>
       </w:r>
       <w:r>
         <w:rPr>
           <w:i/>
           <w:iCs/>
-          <w:sz w:val="20"/>
-          <w:szCs w:val="20"/>
         </w:rPr>
         <w:t>source</w:t>
       </w:r>
       <w:r>
-        <w:rPr>
-          <w:sz w:val="20"/>
-          <w:szCs w:val="20"/>
-        </w:rPr>
         <w:t xml:space="preserve"> folder with the records or media files, and a </w:t>
       </w:r>
       <w:r>
         <w:rPr>
           <w:i/>
           <w:iCs/>
-          <w:sz w:val="20"/>
-          <w:szCs w:val="20"/>
         </w:rPr>
         <w:t>handoff</w:t>
       </w:r>
       <w:r>
-        <w:rPr>
-          <w:sz w:val="20"/>
-          <w:szCs w:val="20"/>
-        </w:rPr>
         <w:t xml:space="preserve"> folder of JSON files describing the task and its label list. Text arrives </w:t>
       </w:r>
       <w:r>
         <w:rPr>
           <w:b/>
           <w:bCs/>
-          <w:sz w:val="20"/>
-          <w:szCs w:val="20"/>
         </w:rPr>
         <w:t>structured</w:t>
       </w:r>
       <w:r>
-        <w:rPr>
-          <w:sz w:val="20"/>
-          <w:szCs w:val="20"/>
-        </w:rPr>
         <w:t xml:space="preserve">, as JSONL records that each hold an identifier, the text and gold labels, while images, audio and video are </w:t>
       </w:r>
       <w:r>
         <w:rPr>
           <w:b/>
           <w:bCs/>
-          <w:sz w:val="20"/>
-          <w:szCs w:val="20"/>
         </w:rPr>
         <w:t>unstructured</w:t>
       </w:r>
       <w:r>
-        <w:rPr>
-          <w:sz w:val="20"/>
-          <w:szCs w:val="20"/>
-        </w:rPr>
-        <w:t xml:space="preserve"> media files. Raw client data is not copied into the database: items point to it through data pointers, which keeps the client's data where it lives.</w:t>
+        <w:t xml:space="preserve"> media files. Raw client data is not </w:t>
+      </w:r>
+      <w:r>
+        <w:lastRenderedPageBreak/>
+        <w:t>copied into the database: items point to it through data pointers, which keeps the client's data where it lives.</w:t>
       </w:r>
     </w:p>
     <w:p>
       <w:pPr>
         <w:pStyle w:val="3"/>
-        <w:rPr>
-          <w:sz w:val="18"/>
-          <w:szCs w:val="18"/>
-        </w:rPr>
       </w:pPr>
       <w:bookmarkStart w:id="30" w:name="sec_1_7_2"/>
-      <w:bookmarkStart w:id="31" w:name="_Toc242478587"/>
-      <w:r>
-        <w:rPr>
-          <w:sz w:val="20"/>
-          <w:szCs w:val="20"/>
-        </w:rPr>
-        <w:lastRenderedPageBreak/>
+      <w:bookmarkStart w:id="31" w:name="_Toc242479070"/>
+      <w:r>
         <w:t>AI: external models, not trained by us</w:t>
       </w:r>
       <w:bookmarkEnd w:id="30"/>
@@ -5459,43 +4747,25 @@
     <w:p>
       <w:pPr>
         <w:pStyle w:val="ReportNormal"/>
-        <w:rPr>
-          <w:sz w:val="18"/>
-          <w:szCs w:val="18"/>
-        </w:rPr>
       </w:pPr>
       <w:r>
         <w:rPr>
           <w:b/>
           <w:bCs/>
-          <w:sz w:val="20"/>
-          <w:szCs w:val="20"/>
         </w:rPr>
         <w:t>We do not train or fine-tune any model.</w:t>
       </w:r>
       <w:r>
-        <w:rPr>
-          <w:sz w:val="20"/>
-          <w:szCs w:val="20"/>
-        </w:rPr>
         <w:t xml:space="preserve"> The platform calls external large language models through one OpenAI-compatible client, which can reach hosted APIs from OpenAI, Qwen (DashScope), DeepSeek, Doubao (Ark) and Groq, or a model run locally through Ollama, as in this report's screenshots. It records which provider and model produced each answer. The AI's output is treated as one more author's answer that people must review, never as ground truth; a failed call is reported as a failure rather than turned into a placeholder answer (C1–C3).</w:t>
       </w:r>
     </w:p>
     <w:p>
       <w:pPr>
         <w:pStyle w:val="3"/>
-        <w:rPr>
-          <w:sz w:val="18"/>
-          <w:szCs w:val="18"/>
-        </w:rPr>
       </w:pPr>
       <w:bookmarkStart w:id="32" w:name="sec_1_7_3"/>
-      <w:bookmarkStart w:id="33" w:name="_Toc242478588"/>
-      <w:r>
-        <w:rPr>
-          <w:sz w:val="20"/>
-          <w:szCs w:val="20"/>
-        </w:rPr>
+      <w:bookmarkStart w:id="33" w:name="_Toc242479071"/>
+      <w:r>
         <w:t>How the back end supports the front end</w:t>
       </w:r>
       <w:bookmarkEnd w:id="32"/>
@@ -5504,68 +4774,40 @@
     <w:p>
       <w:pPr>
         <w:pStyle w:val="ReportNormal"/>
-        <w:rPr>
-          <w:sz w:val="18"/>
-          <w:szCs w:val="18"/>
-        </w:rPr>
-      </w:pPr>
-      <w:r>
-        <w:rPr>
-          <w:sz w:val="20"/>
-          <w:szCs w:val="20"/>
-        </w:rPr>
+      </w:pPr>
+      <w:r>
         <w:t xml:space="preserve">Every screen described in </w:t>
       </w:r>
       <w:hyperlink w:anchor="sec_1_6" w:history="1">
         <w:r>
           <w:rPr>
             <w:rStyle w:val="a9"/>
-            <w:sz w:val="20"/>
-            <w:szCs w:val="20"/>
           </w:rPr>
           <w:t>Section 1.6</w:t>
         </w:r>
       </w:hyperlink>
       <w:r>
-        <w:rPr>
-          <w:sz w:val="20"/>
-          <w:szCs w:val="20"/>
-        </w:rPr>
         <w:t xml:space="preserve"> rests on back-end work, usually merged a sprint earlier. </w:t>
       </w:r>
       <w:hyperlink w:anchor="table_6" w:history="1">
         <w:r>
           <w:rPr>
             <w:rStyle w:val="a9"/>
-            <w:sz w:val="20"/>
-            <w:szCs w:val="20"/>
           </w:rPr>
           <w:t>Table 6</w:t>
         </w:r>
       </w:hyperlink>
       <w:r>
-        <w:rPr>
-          <w:sz w:val="20"/>
-          <w:szCs w:val="20"/>
-        </w:rPr>
         <w:t xml:space="preserve"> pairs each back-end change with the front-end feature it enables and the users it serves.</w:t>
       </w:r>
     </w:p>
     <w:p>
       <w:pPr>
         <w:pStyle w:val="3"/>
-        <w:rPr>
-          <w:sz w:val="18"/>
-          <w:szCs w:val="18"/>
-        </w:rPr>
       </w:pPr>
       <w:bookmarkStart w:id="34" w:name="sec_1_7_4"/>
-      <w:bookmarkStart w:id="35" w:name="_Toc242478589"/>
-      <w:r>
-        <w:rPr>
-          <w:sz w:val="20"/>
-          <w:szCs w:val="20"/>
-        </w:rPr>
+      <w:bookmarkStart w:id="35" w:name="_Toc242479072"/>
+      <w:r>
         <w:t>Back-end scripts and services used in operations</w:t>
       </w:r>
       <w:bookmarkEnd w:id="34"/>
@@ -5574,51 +4816,29 @@
     <w:p>
       <w:pPr>
         <w:pStyle w:val="ReportNormal"/>
-        <w:rPr>
-          <w:sz w:val="18"/>
-          <w:szCs w:val="18"/>
-        </w:rPr>
-      </w:pPr>
-      <w:r>
-        <w:rPr>
-          <w:sz w:val="20"/>
-          <w:szCs w:val="20"/>
-        </w:rPr>
+      </w:pPr>
+      <w:r>
         <w:t xml:space="preserve">Some back-end pieces are not screens but are run by the team or an operator to make the platform usable. </w:t>
       </w:r>
       <w:hyperlink w:anchor="table_7" w:history="1">
         <w:r>
           <w:rPr>
             <w:rStyle w:val="a9"/>
-            <w:sz w:val="20"/>
-            <w:szCs w:val="20"/>
           </w:rPr>
           <w:t>Table 7</w:t>
         </w:r>
       </w:hyperlink>
       <w:r>
-        <w:rPr>
-          <w:sz w:val="20"/>
-          <w:szCs w:val="20"/>
-        </w:rPr>
         <w:t xml:space="preserve"> lists them with what each enables for users.</w:t>
       </w:r>
     </w:p>
     <w:p>
       <w:pPr>
         <w:pStyle w:val="3"/>
-        <w:rPr>
-          <w:sz w:val="18"/>
-          <w:szCs w:val="18"/>
-        </w:rPr>
       </w:pPr>
       <w:bookmarkStart w:id="36" w:name="sec_1_7_5"/>
-      <w:bookmarkStart w:id="37" w:name="_Toc242478590"/>
-      <w:r>
-        <w:rPr>
-          <w:sz w:val="20"/>
-          <w:szCs w:val="20"/>
-        </w:rPr>
+      <w:bookmarkStart w:id="37" w:name="_Toc242479073"/>
+      <w:r>
         <w:t>Records and quality</w:t>
       </w:r>
       <w:bookmarkEnd w:id="36"/>
@@ -5627,47 +4847,24 @@
     <w:p>
       <w:pPr>
         <w:pStyle w:val="ReportNormal"/>
-        <w:rPr>
-          <w:sz w:val="18"/>
-          <w:szCs w:val="18"/>
-        </w:rPr>
-      </w:pPr>
-      <w:r>
-        <w:rPr>
-          <w:sz w:val="20"/>
-          <w:szCs w:val="20"/>
-        </w:rPr>
+      </w:pPr>
+      <w:r>
         <w:t>Every answer is now kept as a version of its own, whether it comes from the AI, an annotator or a resubmission, and at most one version per item can be marked authoritative, which the database itself enforces; reopening an item clears the marker but keeps every version (F3; #47). This is what the release work in Weeks 9 and 10 builds on. Each action also writes an audit entry</w:t>
       </w:r>
       <w:r>
-        <w:rPr>
-          <w:sz w:val="20"/>
-          <w:szCs w:val="20"/>
-        </w:rPr>
         <w:t xml:space="preserve"> with its actor and time.</w:t>
       </w:r>
       <w:r>
-        <w:rPr>
-          <w:sz w:val="20"/>
-          <w:szCs w:val="20"/>
-        </w:rPr>
         <w:t xml:space="preserve"> The evaluation harness (#39) runs scripted cases through the real API as real users holding real roles, and its four cases pass; a draft PR (#51) adds the casebook's adversarial categories and gold records. The platform runs on PostgreSQL 18 as well as SQLite, and CI runs the backend suite on both, with PostgreSQL set to a non-UTC time zone to expose date-handling bugs (#24).</w:t>
       </w:r>
     </w:p>
     <w:p>
       <w:pPr>
         <w:pStyle w:val="2"/>
-        <w:rPr>
-          <w:sz w:val="18"/>
-          <w:szCs w:val="18"/>
-        </w:rPr>
       </w:pPr>
       <w:bookmarkStart w:id="38" w:name="sec_1_8"/>
-      <w:bookmarkStart w:id="39" w:name="_Toc242478591"/>
-      <w:r>
-        <w:rPr>
-          <w:sz w:val="20"/>
-        </w:rPr>
+      <w:bookmarkStart w:id="39" w:name="_Toc242479074"/>
+      <w:r>
         <w:t>Deliverables and the MVP</w:t>
       </w:r>
       <w:bookmarkEnd w:id="38"/>
@@ -5676,44 +4873,30 @@
     <w:p>
       <w:pPr>
         <w:pStyle w:val="ReportNormal"/>
-        <w:rPr>
-          <w:sz w:val="18"/>
-          <w:szCs w:val="18"/>
-        </w:rPr>
       </w:pPr>
       <w:hyperlink w:anchor="table_8" w:history="1">
         <w:r>
           <w:rPr>
             <w:rStyle w:val="a9"/>
-            <w:sz w:val="20"/>
-            <w:szCs w:val="20"/>
           </w:rPr>
           <w:t>Table 8</w:t>
         </w:r>
       </w:hyperlink>
       <w:r>
-        <w:rPr>
-          <w:sz w:val="20"/>
-          <w:szCs w:val="20"/>
-        </w:rPr>
-        <w:t xml:space="preserve"> assesses each deliverable from the proposal against its own definition of done, with the weeks it was planned for and the weeks it is actually delivered in, so each outcome can be read against the schedule in Section 3. Deliverables 1 and 7 are complete to date; 2 and 3 are largely built; 4 and 5 are the focus of Weeks 9 to 11.</w:t>
+        <w:t xml:space="preserve"> assesses each deliverable from the proposal against its own definition of done, with the weeks it was planned for and the weeks it is actually delivered in, so </w:t>
+      </w:r>
+      <w:r>
+        <w:lastRenderedPageBreak/>
+        <w:t>each outcome can be read against the schedule in Section 3. Deliverables 1 and 7 are complete to date; 2 and 3 are largely built; 4 and 5 are the focus of Weeks 9 to 11.</w:t>
       </w:r>
     </w:p>
     <w:p>
       <w:pPr>
         <w:pStyle w:val="3"/>
-        <w:rPr>
-          <w:sz w:val="18"/>
-          <w:szCs w:val="18"/>
-        </w:rPr>
       </w:pPr>
       <w:bookmarkStart w:id="40" w:name="sec_1_8_1"/>
-      <w:bookmarkStart w:id="41" w:name="_Toc242478592"/>
-      <w:r>
-        <w:rPr>
-          <w:sz w:val="20"/>
-          <w:szCs w:val="20"/>
-        </w:rPr>
+      <w:bookmarkStart w:id="41" w:name="_Toc242479075"/>
+      <w:r>
         <w:t>The MVP: complete, tested and working</w:t>
       </w:r>
       <w:bookmarkEnd w:id="40"/>
@@ -5722,98 +4905,50 @@
     <w:p>
       <w:pPr>
         <w:pStyle w:val="ReportNormal"/>
-        <w:rPr>
-          <w:sz w:val="18"/>
-          <w:szCs w:val="18"/>
-        </w:rPr>
-      </w:pPr>
-      <w:r>
-        <w:rPr>
-          <w:sz w:val="20"/>
-          <w:szCs w:val="20"/>
-        </w:rPr>
+      </w:pPr>
+      <w:r>
         <w:t xml:space="preserve">At Status Check 1 (26 August) the client and the team agreed that success is first defined as a working, high-quality end-to-end annotation workflow for text, covering task setup, AI annotation, human review, role-based permissions and dispute resolution, with further functionality treated as extension work. That is our minimum viable product. </w:t>
       </w:r>
       <w:hyperlink w:anchor="table_9" w:history="1">
         <w:r>
           <w:rPr>
             <w:rStyle w:val="a9"/>
-            <w:sz w:val="20"/>
-            <w:szCs w:val="20"/>
           </w:rPr>
           <w:t>Table 9</w:t>
         </w:r>
       </w:hyperlink>
       <w:r>
-        <w:rPr>
-          <w:sz w:val="20"/>
-          <w:szCs w:val="20"/>
-        </w:rPr>
         <w:t xml:space="preserve"> walks through it step by step, with the screen that shows each step working and the automated tests that check it; every test module named is on main, and every one passed when the suites were re-run for this report on 8 October.</w:t>
       </w:r>
     </w:p>
     <w:p>
       <w:pPr>
         <w:pStyle w:val="ReportNormal"/>
-        <w:rPr>
-          <w:sz w:val="18"/>
-          <w:szCs w:val="18"/>
-        </w:rPr>
       </w:pPr>
       <w:r>
         <w:rPr>
           <w:b/>
           <w:bCs/>
-          <w:sz w:val="20"/>
-          <w:szCs w:val="20"/>
         </w:rPr>
         <w:t>Verdict.</w:t>
       </w:r>
       <w:r>
-        <w:rPr>
-          <w:sz w:val="20"/>
-          <w:szCs w:val="20"/>
-        </w:rPr>
-        <w:t xml:space="preserve"> The MVP is complete: all eight steps run through the user interface on the client's data, and the backend (1,283 tests), frontend (400 tests) and end-to-end harness (4 cases) all pass. Two </w:t>
-      </w:r>
-      <w:r>
-        <w:rPr>
-          <w:sz w:val="20"/>
-          <w:szCs w:val="20"/>
-        </w:rPr>
-        <w:lastRenderedPageBreak/>
-        <w:t xml:space="preserve">refinements the client asked for after the MVP was agreed are still open and are planned, not missing: the expert's ruling currently finalises an item or sends it back, and the client's three-outcome version (accept, return or reject) </w:t>
-      </w:r>
-      <w:r>
-        <w:rPr>
-          <w:sz w:val="20"/>
-          <w:szCs w:val="20"/>
-        </w:rPr>
+        <w:t xml:space="preserve"> The MVP is complete: all eight steps run through the user interface on the client's data, and the backend (1,283 tests), frontend (400 tests) and end-to-end harness (4 cases) all pass. Two refinements the client asked for after the MVP was agreed are still open and are planned, not missing: the expert's ruling currently finalises an item or sends it back, and the client's three-outcome version (accept, return or reject) </w:t>
+      </w:r>
+      <w:r>
         <w:t>is in PR #48, approved to merge in Week 9;</w:t>
       </w:r>
       <w:r>
-        <w:rPr>
-          <w:sz w:val="20"/>
-          <w:szCs w:val="20"/>
-        </w:rPr>
         <w:t xml:space="preserve"> export currently delivers finalised items, and the gated release with a manifest is Deliverable 4 (Weeks 9–11). Provenance, release and evaluation extend the MVP to the full brief, and are where the remaining weeks go.</w:t>
       </w:r>
     </w:p>
     <w:p>
       <w:pPr>
         <w:pStyle w:val="1"/>
-        <w:rPr>
-          <w:sz w:val="22"/>
-          <w:szCs w:val="22"/>
-        </w:rPr>
       </w:pPr>
       <w:bookmarkStart w:id="42" w:name="sec_2"/>
-      <w:bookmarkStart w:id="43" w:name="_Toc242478593"/>
-      <w:r>
-        <w:rPr>
-          <w:sz w:val="24"/>
-          <w:szCs w:val="24"/>
-        </w:rPr>
+      <w:bookmarkStart w:id="43" w:name="_Toc242479076"/>
+      <w:r>
         <w:t>Obstacles</w:t>
       </w:r>
       <w:bookmarkEnd w:id="42"/>
@@ -5822,115 +4957,68 @@
     <w:p>
       <w:pPr>
         <w:pStyle w:val="ReportNormal"/>
-        <w:rPr>
-          <w:sz w:val="18"/>
-          <w:szCs w:val="18"/>
-        </w:rPr>
-      </w:pPr>
-      <w:r>
-        <w:rPr>
-          <w:sz w:val="20"/>
-          <w:szCs w:val="20"/>
-        </w:rPr>
+      </w:pPr>
+      <w:r>
         <w:t>This section separates the obstacles we have already met, both project-wide (</w:t>
       </w:r>
       <w:hyperlink w:anchor="sec_2_1" w:history="1">
         <w:r>
           <w:rPr>
             <w:rStyle w:val="a9"/>
-            <w:sz w:val="20"/>
-            <w:szCs w:val="20"/>
           </w:rPr>
           <w:t>Section 2.1</w:t>
         </w:r>
       </w:hyperlink>
       <w:r>
-        <w:rPr>
-          <w:sz w:val="20"/>
-          <w:szCs w:val="20"/>
-        </w:rPr>
         <w:t>) and inside particular sprints and stories (</w:t>
       </w:r>
       <w:hyperlink w:anchor="sec_2_2" w:history="1">
         <w:r>
           <w:rPr>
             <w:rStyle w:val="a9"/>
-            <w:sz w:val="20"/>
-            <w:szCs w:val="20"/>
           </w:rPr>
           <w:t>Section 2.2</w:t>
         </w:r>
       </w:hyperlink>
       <w:r>
-        <w:rPr>
-          <w:sz w:val="20"/>
-          <w:szCs w:val="20"/>
-        </w:rPr>
         <w:t>), which explain most of the timeline changes in Section 3, from the risks (</w:t>
       </w:r>
       <w:hyperlink w:anchor="sec_2_3" w:history="1">
         <w:r>
           <w:rPr>
             <w:rStyle w:val="a9"/>
-            <w:sz w:val="20"/>
-            <w:szCs w:val="20"/>
           </w:rPr>
           <w:t>Section 2.3</w:t>
         </w:r>
       </w:hyperlink>
       <w:r>
-        <w:rPr>
-          <w:sz w:val="20"/>
-          <w:szCs w:val="20"/>
-        </w:rPr>
         <w:t>) and dependencies (</w:t>
       </w:r>
       <w:hyperlink w:anchor="sec_2_4" w:history="1">
         <w:r>
           <w:rPr>
             <w:rStyle w:val="a9"/>
-            <w:sz w:val="20"/>
-            <w:szCs w:val="20"/>
           </w:rPr>
           <w:t>Section 2.4</w:t>
         </w:r>
       </w:hyperlink>
       <w:r>
-        <w:rPr>
-          <w:sz w:val="20"/>
-          <w:szCs w:val="20"/>
-        </w:rPr>
         <w:t>) still ahead, which shape the plan in Section 4</w:t>
       </w:r>
       <w:r>
-        <w:rPr>
-          <w:sz w:val="20"/>
-          <w:szCs w:val="20"/>
-        </w:rPr>
         <w:t>.</w:t>
       </w:r>
       <w:r>
-        <w:rPr>
-          <w:sz w:val="20"/>
-          <w:szCs w:val="20"/>
-        </w:rPr>
         <w:t xml:space="preserve"> Each obstacle and risk carries an identifier (O1 to O9 and R1 to R10) and names the deliverable and the part of the timeline it touches, so it can be followed into Sections 3 and 4.</w:t>
       </w:r>
     </w:p>
     <w:p>
       <w:pPr>
         <w:pStyle w:val="2"/>
-        <w:rPr>
-          <w:sz w:val="18"/>
-          <w:szCs w:val="18"/>
-        </w:rPr>
       </w:pPr>
       <w:bookmarkStart w:id="44" w:name="sec_2_1"/>
-      <w:bookmarkStart w:id="45" w:name="_Toc242478594"/>
-      <w:r>
-        <w:rPr>
-          <w:sz w:val="20"/>
-        </w:rPr>
+      <w:bookmarkStart w:id="45" w:name="_Toc242479077"/>
+      <w:r>
         <w:t>Obstacles met so far</w:t>
       </w:r>
       <w:bookmarkEnd w:id="44"/>
@@ -5939,17 +5027,10 @@
     <w:p>
       <w:pPr>
         <w:pStyle w:val="2"/>
-        <w:rPr>
-          <w:sz w:val="18"/>
-          <w:szCs w:val="18"/>
-        </w:rPr>
       </w:pPr>
       <w:bookmarkStart w:id="46" w:name="sec_2_2"/>
-      <w:bookmarkStart w:id="47" w:name="_Toc242478595"/>
-      <w:r>
-        <w:rPr>
-          <w:sz w:val="20"/>
-        </w:rPr>
+      <w:bookmarkStart w:id="47" w:name="_Toc242479078"/>
+      <w:r>
         <w:t>Challenges by sprint and story</w:t>
       </w:r>
       <w:bookmarkEnd w:id="46"/>
@@ -5958,50 +5039,33 @@
     <w:p>
       <w:pPr>
         <w:pStyle w:val="ReportNormal"/>
-        <w:rPr>
-          <w:sz w:val="18"/>
-          <w:szCs w:val="18"/>
-        </w:rPr>
-      </w:pPr>
-      <w:r>
-        <w:rPr>
-          <w:sz w:val="20"/>
-          <w:szCs w:val="20"/>
-        </w:rPr>
+      </w:pPr>
+      <w:r>
         <w:t xml:space="preserve">The obstacles above are project-wide. </w:t>
       </w:r>
       <w:hyperlink w:anchor="table_11" w:history="1">
         <w:r>
           <w:rPr>
             <w:rStyle w:val="a9"/>
-            <w:sz w:val="20"/>
-            <w:szCs w:val="20"/>
           </w:rPr>
           <w:t>Table 11</w:t>
         </w:r>
       </w:hyperlink>
       <w:r>
-        <w:rPr>
-          <w:sz w:val="20"/>
-          <w:szCs w:val="20"/>
-        </w:rPr>
-        <w:t xml:space="preserve"> goes one level down: the concrete problems met while building particular stories, in the sprint they arose, and how each was solved. Most were caught in code review or scenario testing before they reached main, which is the review practice of obstacle O2 at work; the last column links each to the project-level obstacle or risk it belongs to.</w:t>
+        <w:t xml:space="preserve"> goes one level down: the concrete problems met while building particular stories, in the sprint they arose, and how each was solved. Most were caught in code review or scenario testing before they </w:t>
+      </w:r>
+      <w:r>
+        <w:lastRenderedPageBreak/>
+        <w:t>reached main, which is the review practice of obstacle O2 at work; the last column links each to the project-level obstacle or risk it belongs to.</w:t>
       </w:r>
     </w:p>
     <w:p>
       <w:pPr>
         <w:pStyle w:val="2"/>
-        <w:rPr>
-          <w:sz w:val="18"/>
-          <w:szCs w:val="18"/>
-        </w:rPr>
       </w:pPr>
       <w:bookmarkStart w:id="48" w:name="sec_2_3"/>
-      <w:bookmarkStart w:id="49" w:name="_Toc242478596"/>
-      <w:r>
-        <w:rPr>
-          <w:sz w:val="20"/>
-        </w:rPr>
+      <w:bookmarkStart w:id="49" w:name="_Toc242479079"/>
+      <w:r>
         <w:t>Risks ahead</w:t>
       </w:r>
       <w:bookmarkEnd w:id="48"/>
@@ -6010,94 +5074,59 @@
     <w:p>
       <w:pPr>
         <w:pStyle w:val="ReportNormal"/>
-        <w:rPr>
-          <w:sz w:val="18"/>
-          <w:szCs w:val="18"/>
-        </w:rPr>
       </w:pPr>
       <w:hyperlink w:anchor="table_12" w:history="1">
         <w:r>
           <w:rPr>
             <w:rStyle w:val="a9"/>
-            <w:sz w:val="20"/>
-            <w:szCs w:val="20"/>
           </w:rPr>
           <w:t>Table 12</w:t>
         </w:r>
       </w:hyperlink>
       <w:r>
-        <w:rPr>
-          <w:sz w:val="20"/>
-          <w:szCs w:val="20"/>
-        </w:rPr>
         <w:t xml:space="preserve"> is the risk register for the remaining weeks, rated for likelihood (L) and impact (I) as high, medium or low, and plotted in </w:t>
       </w:r>
       <w:hyperlink w:anchor="figure_9" w:history="1">
         <w:r>
           <w:rPr>
             <w:rStyle w:val="a9"/>
-            <w:sz w:val="20"/>
-            <w:szCs w:val="20"/>
           </w:rPr>
           <w:t>Figure 9</w:t>
         </w:r>
       </w:hyperlink>
       <w:r>
-        <w:rPr>
-          <w:sz w:val="20"/>
-          <w:szCs w:val="20"/>
-        </w:rPr>
         <w:t xml:space="preserve">. Each risk names what it affects, has more than one mitigation so that the plan does not rest on a single remedy, and has an owner and a trigger, the observable event that starts the contingency; both are reviewed at the weekly meeting. The dependencies behind R1 and R2 are drawn in </w:t>
       </w:r>
       <w:hyperlink w:anchor="figure_12" w:history="1">
         <w:r>
           <w:rPr>
             <w:rStyle w:val="a9"/>
-            <w:sz w:val="20"/>
-            <w:szCs w:val="20"/>
           </w:rPr>
           <w:t>Figure 12</w:t>
         </w:r>
       </w:hyperlink>
       <w:r>
-        <w:rPr>
-          <w:sz w:val="20"/>
-          <w:szCs w:val="20"/>
-        </w:rPr>
         <w:t xml:space="preserve"> (</w:t>
       </w:r>
       <w:hyperlink w:anchor="sec_4_2" w:history="1">
         <w:r>
           <w:rPr>
             <w:rStyle w:val="a9"/>
-            <w:sz w:val="20"/>
-            <w:szCs w:val="20"/>
           </w:rPr>
           <w:t>Section 4.2</w:t>
         </w:r>
       </w:hyperlink>
       <w:r>
-        <w:rPr>
-          <w:sz w:val="20"/>
-          <w:szCs w:val="20"/>
-        </w:rPr>
         <w:t>).</w:t>
       </w:r>
     </w:p>
     <w:p>
       <w:pPr>
         <w:pStyle w:val="2"/>
-        <w:rPr>
-          <w:sz w:val="18"/>
-          <w:szCs w:val="18"/>
-        </w:rPr>
       </w:pPr>
       <w:bookmarkStart w:id="50" w:name="sec_2_4"/>
-      <w:bookmarkStart w:id="51" w:name="_Toc242478597"/>
-      <w:r>
-        <w:rPr>
-          <w:sz w:val="20"/>
-        </w:rPr>
+      <w:bookmarkStart w:id="51" w:name="_Toc242479080"/>
+      <w:r>
         <w:t>Dependencies</w:t>
       </w:r>
       <w:bookmarkEnd w:id="50"/>
@@ -6106,44 +5135,26 @@
     <w:p>
       <w:pPr>
         <w:pStyle w:val="ReportNormal"/>
-        <w:rPr>
-          <w:sz w:val="18"/>
-          <w:szCs w:val="18"/>
-        </w:rPr>
       </w:pPr>
       <w:hyperlink w:anchor="table_13" w:history="1">
         <w:r>
           <w:rPr>
             <w:rStyle w:val="a9"/>
-            <w:sz w:val="20"/>
-            <w:szCs w:val="20"/>
           </w:rPr>
           <w:t>Table 13</w:t>
         </w:r>
       </w:hyperlink>
       <w:r>
-        <w:rPr>
-          <w:sz w:val="20"/>
-          <w:szCs w:val="20"/>
-        </w:rPr>
         <w:t xml:space="preserve"> lists what the remaining work depends on, inside and outside the team, when each is needed and what happens if it is late. External dependencies are the ones we cannot schedule ourselves, so each has a fallback that does not need the outside party.</w:t>
       </w:r>
     </w:p>
     <w:p>
       <w:pPr>
         <w:pStyle w:val="1"/>
-        <w:rPr>
-          <w:sz w:val="22"/>
-          <w:szCs w:val="22"/>
-        </w:rPr>
       </w:pPr>
       <w:bookmarkStart w:id="52" w:name="sec_3"/>
-      <w:bookmarkStart w:id="53" w:name="_Toc242478598"/>
-      <w:r>
-        <w:rPr>
-          <w:sz w:val="24"/>
-          <w:szCs w:val="24"/>
-        </w:rPr>
+      <w:bookmarkStart w:id="53" w:name="_Toc242479081"/>
+      <w:r>
         <w:t>Deviation to Timeline</w:t>
       </w:r>
       <w:bookmarkEnd w:id="52"/>
@@ -6152,17 +5163,10 @@
     <w:p>
       <w:pPr>
         <w:pStyle w:val="2"/>
-        <w:rPr>
-          <w:sz w:val="18"/>
-          <w:szCs w:val="18"/>
-        </w:rPr>
       </w:pPr>
       <w:bookmarkStart w:id="54" w:name="sec_3_1"/>
-      <w:bookmarkStart w:id="55" w:name="_Toc242478599"/>
-      <w:r>
-        <w:rPr>
-          <w:sz w:val="20"/>
-        </w:rPr>
+      <w:bookmarkStart w:id="55" w:name="_Toc242479082"/>
+      <w:r>
         <w:t>The baseline</w:t>
       </w:r>
       <w:bookmarkEnd w:id="54"/>
@@ -6171,83 +5175,45 @@
     <w:p>
       <w:pPr>
         <w:pStyle w:val="ReportNormal"/>
-        <w:rPr>
-          <w:sz w:val="18"/>
-          <w:szCs w:val="18"/>
-        </w:rPr>
-      </w:pPr>
-      <w:r>
-        <w:rPr>
-          <w:sz w:val="20"/>
-          <w:szCs w:val="20"/>
-        </w:rPr>
+      </w:pPr>
+      <w:r>
         <w:t>The baseline is the Gantt chart in our proposal (</w:t>
       </w:r>
       <w:hyperlink w:anchor="figure_10" w:history="1">
         <w:r>
           <w:rPr>
             <w:rStyle w:val="a9"/>
-            <w:sz w:val="20"/>
-            <w:szCs w:val="20"/>
           </w:rPr>
           <w:t>Figure 10</w:t>
         </w:r>
       </w:hyperlink>
       <w:r>
-        <w:rPr>
-          <w:sz w:val="20"/>
-          <w:szCs w:val="20"/>
-        </w:rPr>
-        <w:t xml:space="preserve">), refined at Status Check 1 (26 August) into an indicative weekly plan: Week 5, user stories and the review workflow; Week 6, schema and contract validation; Weeks 7–8, the core annotation backend; Weeks 9–10, human review, roles and disputes; Week 11, an end-to-end run on the provided datasets; Week 12, hardening, documentation and </w:t>
-      </w:r>
-      <w:r>
-        <w:rPr>
-          <w:sz w:val="20"/>
-          <w:szCs w:val="20"/>
-        </w:rPr>
-        <w:lastRenderedPageBreak/>
-        <w:t>the demonstration; Week 13, the final presentation and report. The client accepted it as indicative, with changes raised at the weekly meeting.</w:t>
+        <w:t>), refined at Status Check 1 (26 August) into an indicative weekly plan: Week 5, user stories and the review workflow; Week 6, schema and contract validation; Weeks 7–8, the core annotation backend; Weeks 9–10, human review, roles and disputes; Week 11, an end-to-end run on the provided datasets; Week 12, hardening, documentation and the demonstration; Week 13, the final presentation and report. The client accepted it as indicative, with changes raised at the weekly meeting.</w:t>
       </w:r>
     </w:p>
     <w:p>
       <w:pPr>
         <w:pStyle w:val="ReportNormal"/>
-        <w:rPr>
-          <w:sz w:val="18"/>
-          <w:szCs w:val="18"/>
-        </w:rPr>
       </w:pPr>
       <w:r>
         <w:rPr>
           <w:b/>
           <w:bCs/>
-          <w:sz w:val="20"/>
-          <w:szCs w:val="20"/>
         </w:rPr>
         <w:t>Calendar note.</w:t>
       </w:r>
       <w:r>
-        <w:rPr>
-          <w:sz w:val="20"/>
-          <w:szCs w:val="20"/>
-        </w:rPr>
         <w:t xml:space="preserve"> Since 19 September our sprints run Thursday to Wednesday so that each closes after the Wednesday client meeting. Sprint W9 therefore runs 8–14 October while teaching Week 9 began on 5 October; Week 7 absorbed the change and ran ten days, and the mid-semester break has its own sprint (1–7 October), which the proposal's chart did not include.</w:t>
       </w:r>
     </w:p>
     <w:p>
       <w:pPr>
         <w:pStyle w:val="2"/>
-        <w:rPr>
-          <w:sz w:val="18"/>
-          <w:szCs w:val="18"/>
-        </w:rPr>
       </w:pPr>
       <w:bookmarkStart w:id="56" w:name="sec_3_2"/>
-      <w:bookmarkStart w:id="57" w:name="_Toc242478600"/>
-      <w:r>
-        <w:rPr>
-          <w:sz w:val="20"/>
-        </w:rPr>
+      <w:bookmarkStart w:id="57" w:name="_Toc242479083"/>
+      <w:r>
+        <w:lastRenderedPageBreak/>
         <w:t>What moved, and why</w:t>
       </w:r>
       <w:bookmarkEnd w:id="56"/>
@@ -6256,77 +5222,49 @@
     <w:p>
       <w:pPr>
         <w:pStyle w:val="ReportNormal"/>
-        <w:rPr>
-          <w:sz w:val="18"/>
-          <w:szCs w:val="18"/>
-        </w:rPr>
       </w:pPr>
       <w:hyperlink w:anchor="figure_11" w:history="1">
         <w:r>
           <w:rPr>
             <w:rStyle w:val="a9"/>
-            <w:sz w:val="20"/>
-            <w:szCs w:val="20"/>
           </w:rPr>
           <w:t>Figure 11</w:t>
         </w:r>
       </w:hyperlink>
       <w:r>
-        <w:rPr>
-          <w:sz w:val="20"/>
-          <w:szCs w:val="20"/>
-        </w:rPr>
         <w:t xml:space="preserve"> overlays the proposal's plan (grey) on what has been delivered (solid) and what is re-planned (hatched). </w:t>
       </w:r>
       <w:hyperlink w:anchor="table_14" w:history="1">
         <w:r>
           <w:rPr>
             <w:rStyle w:val="a9"/>
-            <w:sz w:val="20"/>
-            <w:szCs w:val="20"/>
           </w:rPr>
           <w:t>Table 14</w:t>
         </w:r>
       </w:hyperlink>
       <w:r>
-        <w:rPr>
-          <w:sz w:val="20"/>
-          <w:szCs w:val="20"/>
-        </w:rPr>
         <w:t xml:space="preserve"> explains each deviation and links it to the obstacle that caused it (</w:t>
       </w:r>
       <w:hyperlink w:anchor="sec_2_1" w:history="1">
         <w:r>
           <w:rPr>
             <w:rStyle w:val="a9"/>
-            <w:sz w:val="20"/>
-            <w:szCs w:val="20"/>
           </w:rPr>
           <w:t>Section 2.1</w:t>
         </w:r>
       </w:hyperlink>
       <w:r>
-        <w:rPr>
-          <w:sz w:val="20"/>
-          <w:szCs w:val="20"/>
-        </w:rPr>
         <w:t>) or the risk it creates (</w:t>
       </w:r>
       <w:hyperlink w:anchor="sec_2_2" w:history="1">
         <w:r>
           <w:rPr>
             <w:rStyle w:val="a9"/>
-            <w:sz w:val="20"/>
-            <w:szCs w:val="20"/>
           </w:rPr>
           <w:t>Section 2.2</w:t>
         </w:r>
       </w:hyperlink>
       <w:r>
-        <w:rPr>
-          <w:sz w:val="20"/>
-          <w:szCs w:val="20"/>
-        </w:rPr>
         <w:t>).</w:t>
       </w:r>
     </w:p>
@@ -6363,17 +5301,10 @@
     <w:p>
       <w:pPr>
         <w:pStyle w:val="2"/>
-        <w:rPr>
-          <w:sz w:val="18"/>
-          <w:szCs w:val="18"/>
-        </w:rPr>
       </w:pPr>
       <w:bookmarkStart w:id="58" w:name="sec_3_3"/>
-      <w:bookmarkStart w:id="59" w:name="_Toc242478601"/>
-      <w:r>
-        <w:rPr>
-          <w:sz w:val="20"/>
-        </w:rPr>
+      <w:bookmarkStart w:id="59" w:name="_Toc242479084"/>
+      <w:r>
         <w:t>Impact on the project</w:t>
       </w:r>
       <w:bookmarkEnd w:id="58"/>
@@ -6382,169 +5313,103 @@
     <w:p>
       <w:pPr>
         <w:pStyle w:val="PhDBullet"/>
-        <w:rPr>
-          <w:sz w:val="18"/>
-          <w:szCs w:val="18"/>
-        </w:rPr>
       </w:pPr>
       <w:r>
         <w:rPr>
           <w:b/>
           <w:bCs/>
-          <w:sz w:val="20"/>
-          <w:szCs w:val="20"/>
         </w:rPr>
         <w:t>End date and scope unchanged.</w:t>
       </w:r>
       <w:r>
-        <w:rPr>
-          <w:sz w:val="20"/>
-          <w:szCs w:val="20"/>
-        </w:rPr>
         <w:t xml:space="preserve"> Every proposal deliverable remains; build work ends on 28 October as the Week 11 boundary, and assessed milestones keep their dates.</w:t>
       </w:r>
     </w:p>
     <w:p>
       <w:pPr>
         <w:pStyle w:val="PhDBullet"/>
-        <w:rPr>
-          <w:sz w:val="18"/>
-          <w:szCs w:val="18"/>
-        </w:rPr>
       </w:pPr>
       <w:r>
         <w:rPr>
           <w:b/>
           <w:bCs/>
-          <w:sz w:val="20"/>
-          <w:szCs w:val="20"/>
         </w:rPr>
         <w:t>A critical path with no float after Week 9.</w:t>
       </w:r>
       <w:r>
-        <w:rPr>
-          <w:sz w:val="20"/>
-          <w:szCs w:val="20"/>
-        </w:rPr>
         <w:t xml:space="preserve"> The chain F1 → H3 → H2 → H6 → I5 → handover documents (</w:t>
       </w:r>
       <w:hyperlink w:anchor="figure_12" w:history="1">
         <w:r>
           <w:rPr>
             <w:rStyle w:val="a9"/>
-            <w:sz w:val="20"/>
-            <w:szCs w:val="20"/>
           </w:rPr>
           <w:t>Figure 12</w:t>
         </w:r>
       </w:hyperlink>
       <w:r>
-        <w:rPr>
-          <w:sz w:val="20"/>
-          <w:szCs w:val="20"/>
-        </w:rPr>
         <w:t>) decides the finish. Before 1 October F1 sat in Week 11, after the release work that needs it, an order that could not have finished; after the replan the chain fits, but a slip in F1 delays the release gate unless the contingency in R1 is used. F2, H4 and H1 also feed the gate in Week 10, so they share its zero float (</w:t>
       </w:r>
       <w:hyperlink w:anchor="table_16" w:history="1">
         <w:r>
           <w:rPr>
             <w:rStyle w:val="a9"/>
-            <w:sz w:val="20"/>
-            <w:szCs w:val="20"/>
           </w:rPr>
           <w:t>Table 16</w:t>
         </w:r>
       </w:hyperlink>
       <w:r>
-        <w:rPr>
-          <w:sz w:val="20"/>
-          <w:szCs w:val="20"/>
-        </w:rPr>
         <w:t>).</w:t>
       </w:r>
     </w:p>
     <w:p>
       <w:pPr>
         <w:pStyle w:val="PhDBullet"/>
-        <w:rPr>
-          <w:sz w:val="18"/>
-          <w:szCs w:val="18"/>
-        </w:rPr>
       </w:pPr>
       <w:r>
         <w:rPr>
           <w:b/>
           <w:bCs/>
-          <w:sz w:val="20"/>
-          <w:szCs w:val="20"/>
         </w:rPr>
         <w:t>Slack lies in capacity, not in calendar time.</w:t>
       </w:r>
       <w:r>
-        <w:rPr>
-          <w:sz w:val="20"/>
-          <w:szCs w:val="20"/>
-        </w:rPr>
         <w:t xml:space="preserve"> Because Week 11 is the last sprint, few tasks have spare weeks; instead Week 11 holds 7.5u against a capacity of 12–28u, and two members carry no counted work in it, which is where a slipped task lands (</w:t>
       </w:r>
       <w:hyperlink w:anchor="sec_4_4" w:history="1">
         <w:r>
           <w:rPr>
             <w:rStyle w:val="a9"/>
-            <w:sz w:val="20"/>
-            <w:szCs w:val="20"/>
           </w:rPr>
           <w:t>Section 4.4</w:t>
         </w:r>
       </w:hyperlink>
       <w:r>
-        <w:rPr>
-          <w:sz w:val="20"/>
-          <w:szCs w:val="20"/>
-        </w:rPr>
         <w:t>).</w:t>
       </w:r>
     </w:p>
     <w:p>
       <w:pPr>
         <w:pStyle w:val="PhDBullet"/>
-        <w:rPr>
-          <w:sz w:val="18"/>
-          <w:szCs w:val="18"/>
-        </w:rPr>
       </w:pPr>
       <w:r>
         <w:rPr>
           <w:b/>
           <w:bCs/>
-          <w:sz w:val="20"/>
-          <w:szCs w:val="20"/>
         </w:rPr>
         <w:t>Two deliverable-level effects:</w:t>
       </w:r>
       <w:r>
-        <w:rPr>
-          <w:sz w:val="20"/>
-          <w:szCs w:val="20"/>
-        </w:rPr>
         <w:t xml:space="preserve"> the dispute epic finishes in Week 11 rather than Week 10, and evaluation runs earlier than planned, which gives its measurements a week of slack.</w:t>
       </w:r>
     </w:p>
     <w:p>
       <w:pPr>
         <w:pStyle w:val="1"/>
-        <w:rPr>
-          <w:sz w:val="22"/>
-          <w:szCs w:val="22"/>
-        </w:rPr>
       </w:pPr>
       <w:bookmarkStart w:id="60" w:name="sec_4"/>
-      <w:bookmarkStart w:id="61" w:name="_Toc242478602"/>
-      <w:r>
-        <w:rPr>
-          <w:sz w:val="24"/>
-          <w:szCs w:val="24"/>
-        </w:rPr>
+      <w:bookmarkStart w:id="61" w:name="_Toc242479085"/>
+      <w:r>
         <w:t>Milestones &amp; Reporting</w:t>
       </w:r>
       <w:bookmarkEnd w:id="60"/>
@@ -6553,17 +5418,10 @@
     <w:p>
       <w:pPr>
         <w:pStyle w:val="2"/>
-        <w:rPr>
-          <w:sz w:val="18"/>
-          <w:szCs w:val="18"/>
-        </w:rPr>
       </w:pPr>
       <w:bookmarkStart w:id="62" w:name="sec_4_1"/>
-      <w:bookmarkStart w:id="63" w:name="_Toc242478603"/>
-      <w:r>
-        <w:rPr>
-          <w:sz w:val="20"/>
-        </w:rPr>
+      <w:bookmarkStart w:id="63" w:name="_Toc242479086"/>
+      <w:r>
         <w:t>Updated milestones</w:t>
       </w:r>
       <w:bookmarkEnd w:id="62"/>
@@ -6572,99 +5430,60 @@
     <w:p>
       <w:pPr>
         <w:pStyle w:val="ReportNormal"/>
-        <w:rPr>
-          <w:sz w:val="18"/>
-          <w:szCs w:val="18"/>
-        </w:rPr>
       </w:pPr>
       <w:hyperlink w:anchor="table_15" w:history="1">
         <w:r>
           <w:rPr>
             <w:rStyle w:val="a9"/>
-            <w:sz w:val="20"/>
-            <w:szCs w:val="20"/>
           </w:rPr>
           <w:t>Table 15</w:t>
         </w:r>
       </w:hyperlink>
       <w:r>
-        <w:rPr>
-          <w:sz w:val="20"/>
-          <w:szCs w:val="20"/>
-        </w:rPr>
         <w:t xml:space="preserve"> updates the milestone table from the proposal. Following the template's convention, </w:t>
       </w:r>
       <w:r>
         <w:rPr>
           <w:color w:val="C00000"/>
-          <w:sz w:val="20"/>
-          <w:szCs w:val="20"/>
         </w:rPr>
         <w:t>red text</w:t>
       </w:r>
       <w:r>
-        <w:rPr>
-          <w:sz w:val="20"/>
-          <w:szCs w:val="20"/>
-        </w:rPr>
         <w:t xml:space="preserve"> marks a change and </w:t>
       </w:r>
       <w:r>
         <w:rPr>
           <w:strike/>
           <w:color w:val="7F7F7F" w:themeColor="text1" w:themeTint="80"/>
-          <w:sz w:val="20"/>
-          <w:szCs w:val="20"/>
         </w:rPr>
         <w:t>struck-through text</w:t>
       </w:r>
       <w:r>
-        <w:rPr>
-          <w:sz w:val="20"/>
-          <w:szCs w:val="20"/>
-        </w:rPr>
-        <w:t xml:space="preserve"> marks a task moved or replaced; owners are named for </w:t>
-      </w:r>
-      <w:r>
-        <w:rPr>
-          <w:sz w:val="20"/>
-          <w:szCs w:val="20"/>
-        </w:rPr>
+        <w:t xml:space="preserve"> marks a task moved or </w:t>
+      </w:r>
+      <w:r>
         <w:lastRenderedPageBreak/>
-        <w:t xml:space="preserve">every task: past work by the member who delivered it, Week 9 from the Jira board, and Weeks 10–12 as proposed owners (*) to be confirmed at the weekly meeting. Ticket-level detail follows in </w:t>
+        <w:t xml:space="preserve">replaced; owners are named for every task: past work by the member who delivered it, Week 9 from the Jira board, and Weeks 10–12 as proposed owners (*) to be confirmed at the weekly meeting. Ticket-level detail follows in </w:t>
       </w:r>
       <w:hyperlink w:anchor="table_16" w:history="1">
         <w:r>
           <w:rPr>
             <w:rStyle w:val="a9"/>
-            <w:sz w:val="20"/>
-            <w:szCs w:val="20"/>
           </w:rPr>
           <w:t>Table 16</w:t>
         </w:r>
       </w:hyperlink>
       <w:r>
-        <w:rPr>
-          <w:sz w:val="20"/>
-          <w:szCs w:val="20"/>
-        </w:rPr>
         <w:t>.</w:t>
       </w:r>
     </w:p>
     <w:p>
       <w:pPr>
         <w:pStyle w:val="2"/>
-        <w:rPr>
-          <w:sz w:val="18"/>
-          <w:szCs w:val="18"/>
-        </w:rPr>
       </w:pPr>
       <w:bookmarkStart w:id="64" w:name="sec_4_2"/>
-      <w:bookmarkStart w:id="65" w:name="_Toc242478604"/>
-      <w:r>
-        <w:rPr>
-          <w:sz w:val="20"/>
-        </w:rPr>
+      <w:bookmarkStart w:id="65" w:name="_Toc242479087"/>
+      <w:r>
         <w:t>Remaining work, dependencies and the critical path</w:t>
       </w:r>
       <w:bookmarkEnd w:id="64"/>
@@ -6673,90 +5492,53 @@
     <w:p>
       <w:pPr>
         <w:pStyle w:val="ReportNormal"/>
-        <w:rPr>
-          <w:sz w:val="18"/>
-          <w:szCs w:val="18"/>
-        </w:rPr>
       </w:pPr>
       <w:hyperlink w:anchor="figure_12" w:history="1">
         <w:r>
           <w:rPr>
             <w:rStyle w:val="a9"/>
-            <w:sz w:val="20"/>
-            <w:szCs w:val="20"/>
           </w:rPr>
           <w:t>Figure 12</w:t>
         </w:r>
       </w:hyperlink>
       <w:r>
-        <w:rPr>
-          <w:sz w:val="20"/>
-          <w:szCs w:val="20"/>
-        </w:rPr>
         <w:t xml:space="preserve"> lays out the remaining stories by week with their dependencies; the blue chain is the critical path</w:t>
       </w:r>
       <w:r>
-        <w:rPr>
-          <w:sz w:val="20"/>
-          <w:szCs w:val="20"/>
-        </w:rPr>
         <w:t>.</w:t>
       </w:r>
       <w:r>
-        <w:rPr>
-          <w:sz w:val="20"/>
-          <w:szCs w:val="20"/>
-        </w:rPr>
         <w:t xml:space="preserve"> </w:t>
       </w:r>
       <w:hyperlink w:anchor="table_16" w:history="1">
         <w:r>
           <w:rPr>
             <w:rStyle w:val="a9"/>
-            <w:sz w:val="20"/>
-            <w:szCs w:val="20"/>
           </w:rPr>
           <w:t>Table 16</w:t>
         </w:r>
       </w:hyperlink>
       <w:r>
-        <w:rPr>
-          <w:sz w:val="20"/>
-          <w:szCs w:val="20"/>
-        </w:rPr>
         <w:t xml:space="preserve"> gives each ticket's owner, load, float and dependencies. </w:t>
       </w:r>
       <w:r>
         <w:rPr>
           <w:i/>
           <w:iCs/>
-          <w:sz w:val="20"/>
-          <w:szCs w:val="20"/>
         </w:rPr>
         <w:t>Float</w:t>
       </w:r>
       <w:r>
-        <w:rPr>
-          <w:sz w:val="20"/>
-          <w:szCs w:val="20"/>
-        </w:rPr>
         <w:t xml:space="preserve"> is how many weeks a ticket can slip without delaying the end of build work on 28 October. Week 9 owners are on the Jira board; Week 10 and 11 owners marked with an asterisk are our proposal, following each member's earlier work, to be confirmed at the weekly meeting.</w:t>
       </w:r>
     </w:p>
     <w:p>
       <w:pPr>
         <w:pStyle w:val="2"/>
-        <w:rPr>
-          <w:sz w:val="18"/>
-          <w:szCs w:val="18"/>
-        </w:rPr>
       </w:pPr>
       <w:bookmarkStart w:id="66" w:name="sec_4_3"/>
-      <w:bookmarkStart w:id="67" w:name="_Toc242478605"/>
-      <w:r>
-        <w:rPr>
-          <w:sz w:val="20"/>
-        </w:rPr>
+      <w:bookmarkStart w:id="67" w:name="_Toc242479088"/>
+      <w:r>
         <w:t>Who carries what</w:t>
       </w:r>
       <w:bookmarkEnd w:id="66"/>
@@ -6765,60 +5547,37 @@
     <w:p>
       <w:pPr>
         <w:pStyle w:val="ReportNormal"/>
-        <w:rPr>
-          <w:sz w:val="18"/>
-          <w:szCs w:val="18"/>
-        </w:rPr>
       </w:pPr>
       <w:hyperlink w:anchor="table_17" w:history="1">
         <w:r>
           <w:rPr>
             <w:rStyle w:val="a9"/>
-            <w:sz w:val="20"/>
-            <w:szCs w:val="20"/>
           </w:rPr>
           <w:t>Table 17</w:t>
         </w:r>
       </w:hyperlink>
       <w:r>
-        <w:rPr>
-          <w:sz w:val="20"/>
-          <w:szCs w:val="20"/>
-        </w:rPr>
         <w:t xml:space="preserve"> turns the plan into each member's load per week, which is how we check that the timeline is possible: everyone stays within the agreed 1.5–3.5u a week (Jingwei's 4u in Week 9 is by Jingwei's own choice, and two of those tickets are already in review), and the days after build work ends have named owners. Proposed owners are marked with an asterisk as in </w:t>
       </w:r>
       <w:hyperlink w:anchor="table_16" w:history="1">
         <w:r>
           <w:rPr>
             <w:rStyle w:val="a9"/>
-            <w:sz w:val="20"/>
-            <w:szCs w:val="20"/>
           </w:rPr>
           <w:t>Table 16</w:t>
         </w:r>
       </w:hyperlink>
       <w:r>
-        <w:rPr>
-          <w:sz w:val="20"/>
-          <w:szCs w:val="20"/>
-        </w:rPr>
         <w:t>.</w:t>
       </w:r>
     </w:p>
     <w:p>
       <w:pPr>
         <w:pStyle w:val="2"/>
-        <w:rPr>
-          <w:sz w:val="18"/>
-          <w:szCs w:val="18"/>
-        </w:rPr>
       </w:pPr>
       <w:bookmarkStart w:id="68" w:name="sec_4_4"/>
-      <w:bookmarkStart w:id="69" w:name="_Toc242478606"/>
-      <w:r>
-        <w:rPr>
-          <w:sz w:val="20"/>
-        </w:rPr>
+      <w:bookmarkStart w:id="69" w:name="_Toc242479089"/>
+      <w:r>
         <w:t>Slack, fallbacks and contingency</w:t>
       </w:r>
       <w:bookmarkEnd w:id="68"/>
@@ -6827,167 +5586,101 @@
     <w:p>
       <w:pPr>
         <w:pStyle w:val="ReportNormal"/>
-        <w:rPr>
-          <w:sz w:val="18"/>
-          <w:szCs w:val="18"/>
-        </w:rPr>
       </w:pPr>
       <w:hyperlink w:anchor="figure_13" w:history="1">
         <w:r>
           <w:rPr>
             <w:rStyle w:val="a9"/>
-            <w:sz w:val="20"/>
-            <w:szCs w:val="20"/>
           </w:rPr>
           <w:t>Figure 13</w:t>
         </w:r>
       </w:hyperlink>
       <w:r>
-        <w:rPr>
-          <w:sz w:val="20"/>
-          <w:szCs w:val="20"/>
-        </w:rPr>
         <w:t xml:space="preserve"> compares each sprint's planned load with what was completed, against the team's capacity band. Weeks 9 and 10 are planned near the middle of the band; Week 11 is deliberately light because no sprint follows it, and that spare capacity is the plan's fall-back space. </w:t>
       </w:r>
       <w:hyperlink w:anchor="table_18" w:history="1">
         <w:r>
           <w:rPr>
             <w:rStyle w:val="a9"/>
-            <w:sz w:val="20"/>
-            <w:szCs w:val="20"/>
           </w:rPr>
           <w:t>Table 18</w:t>
         </w:r>
       </w:hyperlink>
       <w:r>
-        <w:rPr>
-          <w:sz w:val="20"/>
-          <w:szCs w:val="20"/>
-        </w:rPr>
         <w:t xml:space="preserve"> names, for each likely slip, the fallback and where the work goes.</w:t>
       </w:r>
     </w:p>
     <w:p>
       <w:pPr>
         <w:pStyle w:val="ReportNormal"/>
-        <w:rPr>
-          <w:sz w:val="18"/>
-          <w:szCs w:val="18"/>
-        </w:rPr>
-      </w:pPr>
-      <w:r>
-        <w:rPr>
-          <w:sz w:val="20"/>
-          <w:szCs w:val="20"/>
-        </w:rPr>
+      </w:pPr>
+      <w:r>
         <w:t>At every weekly meeting the team applies three replanning rules:</w:t>
       </w:r>
     </w:p>
     <w:p>
       <w:pPr>
         <w:pStyle w:val="PhDBullet"/>
-        <w:rPr>
-          <w:sz w:val="18"/>
-          <w:szCs w:val="18"/>
-        </w:rPr>
       </w:pPr>
       <w:r>
         <w:rPr>
           <w:b/>
           <w:bCs/>
-          <w:sz w:val="20"/>
-          <w:szCs w:val="20"/>
         </w:rPr>
         <w:t>Rule 1:</w:t>
       </w:r>
       <w:r>
-        <w:rPr>
-          <w:sz w:val="20"/>
-          <w:szCs w:val="20"/>
-        </w:rPr>
         <w:t xml:space="preserve"> mark finished tickets done, verified against main.</w:t>
       </w:r>
     </w:p>
     <w:p>
       <w:pPr>
         <w:pStyle w:val="PhDBullet"/>
-        <w:rPr>
-          <w:sz w:val="18"/>
-          <w:szCs w:val="18"/>
-        </w:rPr>
       </w:pPr>
       <w:r>
         <w:rPr>
           <w:b/>
           <w:bCs/>
-          <w:sz w:val="20"/>
-          <w:szCs w:val="20"/>
         </w:rPr>
         <w:t>Rule 2:</w:t>
       </w:r>
       <w:r>
-        <w:rPr>
-          <w:sz w:val="20"/>
-          <w:szCs w:val="20"/>
-        </w:rPr>
         <w:t xml:space="preserve"> move unfinished tickets into the next week </w:t>
       </w:r>
       <w:r>
         <w:rPr>
           <w:i/>
           <w:iCs/>
-          <w:sz w:val="20"/>
-          <w:szCs w:val="20"/>
         </w:rPr>
         <w:t>before</w:t>
       </w:r>
       <w:r>
-        <w:rPr>
-          <w:sz w:val="20"/>
-          <w:szCs w:val="20"/>
-        </w:rPr>
         <w:t xml:space="preserve"> pulling in new work, and rebalance so each person carries 1.5–3.5u.</w:t>
       </w:r>
     </w:p>
     <w:p>
       <w:pPr>
         <w:pStyle w:val="PhDBullet"/>
-        <w:rPr>
-          <w:sz w:val="18"/>
-          <w:szCs w:val="18"/>
-        </w:rPr>
       </w:pPr>
       <w:r>
         <w:rPr>
           <w:b/>
           <w:bCs/>
-          <w:sz w:val="20"/>
-          <w:szCs w:val="20"/>
         </w:rPr>
         <w:t>Rule 3:</w:t>
       </w:r>
       <w:r>
-        <w:rPr>
-          <w:sz w:val="20"/>
-          <w:szCs w:val="20"/>
-        </w:rPr>
         <w:t xml:space="preserve"> if a client decision slips, the blocked group takes the fallback named in its roadmap row, pulled forward from a later week, and the blocked story returns at the first meeting after the answer.</w:t>
       </w:r>
     </w:p>
     <w:p>
       <w:pPr>
         <w:pStyle w:val="2"/>
-        <w:rPr>
-          <w:sz w:val="18"/>
-          <w:szCs w:val="18"/>
-        </w:rPr>
       </w:pPr>
       <w:bookmarkStart w:id="70" w:name="sec_4_5"/>
-      <w:bookmarkStart w:id="71" w:name="_Toc242478607"/>
-      <w:r>
-        <w:rPr>
-          <w:sz w:val="20"/>
-        </w:rPr>
+      <w:bookmarkStart w:id="71" w:name="_Toc242479090"/>
+      <w:r>
+        <w:lastRenderedPageBreak/>
         <w:t>Reporting and communication</w:t>
       </w:r>
       <w:bookmarkEnd w:id="70"/>
@@ -6996,119 +5689,70 @@
     <w:p>
       <w:pPr>
         <w:pStyle w:val="PhDBullet"/>
-        <w:rPr>
-          <w:sz w:val="18"/>
-          <w:szCs w:val="18"/>
-        </w:rPr>
       </w:pPr>
       <w:r>
         <w:rPr>
           <w:b/>
           <w:bCs/>
-          <w:sz w:val="20"/>
-          <w:szCs w:val="20"/>
         </w:rPr>
         <w:t>Weekly client meeting</w:t>
       </w:r>
       <w:r>
-        <w:rPr>
-          <w:sz w:val="20"/>
-          <w:szCs w:val="20"/>
-        </w:rPr>
         <w:t xml:space="preserve"> (Wednesday evening): progress since the last meeting, a demonstration of merged work, and open questions. Week 9's meeting on 14 October reviews F1 and the answers to #38 and #40.</w:t>
       </w:r>
     </w:p>
     <w:p>
       <w:pPr>
         <w:pStyle w:val="PhDBullet"/>
-        <w:rPr>
-          <w:sz w:val="18"/>
-          <w:szCs w:val="18"/>
-        </w:rPr>
       </w:pPr>
       <w:r>
         <w:rPr>
           <w:b/>
           <w:bCs/>
-          <w:sz w:val="20"/>
-          <w:szCs w:val="20"/>
         </w:rPr>
         <w:t>Client questions</w:t>
       </w:r>
       <w:r>
-        <w:rPr>
-          <w:sz w:val="20"/>
-          <w:szCs w:val="20"/>
-        </w:rPr>
         <w:t xml:space="preserve"> go to the repository as GitHub issues labelled QA; the issue thread is the record, and affected tickets and ADRs are updated the same day.</w:t>
       </w:r>
     </w:p>
     <w:p>
       <w:pPr>
         <w:pStyle w:val="PhDBullet"/>
-        <w:rPr>
-          <w:sz w:val="18"/>
-          <w:szCs w:val="18"/>
-        </w:rPr>
       </w:pPr>
       <w:r>
         <w:rPr>
           <w:b/>
           <w:bCs/>
-          <w:sz w:val="20"/>
-          <w:szCs w:val="20"/>
         </w:rPr>
         <w:t>Internal tracking:</w:t>
       </w:r>
       <w:r>
-        <w:rPr>
-          <w:sz w:val="20"/>
-          <w:szCs w:val="20"/>
-        </w:rPr>
         <w:t xml:space="preserve"> the Jira board and contribution tracker are reconciled with main weekly, and the client-facing backlog page is refreshed after each reconciliation.</w:t>
       </w:r>
     </w:p>
     <w:p>
       <w:pPr>
         <w:pStyle w:val="PhDBullet"/>
-        <w:rPr>
-          <w:sz w:val="18"/>
-          <w:szCs w:val="18"/>
-        </w:rPr>
       </w:pPr>
       <w:r>
         <w:rPr>
           <w:b/>
           <w:bCs/>
-          <w:sz w:val="20"/>
-          <w:szCs w:val="20"/>
         </w:rPr>
-        <w:lastRenderedPageBreak/>
         <w:t>Assessed milestones ahead:</w:t>
       </w:r>
       <w:r>
-        <w:rPr>
-          <w:sz w:val="20"/>
-          <w:szCs w:val="20"/>
-        </w:rPr>
         <w:t xml:space="preserve"> Status Report 3 with the demonstration (Week 12); the final presentation, final report and technical report (Week 13).</w:t>
       </w:r>
     </w:p>
     <w:p>
       <w:pPr>
         <w:pStyle w:val="1"/>
-        <w:rPr>
-          <w:sz w:val="22"/>
-          <w:szCs w:val="22"/>
-        </w:rPr>
       </w:pPr>
       <w:bookmarkStart w:id="72" w:name="sec_5"/>
-      <w:bookmarkStart w:id="73" w:name="_Toc242478608"/>
-      <w:r>
-        <w:rPr>
-          <w:sz w:val="24"/>
-          <w:szCs w:val="24"/>
-        </w:rPr>
+      <w:bookmarkStart w:id="73" w:name="_Toc242479091"/>
+      <w:r>
         <w:t>Acknowledgement of AI Use</w:t>
       </w:r>
       <w:bookmarkEnd w:id="72"/>
@@ -7117,48 +5761,24 @@
     <w:p>
       <w:pPr>
         <w:pStyle w:val="ReportNormal"/>
-        <w:rPr>
-          <w:sz w:val="18"/>
-          <w:szCs w:val="18"/>
-        </w:rPr>
-      </w:pPr>
-      <w:r>
-        <w:rPr>
-          <w:sz w:val="20"/>
-          <w:szCs w:val="20"/>
-        </w:rPr>
+      </w:pPr>
+      <w:r>
         <w:t xml:space="preserve">Our team used Claude and ChatGPT as supportive tools throughout this assignment. These tools were selected for their interactive format, which complemented our team's learning and problem-solving process. </w:t>
       </w:r>
     </w:p>
     <w:p>
       <w:pPr>
         <w:pStyle w:val="ReportNormal"/>
-        <w:rPr>
-          <w:sz w:val="18"/>
-          <w:szCs w:val="18"/>
-        </w:rPr>
-      </w:pPr>
-      <w:r>
-        <w:rPr>
-          <w:sz w:val="20"/>
-          <w:szCs w:val="20"/>
-        </w:rPr>
+      </w:pPr>
+      <w:r>
         <w:t xml:space="preserve">Each team member led their respective sections independently, using AI where helpful to clarify concepts, support implementation, and refine written communication. Multiple iterations took place naturally as part of each member's workflow. </w:t>
       </w:r>
     </w:p>
     <w:p>
       <w:pPr>
         <w:pStyle w:val="ReportNormal"/>
-        <w:rPr>
-          <w:sz w:val="18"/>
-          <w:szCs w:val="18"/>
-        </w:rPr>
-      </w:pPr>
-      <w:r>
-        <w:rPr>
-          <w:sz w:val="20"/>
-          <w:szCs w:val="20"/>
-        </w:rPr>
+      </w:pPr>
+      <w:r>
         <w:t>All ideas, decisions, and content were driven by each team member. AI suggestions were interpreted, adapted, and validated based on each member's own understanding before being incorporated into any part of the work. The team took full responsibility for learning and led all aspects of the assignment. All final deliverables reflect the team's own understanding and judgement.</w:t>
       </w:r>
     </w:p>
@@ -7169,13 +5789,9 @@
           <w:bCs/>
           <w:smallCaps/>
           <w:spacing w:val="-4"/>
-          <w:szCs w:val="24"/>
         </w:rPr>
       </w:pPr>
       <w:r>
-        <w:rPr>
-          <w:sz w:val="20"/>
-        </w:rPr>
         <w:br w:type="page"/>
       </w:r>
     </w:p>
@@ -7183,7 +5799,7 @@
       <w:pPr>
         <w:pStyle w:val="PhDAppendicesBibliography"/>
       </w:pPr>
-      <w:bookmarkStart w:id="74" w:name="_Toc242478609"/>
+      <w:bookmarkStart w:id="74" w:name="_Toc242479092"/>
       <w:r>
         <w:lastRenderedPageBreak/>
         <w:t>Appendix A. Figures and Tables</w:t>
@@ -7202,7 +5818,7 @@
       <w:pPr>
         <w:pStyle w:val="PhDAppendixSub-heading"/>
       </w:pPr>
-      <w:bookmarkStart w:id="75" w:name="_Toc242478610"/>
+      <w:bookmarkStart w:id="75" w:name="_Toc242479093"/>
       <w:r>
         <w:t>A.1 Progress and achievements</w:t>
       </w:r>
@@ -16180,7 +14796,7 @@
       <w:pPr>
         <w:pStyle w:val="PhDAppendixSub-heading"/>
       </w:pPr>
-      <w:bookmarkStart w:id="98" w:name="_Toc242478611"/>
+      <w:bookmarkStart w:id="98" w:name="_Toc242479094"/>
       <w:r>
         <w:lastRenderedPageBreak/>
         <w:t>A.2 Obstacles</w:t>
@@ -22200,7 +20816,7 @@
       <w:pPr>
         <w:pStyle w:val="PhDAppendixSub-heading"/>
       </w:pPr>
-      <w:bookmarkStart w:id="104" w:name="_Toc242478612"/>
+      <w:bookmarkStart w:id="104" w:name="_Toc242479095"/>
       <w:r>
         <w:lastRenderedPageBreak/>
         <w:t>A.3 Deviation to timeline</w:t>
@@ -23879,7 +22495,7 @@
       <w:pPr>
         <w:pStyle w:val="PhDAppendixSub-heading"/>
       </w:pPr>
-      <w:bookmarkStart w:id="108" w:name="_Toc242478613"/>
+      <w:bookmarkStart w:id="108" w:name="_Toc242479096"/>
       <w:r>
         <w:t>A.4 Milestones and reporting</w:t>
       </w:r>
@@ -31947,7 +30563,7 @@
           <w:szCs w:val="22"/>
         </w:rPr>
       </w:pPr>
-      <w:bookmarkStart w:id="115" w:name="_Toc242478614"/>
+      <w:bookmarkStart w:id="115" w:name="_Toc242479097"/>
       <w:r>
         <w:rPr>
           <w:sz w:val="24"/>
@@ -32744,7 +31360,7 @@
           <w:szCs w:val="22"/>
         </w:rPr>
       </w:pPr>
-      <w:bookmarkStart w:id="116" w:name="_Toc242478615"/>
+      <w:bookmarkStart w:id="116" w:name="_Toc242479098"/>
       <w:r>
         <w:rPr>
           <w:sz w:val="24"/>

</xml_diff>

<commit_message>
docs: spell out deliverable references in the progress report tables
</commit_message>
<xml_diff>
--- a/info/CS57_Progress_Report.docx
+++ b/info/CS57_Progress_Report.docx
@@ -283,7 +283,7 @@
       <w:pPr>
         <w:pStyle w:val="PhDPreliminaryHeading"/>
       </w:pPr>
-      <w:bookmarkStart w:id="0" w:name="_Toc242480519"/>
+      <w:bookmarkStart w:id="0" w:name="_Toc242480811"/>
       <w:r>
         <w:lastRenderedPageBreak/>
         <w:t>Table of Contents</w:t>
@@ -329,7 +329,7 @@
         </w:rPr>
         <w:fldChar w:fldCharType="separate"/>
       </w:r>
-      <w:hyperlink w:anchor="_Toc242480519" w:history="1">
+      <w:hyperlink w:anchor="_Toc242480811" w:history="1">
         <w:r>
           <w:rPr>
             <w:rStyle w:val="a9"/>
@@ -352,7 +352,7 @@
           <w:rPr>
             <w:webHidden/>
           </w:rPr>
-          <w:instrText xml:space="preserve"> PAGEREF _Toc242480519 \h </w:instrText>
+          <w:instrText xml:space="preserve"> PAGEREF _Toc242480811 \h </w:instrText>
         </w:r>
         <w:r>
           <w:rPr>
@@ -395,7 +395,7 @@
           <w14:ligatures w14:val="standardContextual"/>
         </w:rPr>
       </w:pPr>
-      <w:hyperlink w:anchor="_Toc242480520" w:history="1">
+      <w:hyperlink w:anchor="_Toc242480812" w:history="1">
         <w:r>
           <w:rPr>
             <w:rStyle w:val="a9"/>
@@ -444,7 +444,7 @@
             <w:noProof/>
             <w:webHidden/>
           </w:rPr>
-          <w:instrText xml:space="preserve"> PAGEREF _Toc242480520 \h </w:instrText>
+          <w:instrText xml:space="preserve"> PAGEREF _Toc242480812 \h </w:instrText>
         </w:r>
         <w:r>
           <w:rPr>
@@ -487,7 +487,7 @@
           <w14:ligatures w14:val="standardContextual"/>
         </w:rPr>
       </w:pPr>
-      <w:hyperlink w:anchor="_Toc242480521" w:history="1">
+      <w:hyperlink w:anchor="_Toc242480813" w:history="1">
         <w:r>
           <w:rPr>
             <w:rStyle w:val="a9"/>
@@ -527,7 +527,7 @@
           <w:rPr>
             <w:webHidden/>
           </w:rPr>
-          <w:instrText xml:space="preserve"> PAGEREF _Toc242480521 \h </w:instrText>
+          <w:instrText xml:space="preserve"> PAGEREF _Toc242480813 \h </w:instrText>
         </w:r>
         <w:r>
           <w:rPr>
@@ -566,7 +566,7 @@
           <w14:ligatures w14:val="standardContextual"/>
         </w:rPr>
       </w:pPr>
-      <w:hyperlink w:anchor="_Toc242480522" w:history="1">
+      <w:hyperlink w:anchor="_Toc242480814" w:history="1">
         <w:r>
           <w:rPr>
             <w:rStyle w:val="a9"/>
@@ -606,7 +606,7 @@
           <w:rPr>
             <w:webHidden/>
           </w:rPr>
-          <w:instrText xml:space="preserve"> PAGEREF _Toc242480522 \h </w:instrText>
+          <w:instrText xml:space="preserve"> PAGEREF _Toc242480814 \h </w:instrText>
         </w:r>
         <w:r>
           <w:rPr>
@@ -645,7 +645,7 @@
           <w14:ligatures w14:val="standardContextual"/>
         </w:rPr>
       </w:pPr>
-      <w:hyperlink w:anchor="_Toc242480523" w:history="1">
+      <w:hyperlink w:anchor="_Toc242480815" w:history="1">
         <w:r>
           <w:rPr>
             <w:rStyle w:val="a9"/>
@@ -685,7 +685,7 @@
           <w:rPr>
             <w:webHidden/>
           </w:rPr>
-          <w:instrText xml:space="preserve"> PAGEREF _Toc242480523 \h </w:instrText>
+          <w:instrText xml:space="preserve"> PAGEREF _Toc242480815 \h </w:instrText>
         </w:r>
         <w:r>
           <w:rPr>
@@ -724,7 +724,7 @@
           <w14:ligatures w14:val="standardContextual"/>
         </w:rPr>
       </w:pPr>
-      <w:hyperlink w:anchor="_Toc242480524" w:history="1">
+      <w:hyperlink w:anchor="_Toc242480816" w:history="1">
         <w:r>
           <w:rPr>
             <w:rStyle w:val="a9"/>
@@ -764,7 +764,7 @@
           <w:rPr>
             <w:webHidden/>
           </w:rPr>
-          <w:instrText xml:space="preserve"> PAGEREF _Toc242480524 \h </w:instrText>
+          <w:instrText xml:space="preserve"> PAGEREF _Toc242480816 \h </w:instrText>
         </w:r>
         <w:r>
           <w:rPr>
@@ -803,7 +803,7 @@
           <w14:ligatures w14:val="standardContextual"/>
         </w:rPr>
       </w:pPr>
-      <w:hyperlink w:anchor="_Toc242480525" w:history="1">
+      <w:hyperlink w:anchor="_Toc242480817" w:history="1">
         <w:r>
           <w:rPr>
             <w:rStyle w:val="a9"/>
@@ -843,7 +843,7 @@
           <w:rPr>
             <w:webHidden/>
           </w:rPr>
-          <w:instrText xml:space="preserve"> PAGEREF _Toc242480525 \h </w:instrText>
+          <w:instrText xml:space="preserve"> PAGEREF _Toc242480817 \h </w:instrText>
         </w:r>
         <w:r>
           <w:rPr>
@@ -882,7 +882,7 @@
           <w14:ligatures w14:val="standardContextual"/>
         </w:rPr>
       </w:pPr>
-      <w:hyperlink w:anchor="_Toc242480526" w:history="1">
+      <w:hyperlink w:anchor="_Toc242480818" w:history="1">
         <w:r>
           <w:rPr>
             <w:rStyle w:val="a9"/>
@@ -922,7 +922,7 @@
           <w:rPr>
             <w:webHidden/>
           </w:rPr>
-          <w:instrText xml:space="preserve"> PAGEREF _Toc242480526 \h </w:instrText>
+          <w:instrText xml:space="preserve"> PAGEREF _Toc242480818 \h </w:instrText>
         </w:r>
         <w:r>
           <w:rPr>
@@ -961,7 +961,7 @@
           <w14:ligatures w14:val="standardContextual"/>
         </w:rPr>
       </w:pPr>
-      <w:hyperlink w:anchor="_Toc242480527" w:history="1">
+      <w:hyperlink w:anchor="_Toc242480819" w:history="1">
         <w:r>
           <w:rPr>
             <w:rStyle w:val="a9"/>
@@ -1001,7 +1001,7 @@
           <w:rPr>
             <w:webHidden/>
           </w:rPr>
-          <w:instrText xml:space="preserve"> PAGEREF _Toc242480527 \h </w:instrText>
+          <w:instrText xml:space="preserve"> PAGEREF _Toc242480819 \h </w:instrText>
         </w:r>
         <w:r>
           <w:rPr>
@@ -1040,7 +1040,7 @@
           <w14:ligatures w14:val="standardContextual"/>
         </w:rPr>
       </w:pPr>
-      <w:hyperlink w:anchor="_Toc242480528" w:history="1">
+      <w:hyperlink w:anchor="_Toc242480820" w:history="1">
         <w:r>
           <w:rPr>
             <w:rStyle w:val="a9"/>
@@ -1080,7 +1080,7 @@
           <w:rPr>
             <w:webHidden/>
           </w:rPr>
-          <w:instrText xml:space="preserve"> PAGEREF _Toc242480528 \h </w:instrText>
+          <w:instrText xml:space="preserve"> PAGEREF _Toc242480820 \h </w:instrText>
         </w:r>
         <w:r>
           <w:rPr>
@@ -1119,7 +1119,7 @@
           <w14:ligatures w14:val="standardContextual"/>
         </w:rPr>
       </w:pPr>
-      <w:hyperlink w:anchor="_Toc242480529" w:history="1">
+      <w:hyperlink w:anchor="_Toc242480821" w:history="1">
         <w:r>
           <w:rPr>
             <w:rStyle w:val="a9"/>
@@ -1159,7 +1159,7 @@
           <w:rPr>
             <w:webHidden/>
           </w:rPr>
-          <w:instrText xml:space="preserve"> PAGEREF _Toc242480529 \h </w:instrText>
+          <w:instrText xml:space="preserve"> PAGEREF _Toc242480821 \h </w:instrText>
         </w:r>
         <w:r>
           <w:rPr>
@@ -1198,7 +1198,7 @@
           <w14:ligatures w14:val="standardContextual"/>
         </w:rPr>
       </w:pPr>
-      <w:hyperlink w:anchor="_Toc242480530" w:history="1">
+      <w:hyperlink w:anchor="_Toc242480822" w:history="1">
         <w:r>
           <w:rPr>
             <w:rStyle w:val="a9"/>
@@ -1238,7 +1238,7 @@
           <w:rPr>
             <w:webHidden/>
           </w:rPr>
-          <w:instrText xml:space="preserve"> PAGEREF _Toc242480530 \h </w:instrText>
+          <w:instrText xml:space="preserve"> PAGEREF _Toc242480822 \h </w:instrText>
         </w:r>
         <w:r>
           <w:rPr>
@@ -1277,7 +1277,7 @@
           <w14:ligatures w14:val="standardContextual"/>
         </w:rPr>
       </w:pPr>
-      <w:hyperlink w:anchor="_Toc242480531" w:history="1">
+      <w:hyperlink w:anchor="_Toc242480823" w:history="1">
         <w:r>
           <w:rPr>
             <w:rStyle w:val="a9"/>
@@ -1317,7 +1317,7 @@
           <w:rPr>
             <w:webHidden/>
           </w:rPr>
-          <w:instrText xml:space="preserve"> PAGEREF _Toc242480531 \h </w:instrText>
+          <w:instrText xml:space="preserve"> PAGEREF _Toc242480823 \h </w:instrText>
         </w:r>
         <w:r>
           <w:rPr>
@@ -1356,7 +1356,7 @@
           <w14:ligatures w14:val="standardContextual"/>
         </w:rPr>
       </w:pPr>
-      <w:hyperlink w:anchor="_Toc242480532" w:history="1">
+      <w:hyperlink w:anchor="_Toc242480824" w:history="1">
         <w:r>
           <w:rPr>
             <w:rStyle w:val="a9"/>
@@ -1396,7 +1396,7 @@
           <w:rPr>
             <w:webHidden/>
           </w:rPr>
-          <w:instrText xml:space="preserve"> PAGEREF _Toc242480532 \h </w:instrText>
+          <w:instrText xml:space="preserve"> PAGEREF _Toc242480824 \h </w:instrText>
         </w:r>
         <w:r>
           <w:rPr>
@@ -1435,7 +1435,7 @@
           <w14:ligatures w14:val="standardContextual"/>
         </w:rPr>
       </w:pPr>
-      <w:hyperlink w:anchor="_Toc242480533" w:history="1">
+      <w:hyperlink w:anchor="_Toc242480825" w:history="1">
         <w:r>
           <w:rPr>
             <w:rStyle w:val="a9"/>
@@ -1475,7 +1475,7 @@
           <w:rPr>
             <w:webHidden/>
           </w:rPr>
-          <w:instrText xml:space="preserve"> PAGEREF _Toc242480533 \h </w:instrText>
+          <w:instrText xml:space="preserve"> PAGEREF _Toc242480825 \h </w:instrText>
         </w:r>
         <w:r>
           <w:rPr>
@@ -1514,7 +1514,7 @@
           <w14:ligatures w14:val="standardContextual"/>
         </w:rPr>
       </w:pPr>
-      <w:hyperlink w:anchor="_Toc242480534" w:history="1">
+      <w:hyperlink w:anchor="_Toc242480826" w:history="1">
         <w:r>
           <w:rPr>
             <w:rStyle w:val="a9"/>
@@ -1554,7 +1554,7 @@
           <w:rPr>
             <w:webHidden/>
           </w:rPr>
-          <w:instrText xml:space="preserve"> PAGEREF _Toc242480534 \h </w:instrText>
+          <w:instrText xml:space="preserve"> PAGEREF _Toc242480826 \h </w:instrText>
         </w:r>
         <w:r>
           <w:rPr>
@@ -1593,7 +1593,7 @@
           <w14:ligatures w14:val="standardContextual"/>
         </w:rPr>
       </w:pPr>
-      <w:hyperlink w:anchor="_Toc242480535" w:history="1">
+      <w:hyperlink w:anchor="_Toc242480827" w:history="1">
         <w:r>
           <w:rPr>
             <w:rStyle w:val="a9"/>
@@ -1633,7 +1633,7 @@
           <w:rPr>
             <w:webHidden/>
           </w:rPr>
-          <w:instrText xml:space="preserve"> PAGEREF _Toc242480535 \h </w:instrText>
+          <w:instrText xml:space="preserve"> PAGEREF _Toc242480827 \h </w:instrText>
         </w:r>
         <w:r>
           <w:rPr>
@@ -1672,7 +1672,7 @@
           <w14:ligatures w14:val="standardContextual"/>
         </w:rPr>
       </w:pPr>
-      <w:hyperlink w:anchor="_Toc242480536" w:history="1">
+      <w:hyperlink w:anchor="_Toc242480828" w:history="1">
         <w:r>
           <w:rPr>
             <w:rStyle w:val="a9"/>
@@ -1712,7 +1712,7 @@
           <w:rPr>
             <w:webHidden/>
           </w:rPr>
-          <w:instrText xml:space="preserve"> PAGEREF _Toc242480536 \h </w:instrText>
+          <w:instrText xml:space="preserve"> PAGEREF _Toc242480828 \h </w:instrText>
         </w:r>
         <w:r>
           <w:rPr>
@@ -1751,7 +1751,7 @@
           <w14:ligatures w14:val="standardContextual"/>
         </w:rPr>
       </w:pPr>
-      <w:hyperlink w:anchor="_Toc242480537" w:history="1">
+      <w:hyperlink w:anchor="_Toc242480829" w:history="1">
         <w:r>
           <w:rPr>
             <w:rStyle w:val="a9"/>
@@ -1791,7 +1791,7 @@
           <w:rPr>
             <w:webHidden/>
           </w:rPr>
-          <w:instrText xml:space="preserve"> PAGEREF _Toc242480537 \h </w:instrText>
+          <w:instrText xml:space="preserve"> PAGEREF _Toc242480829 \h </w:instrText>
         </w:r>
         <w:r>
           <w:rPr>
@@ -1830,7 +1830,7 @@
           <w14:ligatures w14:val="standardContextual"/>
         </w:rPr>
       </w:pPr>
-      <w:hyperlink w:anchor="_Toc242480538" w:history="1">
+      <w:hyperlink w:anchor="_Toc242480830" w:history="1">
         <w:r>
           <w:rPr>
             <w:rStyle w:val="a9"/>
@@ -1870,7 +1870,7 @@
           <w:rPr>
             <w:webHidden/>
           </w:rPr>
-          <w:instrText xml:space="preserve"> PAGEREF _Toc242480538 \h </w:instrText>
+          <w:instrText xml:space="preserve"> PAGEREF _Toc242480830 \h </w:instrText>
         </w:r>
         <w:r>
           <w:rPr>
@@ -1909,7 +1909,7 @@
           <w14:ligatures w14:val="standardContextual"/>
         </w:rPr>
       </w:pPr>
-      <w:hyperlink w:anchor="_Toc242480539" w:history="1">
+      <w:hyperlink w:anchor="_Toc242480831" w:history="1">
         <w:r>
           <w:rPr>
             <w:rStyle w:val="a9"/>
@@ -1949,7 +1949,7 @@
           <w:rPr>
             <w:webHidden/>
           </w:rPr>
-          <w:instrText xml:space="preserve"> PAGEREF _Toc242480539 \h </w:instrText>
+          <w:instrText xml:space="preserve"> PAGEREF _Toc242480831 \h </w:instrText>
         </w:r>
         <w:r>
           <w:rPr>
@@ -1992,7 +1992,7 @@
           <w14:ligatures w14:val="standardContextual"/>
         </w:rPr>
       </w:pPr>
-      <w:hyperlink w:anchor="_Toc242480540" w:history="1">
+      <w:hyperlink w:anchor="_Toc242480832" w:history="1">
         <w:r>
           <w:rPr>
             <w:rStyle w:val="a9"/>
@@ -2041,7 +2041,7 @@
             <w:noProof/>
             <w:webHidden/>
           </w:rPr>
-          <w:instrText xml:space="preserve"> PAGEREF _Toc242480540 \h </w:instrText>
+          <w:instrText xml:space="preserve"> PAGEREF _Toc242480832 \h </w:instrText>
         </w:r>
         <w:r>
           <w:rPr>
@@ -2084,7 +2084,7 @@
           <w14:ligatures w14:val="standardContextual"/>
         </w:rPr>
       </w:pPr>
-      <w:hyperlink w:anchor="_Toc242480541" w:history="1">
+      <w:hyperlink w:anchor="_Toc242480833" w:history="1">
         <w:r>
           <w:rPr>
             <w:rStyle w:val="a9"/>
@@ -2124,7 +2124,7 @@
           <w:rPr>
             <w:webHidden/>
           </w:rPr>
-          <w:instrText xml:space="preserve"> PAGEREF _Toc242480541 \h </w:instrText>
+          <w:instrText xml:space="preserve"> PAGEREF _Toc242480833 \h </w:instrText>
         </w:r>
         <w:r>
           <w:rPr>
@@ -2163,7 +2163,7 @@
           <w14:ligatures w14:val="standardContextual"/>
         </w:rPr>
       </w:pPr>
-      <w:hyperlink w:anchor="_Toc242480542" w:history="1">
+      <w:hyperlink w:anchor="_Toc242480834" w:history="1">
         <w:r>
           <w:rPr>
             <w:rStyle w:val="a9"/>
@@ -2203,7 +2203,7 @@
           <w:rPr>
             <w:webHidden/>
           </w:rPr>
-          <w:instrText xml:space="preserve"> PAGEREF _Toc242480542 \h </w:instrText>
+          <w:instrText xml:space="preserve"> PAGEREF _Toc242480834 \h </w:instrText>
         </w:r>
         <w:r>
           <w:rPr>
@@ -2242,7 +2242,7 @@
           <w14:ligatures w14:val="standardContextual"/>
         </w:rPr>
       </w:pPr>
-      <w:hyperlink w:anchor="_Toc242480543" w:history="1">
+      <w:hyperlink w:anchor="_Toc242480835" w:history="1">
         <w:r>
           <w:rPr>
             <w:rStyle w:val="a9"/>
@@ -2282,7 +2282,7 @@
           <w:rPr>
             <w:webHidden/>
           </w:rPr>
-          <w:instrText xml:space="preserve"> PAGEREF _Toc242480543 \h </w:instrText>
+          <w:instrText xml:space="preserve"> PAGEREF _Toc242480835 \h </w:instrText>
         </w:r>
         <w:r>
           <w:rPr>
@@ -2321,7 +2321,7 @@
           <w14:ligatures w14:val="standardContextual"/>
         </w:rPr>
       </w:pPr>
-      <w:hyperlink w:anchor="_Toc242480544" w:history="1">
+      <w:hyperlink w:anchor="_Toc242480836" w:history="1">
         <w:r>
           <w:rPr>
             <w:rStyle w:val="a9"/>
@@ -2361,7 +2361,7 @@
           <w:rPr>
             <w:webHidden/>
           </w:rPr>
-          <w:instrText xml:space="preserve"> PAGEREF _Toc242480544 \h </w:instrText>
+          <w:instrText xml:space="preserve"> PAGEREF _Toc242480836 \h </w:instrText>
         </w:r>
         <w:r>
           <w:rPr>
@@ -2404,7 +2404,7 @@
           <w14:ligatures w14:val="standardContextual"/>
         </w:rPr>
       </w:pPr>
-      <w:hyperlink w:anchor="_Toc242480545" w:history="1">
+      <w:hyperlink w:anchor="_Toc242480837" w:history="1">
         <w:r>
           <w:rPr>
             <w:rStyle w:val="a9"/>
@@ -2453,7 +2453,7 @@
             <w:noProof/>
             <w:webHidden/>
           </w:rPr>
-          <w:instrText xml:space="preserve"> PAGEREF _Toc242480545 \h </w:instrText>
+          <w:instrText xml:space="preserve"> PAGEREF _Toc242480837 \h </w:instrText>
         </w:r>
         <w:r>
           <w:rPr>
@@ -2496,7 +2496,7 @@
           <w14:ligatures w14:val="standardContextual"/>
         </w:rPr>
       </w:pPr>
-      <w:hyperlink w:anchor="_Toc242480546" w:history="1">
+      <w:hyperlink w:anchor="_Toc242480838" w:history="1">
         <w:r>
           <w:rPr>
             <w:rStyle w:val="a9"/>
@@ -2536,7 +2536,7 @@
           <w:rPr>
             <w:webHidden/>
           </w:rPr>
-          <w:instrText xml:space="preserve"> PAGEREF _Toc242480546 \h </w:instrText>
+          <w:instrText xml:space="preserve"> PAGEREF _Toc242480838 \h </w:instrText>
         </w:r>
         <w:r>
           <w:rPr>
@@ -2575,7 +2575,7 @@
           <w14:ligatures w14:val="standardContextual"/>
         </w:rPr>
       </w:pPr>
-      <w:hyperlink w:anchor="_Toc242480547" w:history="1">
+      <w:hyperlink w:anchor="_Toc242480839" w:history="1">
         <w:r>
           <w:rPr>
             <w:rStyle w:val="a9"/>
@@ -2615,7 +2615,7 @@
           <w:rPr>
             <w:webHidden/>
           </w:rPr>
-          <w:instrText xml:space="preserve"> PAGEREF _Toc242480547 \h </w:instrText>
+          <w:instrText xml:space="preserve"> PAGEREF _Toc242480839 \h </w:instrText>
         </w:r>
         <w:r>
           <w:rPr>
@@ -2654,7 +2654,7 @@
           <w14:ligatures w14:val="standardContextual"/>
         </w:rPr>
       </w:pPr>
-      <w:hyperlink w:anchor="_Toc242480548" w:history="1">
+      <w:hyperlink w:anchor="_Toc242480840" w:history="1">
         <w:r>
           <w:rPr>
             <w:rStyle w:val="a9"/>
@@ -2694,7 +2694,7 @@
           <w:rPr>
             <w:webHidden/>
           </w:rPr>
-          <w:instrText xml:space="preserve"> PAGEREF _Toc242480548 \h </w:instrText>
+          <w:instrText xml:space="preserve"> PAGEREF _Toc242480840 \h </w:instrText>
         </w:r>
         <w:r>
           <w:rPr>
@@ -2737,7 +2737,7 @@
           <w14:ligatures w14:val="standardContextual"/>
         </w:rPr>
       </w:pPr>
-      <w:hyperlink w:anchor="_Toc242480549" w:history="1">
+      <w:hyperlink w:anchor="_Toc242480841" w:history="1">
         <w:r>
           <w:rPr>
             <w:rStyle w:val="a9"/>
@@ -2786,7 +2786,7 @@
             <w:noProof/>
             <w:webHidden/>
           </w:rPr>
-          <w:instrText xml:space="preserve"> PAGEREF _Toc242480549 \h </w:instrText>
+          <w:instrText xml:space="preserve"> PAGEREF _Toc242480841 \h </w:instrText>
         </w:r>
         <w:r>
           <w:rPr>
@@ -2829,7 +2829,7 @@
           <w14:ligatures w14:val="standardContextual"/>
         </w:rPr>
       </w:pPr>
-      <w:hyperlink w:anchor="_Toc242480550" w:history="1">
+      <w:hyperlink w:anchor="_Toc242480842" w:history="1">
         <w:r>
           <w:rPr>
             <w:rStyle w:val="a9"/>
@@ -2869,7 +2869,7 @@
           <w:rPr>
             <w:webHidden/>
           </w:rPr>
-          <w:instrText xml:space="preserve"> PAGEREF _Toc242480550 \h </w:instrText>
+          <w:instrText xml:space="preserve"> PAGEREF _Toc242480842 \h </w:instrText>
         </w:r>
         <w:r>
           <w:rPr>
@@ -2908,7 +2908,7 @@
           <w14:ligatures w14:val="standardContextual"/>
         </w:rPr>
       </w:pPr>
-      <w:hyperlink w:anchor="_Toc242480551" w:history="1">
+      <w:hyperlink w:anchor="_Toc242480843" w:history="1">
         <w:r>
           <w:rPr>
             <w:rStyle w:val="a9"/>
@@ -2948,7 +2948,7 @@
           <w:rPr>
             <w:webHidden/>
           </w:rPr>
-          <w:instrText xml:space="preserve"> PAGEREF _Toc242480551 \h </w:instrText>
+          <w:instrText xml:space="preserve"> PAGEREF _Toc242480843 \h </w:instrText>
         </w:r>
         <w:r>
           <w:rPr>
@@ -2987,7 +2987,7 @@
           <w14:ligatures w14:val="standardContextual"/>
         </w:rPr>
       </w:pPr>
-      <w:hyperlink w:anchor="_Toc242480552" w:history="1">
+      <w:hyperlink w:anchor="_Toc242480844" w:history="1">
         <w:r>
           <w:rPr>
             <w:rStyle w:val="a9"/>
@@ -3027,7 +3027,7 @@
           <w:rPr>
             <w:webHidden/>
           </w:rPr>
-          <w:instrText xml:space="preserve"> PAGEREF _Toc242480552 \h </w:instrText>
+          <w:instrText xml:space="preserve"> PAGEREF _Toc242480844 \h </w:instrText>
         </w:r>
         <w:r>
           <w:rPr>
@@ -3066,7 +3066,7 @@
           <w14:ligatures w14:val="standardContextual"/>
         </w:rPr>
       </w:pPr>
-      <w:hyperlink w:anchor="_Toc242480553" w:history="1">
+      <w:hyperlink w:anchor="_Toc242480845" w:history="1">
         <w:r>
           <w:rPr>
             <w:rStyle w:val="a9"/>
@@ -3106,7 +3106,7 @@
           <w:rPr>
             <w:webHidden/>
           </w:rPr>
-          <w:instrText xml:space="preserve"> PAGEREF _Toc242480553 \h </w:instrText>
+          <w:instrText xml:space="preserve"> PAGEREF _Toc242480845 \h </w:instrText>
         </w:r>
         <w:r>
           <w:rPr>
@@ -3145,7 +3145,7 @@
           <w14:ligatures w14:val="standardContextual"/>
         </w:rPr>
       </w:pPr>
-      <w:hyperlink w:anchor="_Toc242480554" w:history="1">
+      <w:hyperlink w:anchor="_Toc242480846" w:history="1">
         <w:r>
           <w:rPr>
             <w:rStyle w:val="a9"/>
@@ -3185,7 +3185,7 @@
           <w:rPr>
             <w:webHidden/>
           </w:rPr>
-          <w:instrText xml:space="preserve"> PAGEREF _Toc242480554 \h </w:instrText>
+          <w:instrText xml:space="preserve"> PAGEREF _Toc242480846 \h </w:instrText>
         </w:r>
         <w:r>
           <w:rPr>
@@ -3228,7 +3228,7 @@
           <w14:ligatures w14:val="standardContextual"/>
         </w:rPr>
       </w:pPr>
-      <w:hyperlink w:anchor="_Toc242480555" w:history="1">
+      <w:hyperlink w:anchor="_Toc242480847" w:history="1">
         <w:r>
           <w:rPr>
             <w:rStyle w:val="a9"/>
@@ -3277,7 +3277,7 @@
             <w:noProof/>
             <w:webHidden/>
           </w:rPr>
-          <w:instrText xml:space="preserve"> PAGEREF _Toc242480555 \h </w:instrText>
+          <w:instrText xml:space="preserve"> PAGEREF _Toc242480847 \h </w:instrText>
         </w:r>
         <w:r>
           <w:rPr>
@@ -3324,7 +3324,7 @@
           <w14:ligatures w14:val="standardContextual"/>
         </w:rPr>
       </w:pPr>
-      <w:hyperlink w:anchor="_Toc242480556" w:history="1">
+      <w:hyperlink w:anchor="_Toc242480848" w:history="1">
         <w:r>
           <w:rPr>
             <w:rStyle w:val="a9"/>
@@ -3351,7 +3351,7 @@
             <w:noProof/>
             <w:webHidden/>
           </w:rPr>
-          <w:instrText xml:space="preserve"> PAGEREF _Toc242480556 \h </w:instrText>
+          <w:instrText xml:space="preserve"> PAGEREF _Toc242480848 \h </w:instrText>
         </w:r>
         <w:r>
           <w:rPr>
@@ -3394,7 +3394,7 @@
           <w14:ligatures w14:val="standardContextual"/>
         </w:rPr>
       </w:pPr>
-      <w:hyperlink w:anchor="_Toc242480557" w:history="1">
+      <w:hyperlink w:anchor="_Toc242480849" w:history="1">
         <w:r>
           <w:rPr>
             <w:rStyle w:val="a9"/>
@@ -3417,7 +3417,7 @@
           <w:rPr>
             <w:webHidden/>
           </w:rPr>
-          <w:instrText xml:space="preserve"> PAGEREF _Toc242480557 \h </w:instrText>
+          <w:instrText xml:space="preserve"> PAGEREF _Toc242480849 \h </w:instrText>
         </w:r>
         <w:r>
           <w:rPr>
@@ -3456,7 +3456,7 @@
           <w14:ligatures w14:val="standardContextual"/>
         </w:rPr>
       </w:pPr>
-      <w:hyperlink w:anchor="_Toc242480558" w:history="1">
+      <w:hyperlink w:anchor="_Toc242480850" w:history="1">
         <w:r>
           <w:rPr>
             <w:rStyle w:val="a9"/>
@@ -3479,7 +3479,7 @@
           <w:rPr>
             <w:webHidden/>
           </w:rPr>
-          <w:instrText xml:space="preserve"> PAGEREF _Toc242480558 \h </w:instrText>
+          <w:instrText xml:space="preserve"> PAGEREF _Toc242480850 \h </w:instrText>
         </w:r>
         <w:r>
           <w:rPr>
@@ -3518,7 +3518,7 @@
           <w14:ligatures w14:val="standardContextual"/>
         </w:rPr>
       </w:pPr>
-      <w:hyperlink w:anchor="_Toc242480559" w:history="1">
+      <w:hyperlink w:anchor="_Toc242480851" w:history="1">
         <w:r>
           <w:rPr>
             <w:rStyle w:val="a9"/>
@@ -3541,7 +3541,7 @@
           <w:rPr>
             <w:webHidden/>
           </w:rPr>
-          <w:instrText xml:space="preserve"> PAGEREF _Toc242480559 \h </w:instrText>
+          <w:instrText xml:space="preserve"> PAGEREF _Toc242480851 \h </w:instrText>
         </w:r>
         <w:r>
           <w:rPr>
@@ -3580,7 +3580,7 @@
           <w14:ligatures w14:val="standardContextual"/>
         </w:rPr>
       </w:pPr>
-      <w:hyperlink w:anchor="_Toc242480560" w:history="1">
+      <w:hyperlink w:anchor="_Toc242480852" w:history="1">
         <w:r>
           <w:rPr>
             <w:rStyle w:val="a9"/>
@@ -3603,7 +3603,7 @@
           <w:rPr>
             <w:webHidden/>
           </w:rPr>
-          <w:instrText xml:space="preserve"> PAGEREF _Toc242480560 \h </w:instrText>
+          <w:instrText xml:space="preserve"> PAGEREF _Toc242480852 \h </w:instrText>
         </w:r>
         <w:r>
           <w:rPr>
@@ -3646,7 +3646,7 @@
           <w14:ligatures w14:val="standardContextual"/>
         </w:rPr>
       </w:pPr>
-      <w:hyperlink w:anchor="_Toc242480561" w:history="1">
+      <w:hyperlink w:anchor="_Toc242480853" w:history="1">
         <w:r>
           <w:rPr>
             <w:rStyle w:val="a9"/>
@@ -3673,7 +3673,7 @@
             <w:noProof/>
             <w:webHidden/>
           </w:rPr>
-          <w:instrText xml:space="preserve"> PAGEREF _Toc242480561 \h </w:instrText>
+          <w:instrText xml:space="preserve"> PAGEREF _Toc242480853 \h </w:instrText>
         </w:r>
         <w:r>
           <w:rPr>
@@ -3720,7 +3720,7 @@
           <w14:ligatures w14:val="standardContextual"/>
         </w:rPr>
       </w:pPr>
-      <w:hyperlink w:anchor="_Toc242480562" w:history="1">
+      <w:hyperlink w:anchor="_Toc242480854" w:history="1">
         <w:r>
           <w:rPr>
             <w:rStyle w:val="a9"/>
@@ -3747,7 +3747,7 @@
             <w:noProof/>
             <w:webHidden/>
           </w:rPr>
-          <w:instrText xml:space="preserve"> PAGEREF _Toc242480562 \h </w:instrText>
+          <w:instrText xml:space="preserve"> PAGEREF _Toc242480854 \h </w:instrText>
         </w:r>
         <w:r>
           <w:rPr>
@@ -3817,7 +3817,7 @@
         <w:pStyle w:val="1"/>
       </w:pPr>
       <w:bookmarkStart w:id="1" w:name="sec_1"/>
-      <w:bookmarkStart w:id="2" w:name="_Toc242480520"/>
+      <w:bookmarkStart w:id="2" w:name="_Toc242480812"/>
       <w:r>
         <w:lastRenderedPageBreak/>
         <w:t>Progress &amp; Achievements</w:t>
@@ -3848,7 +3848,7 @@
         <w:pStyle w:val="2"/>
       </w:pPr>
       <w:bookmarkStart w:id="3" w:name="sec_1_1"/>
-      <w:bookmarkStart w:id="4" w:name="_Toc242480521"/>
+      <w:bookmarkStart w:id="4" w:name="_Toc242480813"/>
       <w:r>
         <w:t>The project in brief</w:t>
       </w:r>
@@ -4063,7 +4063,7 @@
         <w:pStyle w:val="2"/>
       </w:pPr>
       <w:bookmarkStart w:id="6" w:name="sec_1_2"/>
-      <w:bookmarkStart w:id="7" w:name="_Toc242480522"/>
+      <w:bookmarkStart w:id="7" w:name="_Toc242480814"/>
       <w:r>
         <w:t>Summary: are we on track?</w:t>
       </w:r>
@@ -4811,7 +4811,7 @@
         <w:pStyle w:val="2"/>
       </w:pPr>
       <w:bookmarkStart w:id="10" w:name="sec_1_3"/>
-      <w:bookmarkStart w:id="11" w:name="_Toc242480523"/>
+      <w:bookmarkStart w:id="11" w:name="_Toc242480815"/>
       <w:r>
         <w:t>Who the platform is for</w:t>
       </w:r>
@@ -5964,7 +5964,7 @@
         <w:pStyle w:val="2"/>
       </w:pPr>
       <w:bookmarkStart w:id="14" w:name="sec_1_4"/>
-      <w:bookmarkStart w:id="15" w:name="_Toc242480524"/>
+      <w:bookmarkStart w:id="15" w:name="_Toc242480816"/>
       <w:r>
         <w:t>From user needs to sprints</w:t>
       </w:r>
@@ -6103,7 +6103,7 @@
         <w:pStyle w:val="2"/>
       </w:pPr>
       <w:bookmarkStart w:id="17" w:name="sec_1_5"/>
-      <w:bookmarkStart w:id="18" w:name="_Toc242480525"/>
+      <w:bookmarkStart w:id="18" w:name="_Toc242480817"/>
       <w:r>
         <w:t>Sprint by sprint: what was built and what was solved</w:t>
       </w:r>
@@ -6149,10 +6149,7 @@
       </w:pPr>
       <w:r>
         <w:lastRenderedPageBreak/>
-        <w:t>In brief: W6 (7–13 September) fixed governance and data integrity, closing the critical defects that let anyone edit another person's draft and let the legacy API rewrite approval history. W7 (14–23 September) locked finalised work, made submission atomic, moved the platform onto PostgreSQL with tests on both databases and built the AI batch worker, completing 19 of 20.5 planned units. W8 (24–30 September) routed work through role-checked queues and made each review name the submission it judges, which stop</w:t>
-      </w:r>
-      <w:r>
-        <w:t>ped reviewers being shown the wrong annotator's work (20.5 of 22 units). The mid-semester break added the evaluation harness, answer versions, reopening and a blind second review, and cut a 200-item page from 404 requests to 6–8 (15 of 19.5 units, the rest in review).</w:t>
+        <w:t>In brief: W6 (7–13 September) fixed governance and data integrity, closing the critical defects that let anyone edit another person's draft and let the legacy API rewrite approval history. W7 (14–23 September) locked finalised work, made submission atomic, moved the platform onto PostgreSQL with tests on both databases and built the AI batch worker, completing 19 of 20.5 planned units. W8 (24–30 September) routed work through role-checked queues and made each review name the submission it judges, which stopped reviewers being shown the wrong annotator's work (20.5 of 22 units). The mid-semester break added the evaluation harness, answer versions, reopening and a blind second review, and cut a 200-item page from 404 requests to 6–8 (15 of 19.5 units, the rest in review).</w:t>
       </w:r>
     </w:p>
     <w:p>
@@ -6160,7 +6157,7 @@
         <w:pStyle w:val="2"/>
       </w:pPr>
       <w:bookmarkStart w:id="19" w:name="sec_1_6"/>
-      <w:bookmarkStart w:id="20" w:name="_Toc242480526"/>
+      <w:bookmarkStart w:id="20" w:name="_Toc242480818"/>
       <w:r>
         <w:t>Front end: what each user can now do</w:t>
       </w:r>
@@ -6180,7 +6177,7 @@
         <w:pStyle w:val="3"/>
       </w:pPr>
       <w:bookmarkStart w:id="21" w:name="sec_1_6_1"/>
-      <w:bookmarkStart w:id="22" w:name="_Toc242480527"/>
+      <w:bookmarkStart w:id="22" w:name="_Toc242480819"/>
       <w:r>
         <w:t>Administrator and invitee</w:t>
       </w:r>
@@ -6271,7 +6268,7 @@
         <w:pStyle w:val="3"/>
       </w:pPr>
       <w:bookmarkStart w:id="23" w:name="sec_1_6_2"/>
-      <w:bookmarkStart w:id="24" w:name="_Toc242480528"/>
+      <w:bookmarkStart w:id="24" w:name="_Toc242480820"/>
       <w:r>
         <w:t>Project manager and task owner</w:t>
       </w:r>
@@ -6326,7 +6323,7 @@
         <w:pStyle w:val="3"/>
       </w:pPr>
       <w:bookmarkStart w:id="25" w:name="sec_1_6_3"/>
-      <w:bookmarkStart w:id="26" w:name="_Toc242480529"/>
+      <w:bookmarkStart w:id="26" w:name="_Toc242480821"/>
       <w:r>
         <w:t>Annotator</w:t>
       </w:r>
@@ -6360,7 +6357,7 @@
         <w:pStyle w:val="3"/>
       </w:pPr>
       <w:bookmarkStart w:id="27" w:name="sec_1_6_4"/>
-      <w:bookmarkStart w:id="28" w:name="_Toc242480530"/>
+      <w:bookmarkStart w:id="28" w:name="_Toc242480822"/>
       <w:r>
         <w:t>Reviewer</w:t>
       </w:r>
@@ -6470,7 +6467,7 @@
         <w:pStyle w:val="3"/>
       </w:pPr>
       <w:bookmarkStart w:id="30" w:name="sec_1_6_5"/>
-      <w:bookmarkStart w:id="31" w:name="_Toc242480531"/>
+      <w:bookmarkStart w:id="31" w:name="_Toc242480823"/>
       <w:r>
         <w:t>Expert</w:t>
       </w:r>
@@ -6646,7 +6643,7 @@
         <w:pStyle w:val="2"/>
       </w:pPr>
       <w:bookmarkStart w:id="34" w:name="sec_1_7"/>
-      <w:bookmarkStart w:id="35" w:name="_Toc242480532"/>
+      <w:bookmarkStart w:id="35" w:name="_Toc242480824"/>
       <w:r>
         <w:lastRenderedPageBreak/>
         <w:t>Back end and data</w:t>
@@ -6659,7 +6656,7 @@
         <w:pStyle w:val="3"/>
       </w:pPr>
       <w:bookmarkStart w:id="36" w:name="sec_1_7_1"/>
-      <w:bookmarkStart w:id="37" w:name="_Toc242480533"/>
+      <w:bookmarkStart w:id="37" w:name="_Toc242480825"/>
       <w:r>
         <w:t>The dataset</w:t>
       </w:r>
@@ -6730,7 +6727,7 @@
         <w:pStyle w:val="3"/>
       </w:pPr>
       <w:bookmarkStart w:id="38" w:name="sec_1_7_2"/>
-      <w:bookmarkStart w:id="39" w:name="_Toc242480534"/>
+      <w:bookmarkStart w:id="39" w:name="_Toc242480826"/>
       <w:r>
         <w:t>AI: external models, not trained by us</w:t>
       </w:r>
@@ -6757,7 +6754,7 @@
         <w:pStyle w:val="3"/>
       </w:pPr>
       <w:bookmarkStart w:id="40" w:name="sec_1_7_3"/>
-      <w:bookmarkStart w:id="41" w:name="_Toc242480535"/>
+      <w:bookmarkStart w:id="41" w:name="_Toc242480827"/>
       <w:r>
         <w:t>How the back end supports the front end</w:t>
       </w:r>
@@ -6829,7 +6826,7 @@
         <w:pStyle w:val="3"/>
       </w:pPr>
       <w:bookmarkStart w:id="42" w:name="sec_1_7_4"/>
-      <w:bookmarkStart w:id="43" w:name="_Toc242480536"/>
+      <w:bookmarkStart w:id="43" w:name="_Toc242480828"/>
       <w:r>
         <w:t>Back-end scripts and services used in operations</w:t>
       </w:r>
@@ -6872,7 +6869,7 @@
         <w:pStyle w:val="3"/>
       </w:pPr>
       <w:bookmarkStart w:id="44" w:name="sec_1_7_5"/>
-      <w:bookmarkStart w:id="45" w:name="_Toc242480537"/>
+      <w:bookmarkStart w:id="45" w:name="_Toc242480829"/>
       <w:r>
         <w:t>Records and quality</w:t>
       </w:r>
@@ -6898,7 +6895,7 @@
         <w:pStyle w:val="2"/>
       </w:pPr>
       <w:bookmarkStart w:id="46" w:name="sec_1_8"/>
-      <w:bookmarkStart w:id="47" w:name="_Toc242480538"/>
+      <w:bookmarkStart w:id="47" w:name="_Toc242480830"/>
       <w:r>
         <w:t>Deliverables and the MVP</w:t>
       </w:r>
@@ -6926,7 +6923,7 @@
         <w:pStyle w:val="3"/>
       </w:pPr>
       <w:bookmarkStart w:id="48" w:name="sec_1_8_1"/>
-      <w:bookmarkStart w:id="49" w:name="_Toc242480539"/>
+      <w:bookmarkStart w:id="49" w:name="_Toc242480831"/>
       <w:r>
         <w:t>The MVP: complete, tested and working</w:t>
       </w:r>
@@ -7870,7 +7867,7 @@
         <w:pStyle w:val="1"/>
       </w:pPr>
       <w:bookmarkStart w:id="51" w:name="sec_2"/>
-      <w:bookmarkStart w:id="52" w:name="_Toc242480540"/>
+      <w:bookmarkStart w:id="52" w:name="_Toc242480832"/>
       <w:r>
         <w:t>Obstacles</w:t>
       </w:r>
@@ -7940,7 +7937,7 @@
         <w:pStyle w:val="2"/>
       </w:pPr>
       <w:bookmarkStart w:id="53" w:name="sec_2_1"/>
-      <w:bookmarkStart w:id="54" w:name="_Toc242480541"/>
+      <w:bookmarkStart w:id="54" w:name="_Toc242480833"/>
       <w:r>
         <w:t>Obstacles met so far</w:t>
       </w:r>
@@ -7964,13 +7961,7 @@
       </w:r>
       <w:r>
         <w:lastRenderedPageBreak/>
-        <w:t>as features were built (O3), so tickets were rescoped mid-work and four stories were adde</w:t>
-      </w:r>
-      <w:r>
-        <w:t>d; a question log with needed-by dates and two written Q&amp;A rounds had every question that blocked P0 work answered by 24 September. The dispute design waited on an open client question (O4) from 3 to 9 October, until PR #48 adopted a two-level design that holds under either answer. At Status Check 2, provenance and evaluation had not started although the release gate depended on them (O7); the break became an evaluation sprint and the provenance record moved from Week 11 to Week 9. Finally, the board someti</w:t>
-      </w:r>
-      <w:r>
-        <w:t>mes ran ahead of the code (O8), so the status reported to the client now follows code verified on main.</w:t>
+        <w:t>as features were built (O3), so tickets were rescoped mid-work and four stories were added; a question log with needed-by dates and two written Q&amp;A rounds had every question that blocked P0 work answered by 24 September. The dispute design waited on an open client question (O4) from 3 to 9 October, until PR #48 adopted a two-level design that holds under either answer. At Status Check 2, provenance and evaluation had not started although the release gate depended on them (O7); the break became an evaluation sprint and the provenance record moved from Week 11 to Week 9. Finally, the board sometimes ran ahead of the code (O8), so the status reported to the client now follows code verified on main.</w:t>
       </w:r>
     </w:p>
     <w:p>
@@ -7978,7 +7969,7 @@
         <w:pStyle w:val="2"/>
       </w:pPr>
       <w:bookmarkStart w:id="55" w:name="sec_2_2"/>
-      <w:bookmarkStart w:id="56" w:name="_Toc242480542"/>
+      <w:bookmarkStart w:id="56" w:name="_Toc242480834"/>
       <w:r>
         <w:t>Challenges by sprint and story</w:t>
       </w:r>
@@ -8009,10 +8000,7 @@
         <w:pStyle w:val="ReportNormal"/>
       </w:pPr>
       <w:r>
-        <w:t>Three examples show the pattern. The work-queue API was rescoped on the day it started, when the client ruled out assigning work to people, and review then found that every non-empty queue returned an error because the route tests only checked refusals (W7–W8). The move to PostgreSQL meant taking ten test files off a hard-coded SQLite database so that CI would really test both (W7). In the break, scenario testing found a 200-item task page sending 404 requests; one batched read cut it to 6–8 requests and ab</w:t>
-      </w:r>
-      <w:r>
-        <w:t>out 560 ms.</w:t>
+        <w:t>Three examples show the pattern. The work-queue API was rescoped on the day it started, when the client ruled out assigning work to people, and review then found that every non-empty queue returned an error because the route tests only checked refusals (W7–W8). The move to PostgreSQL meant taking ten test files off a hard-coded SQLite database so that CI would really test both (W7). In the break, scenario testing found a 200-item task page sending 404 requests; one batched read cut it to 6–8 requests and about 560 ms.</w:t>
       </w:r>
     </w:p>
     <w:p>
@@ -8020,7 +8008,7 @@
         <w:pStyle w:val="2"/>
       </w:pPr>
       <w:bookmarkStart w:id="57" w:name="sec_2_3"/>
-      <w:bookmarkStart w:id="58" w:name="_Toc242480543"/>
+      <w:bookmarkStart w:id="58" w:name="_Toc242480835"/>
       <w:r>
         <w:t>Risks ahead</w:t>
       </w:r>
@@ -8093,7 +8081,7 @@
         <w:pStyle w:val="2"/>
       </w:pPr>
       <w:bookmarkStart w:id="59" w:name="sec_2_4"/>
-      <w:bookmarkStart w:id="60" w:name="_Toc242480544"/>
+      <w:bookmarkStart w:id="60" w:name="_Toc242480836"/>
       <w:r>
         <w:t>Dependencies</w:t>
       </w:r>
@@ -8129,7 +8117,7 @@
         <w:pStyle w:val="1"/>
       </w:pPr>
       <w:bookmarkStart w:id="61" w:name="sec_3"/>
-      <w:bookmarkStart w:id="62" w:name="_Toc242480545"/>
+      <w:bookmarkStart w:id="62" w:name="_Toc242480837"/>
       <w:r>
         <w:t>Deviation to Timeline</w:t>
       </w:r>
@@ -8141,7 +8129,7 @@
         <w:pStyle w:val="2"/>
       </w:pPr>
       <w:bookmarkStart w:id="63" w:name="sec_3_1"/>
-      <w:bookmarkStart w:id="64" w:name="_Toc242480546"/>
+      <w:bookmarkStart w:id="64" w:name="_Toc242480838"/>
       <w:r>
         <w:t>The baseline</w:t>
       </w:r>
@@ -8187,7 +8175,7 @@
         <w:pStyle w:val="2"/>
       </w:pPr>
       <w:bookmarkStart w:id="65" w:name="sec_3_2"/>
-      <w:bookmarkStart w:id="66" w:name="_Toc242480547"/>
+      <w:bookmarkStart w:id="66" w:name="_Toc242480839"/>
       <w:r>
         <w:lastRenderedPageBreak/>
         <w:t>What moved, and why</w:t>
@@ -8353,7 +8341,7 @@
         <w:pStyle w:val="2"/>
       </w:pPr>
       <w:bookmarkStart w:id="68" w:name="sec_3_3"/>
-      <w:bookmarkStart w:id="69" w:name="_Toc242480548"/>
+      <w:bookmarkStart w:id="69" w:name="_Toc242480840"/>
       <w:r>
         <w:t>Impact on the project</w:t>
       </w:r>
@@ -8462,7 +8450,7 @@
         <w:pStyle w:val="1"/>
       </w:pPr>
       <w:bookmarkStart w:id="70" w:name="sec_4"/>
-      <w:bookmarkStart w:id="71" w:name="_Toc242480549"/>
+      <w:bookmarkStart w:id="71" w:name="_Toc242480841"/>
       <w:r>
         <w:t>Milestones &amp; Reporting</w:t>
       </w:r>
@@ -8474,7 +8462,7 @@
         <w:pStyle w:val="2"/>
       </w:pPr>
       <w:bookmarkStart w:id="72" w:name="sec_4_1"/>
-      <w:bookmarkStart w:id="73" w:name="_Toc242480550"/>
+      <w:bookmarkStart w:id="73" w:name="_Toc242480842"/>
       <w:r>
         <w:t>Updated milestones</w:t>
       </w:r>
@@ -10247,7 +10235,7 @@
         <w:pStyle w:val="2"/>
       </w:pPr>
       <w:bookmarkStart w:id="75" w:name="sec_4_2"/>
-      <w:bookmarkStart w:id="76" w:name="_Toc242480551"/>
+      <w:bookmarkStart w:id="76" w:name="_Toc242480843"/>
       <w:r>
         <w:t>Remaining work, dependencies and the critical path</w:t>
       </w:r>
@@ -10376,7 +10364,7 @@
         <w:pStyle w:val="2"/>
       </w:pPr>
       <w:bookmarkStart w:id="78" w:name="sec_4_3"/>
-      <w:bookmarkStart w:id="79" w:name="_Toc242480552"/>
+      <w:bookmarkStart w:id="79" w:name="_Toc242480844"/>
       <w:r>
         <w:lastRenderedPageBreak/>
         <w:t>Who carries what</w:t>
@@ -10416,7 +10404,7 @@
         <w:pStyle w:val="2"/>
       </w:pPr>
       <w:bookmarkStart w:id="80" w:name="sec_4_4"/>
-      <w:bookmarkStart w:id="81" w:name="_Toc242480553"/>
+      <w:bookmarkStart w:id="81" w:name="_Toc242480845"/>
       <w:r>
         <w:t>Slack, fallbacks and contingency</w:t>
       </w:r>
@@ -10518,7 +10506,7 @@
         <w:pStyle w:val="2"/>
       </w:pPr>
       <w:bookmarkStart w:id="82" w:name="sec_4_5"/>
-      <w:bookmarkStart w:id="83" w:name="_Toc242480554"/>
+      <w:bookmarkStart w:id="83" w:name="_Toc242480846"/>
       <w:r>
         <w:t>Reporting and communication</w:t>
       </w:r>
@@ -10591,7 +10579,7 @@
         <w:pStyle w:val="1"/>
       </w:pPr>
       <w:bookmarkStart w:id="84" w:name="sec_5"/>
-      <w:bookmarkStart w:id="85" w:name="_Toc242480555"/>
+      <w:bookmarkStart w:id="85" w:name="_Toc242480847"/>
       <w:r>
         <w:t>Acknowledgement of AI Use</w:t>
       </w:r>
@@ -10639,7 +10627,7 @@
       <w:pPr>
         <w:pStyle w:val="PhDAppendicesBibliography"/>
       </w:pPr>
-      <w:bookmarkStart w:id="86" w:name="_Toc242480556"/>
+      <w:bookmarkStart w:id="86" w:name="_Toc242480848"/>
       <w:r>
         <w:lastRenderedPageBreak/>
         <w:t>Appendix A. Figures and Tables</w:t>
@@ -10658,7 +10646,7 @@
       <w:pPr>
         <w:pStyle w:val="PhDAppendixSub-heading"/>
       </w:pPr>
-      <w:bookmarkStart w:id="87" w:name="_Toc242480557"/>
+      <w:bookmarkStart w:id="87" w:name="_Toc242480849"/>
       <w:r>
         <w:t>A.1 Progress and achievements</w:t>
       </w:r>
@@ -16678,7 +16666,7 @@
       <w:pPr>
         <w:pStyle w:val="PhDAppendixSub-heading"/>
       </w:pPr>
-      <w:bookmarkStart w:id="101" w:name="_Toc242480558"/>
+      <w:bookmarkStart w:id="101" w:name="_Toc242480850"/>
       <w:r>
         <w:lastRenderedPageBreak/>
         <w:t>A.2 Obstacles</w:t>
@@ -16954,7 +16942,24 @@
                 <w:sz w:val="14"/>
                 <w:szCs w:val="14"/>
               </w:rPr>
-              <w:t xml:space="preserve">(Del. 1, 2; </w:t>
+              <w:t>(</w:t>
+            </w:r>
+            <w:hyperlink w:anchor="table_8" w:history="1">
+              <w:r>
+                <w:rPr>
+                  <w:rStyle w:val="a9"/>
+                  <w:sz w:val="14"/>
+                  <w:szCs w:val="14"/>
+                </w:rPr>
+                <w:t>Deliverables</w:t>
+              </w:r>
+            </w:hyperlink>
+            <w:r>
+              <w:rPr>
+                <w:sz w:val="14"/>
+                <w:szCs w:val="14"/>
+              </w:rPr>
+              <w:t xml:space="preserve"> 1, 2; </w:t>
             </w:r>
             <w:hyperlink w:anchor="table_14" w:history="1">
               <w:r>
@@ -17097,7 +17102,24 @@
                 <w:sz w:val="14"/>
                 <w:szCs w:val="14"/>
               </w:rPr>
-              <w:t>(Del. 1)</w:t>
+              <w:t>(</w:t>
+            </w:r>
+            <w:hyperlink w:anchor="table_8" w:history="1">
+              <w:r>
+                <w:rPr>
+                  <w:rStyle w:val="a9"/>
+                  <w:sz w:val="14"/>
+                  <w:szCs w:val="14"/>
+                </w:rPr>
+                <w:t>Deliverable</w:t>
+              </w:r>
+            </w:hyperlink>
+            <w:r>
+              <w:rPr>
+                <w:sz w:val="14"/>
+                <w:szCs w:val="14"/>
+              </w:rPr>
+              <w:t xml:space="preserve"> 1)</w:t>
             </w:r>
           </w:p>
         </w:tc>
@@ -17237,7 +17259,24 @@
                 <w:sz w:val="14"/>
                 <w:szCs w:val="14"/>
               </w:rPr>
-              <w:t xml:space="preserve">(Del. 2–4; </w:t>
+              <w:t>(</w:t>
+            </w:r>
+            <w:hyperlink w:anchor="table_8" w:history="1">
+              <w:r>
+                <w:rPr>
+                  <w:rStyle w:val="a9"/>
+                  <w:sz w:val="14"/>
+                  <w:szCs w:val="14"/>
+                </w:rPr>
+                <w:t>Deliverables</w:t>
+              </w:r>
+            </w:hyperlink>
+            <w:r>
+              <w:rPr>
+                <w:sz w:val="14"/>
+                <w:szCs w:val="14"/>
+              </w:rPr>
+              <w:t xml:space="preserve"> 2–4; </w:t>
             </w:r>
             <w:hyperlink w:anchor="table_14" w:history="1">
               <w:r>
@@ -17387,7 +17426,24 @@
                 <w:sz w:val="14"/>
                 <w:szCs w:val="14"/>
               </w:rPr>
-              <w:t xml:space="preserve">(Del. 2, 4; </w:t>
+              <w:t>(</w:t>
+            </w:r>
+            <w:hyperlink w:anchor="table_8" w:history="1">
+              <w:r>
+                <w:rPr>
+                  <w:rStyle w:val="a9"/>
+                  <w:sz w:val="14"/>
+                  <w:szCs w:val="14"/>
+                </w:rPr>
+                <w:t>Deliverables</w:t>
+              </w:r>
+            </w:hyperlink>
+            <w:r>
+              <w:rPr>
+                <w:sz w:val="14"/>
+                <w:szCs w:val="14"/>
+              </w:rPr>
+              <w:t xml:space="preserve"> 2, 4; </w:t>
             </w:r>
             <w:hyperlink w:anchor="table_14" w:history="1">
               <w:r>
@@ -17565,7 +17621,24 @@
                 <w:sz w:val="14"/>
                 <w:szCs w:val="14"/>
               </w:rPr>
-              <w:t xml:space="preserve">(Del. 1; </w:t>
+              <w:t>(</w:t>
+            </w:r>
+            <w:hyperlink w:anchor="table_8" w:history="1">
+              <w:r>
+                <w:rPr>
+                  <w:rStyle w:val="a9"/>
+                  <w:sz w:val="14"/>
+                  <w:szCs w:val="14"/>
+                </w:rPr>
+                <w:t>Deliverable</w:t>
+              </w:r>
+            </w:hyperlink>
+            <w:r>
+              <w:rPr>
+                <w:sz w:val="14"/>
+                <w:szCs w:val="14"/>
+              </w:rPr>
+              <w:t xml:space="preserve"> 1; </w:t>
             </w:r>
             <w:hyperlink w:anchor="table_14" w:history="1">
               <w:r>
@@ -17708,7 +17781,24 @@
                 <w:sz w:val="14"/>
                 <w:szCs w:val="14"/>
               </w:rPr>
-              <w:t>(Del. 2)</w:t>
+              <w:t>(</w:t>
+            </w:r>
+            <w:hyperlink w:anchor="table_8" w:history="1">
+              <w:r>
+                <w:rPr>
+                  <w:rStyle w:val="a9"/>
+                  <w:sz w:val="14"/>
+                  <w:szCs w:val="14"/>
+                </w:rPr>
+                <w:t>Deliverable</w:t>
+              </w:r>
+            </w:hyperlink>
+            <w:r>
+              <w:rPr>
+                <w:sz w:val="14"/>
+                <w:szCs w:val="14"/>
+              </w:rPr>
+              <w:t xml:space="preserve"> 2)</w:t>
             </w:r>
           </w:p>
         </w:tc>
@@ -17834,7 +17924,24 @@
                 <w:sz w:val="14"/>
                 <w:szCs w:val="14"/>
               </w:rPr>
-              <w:t xml:space="preserve">(Del. 3–5; </w:t>
+              <w:t>(</w:t>
+            </w:r>
+            <w:hyperlink w:anchor="table_8" w:history="1">
+              <w:r>
+                <w:rPr>
+                  <w:rStyle w:val="a9"/>
+                  <w:sz w:val="14"/>
+                  <w:szCs w:val="14"/>
+                </w:rPr>
+                <w:t>Deliverables</w:t>
+              </w:r>
+            </w:hyperlink>
+            <w:r>
+              <w:rPr>
+                <w:sz w:val="14"/>
+                <w:szCs w:val="14"/>
+              </w:rPr>
+              <w:t xml:space="preserve"> 3–5; </w:t>
             </w:r>
             <w:hyperlink w:anchor="table_14" w:history="1">
               <w:r>
@@ -17977,7 +18084,24 @@
                 <w:sz w:val="14"/>
                 <w:szCs w:val="14"/>
               </w:rPr>
-              <w:t>(Del. 7, status reporting)</w:t>
+              <w:t>(</w:t>
+            </w:r>
+            <w:hyperlink w:anchor="table_8" w:history="1">
+              <w:r>
+                <w:rPr>
+                  <w:rStyle w:val="a9"/>
+                  <w:sz w:val="14"/>
+                  <w:szCs w:val="14"/>
+                </w:rPr>
+                <w:t>Deliverable</w:t>
+              </w:r>
+            </w:hyperlink>
+            <w:r>
+              <w:rPr>
+                <w:sz w:val="14"/>
+                <w:szCs w:val="14"/>
+              </w:rPr>
+              <w:t xml:space="preserve"> 7, status reporting)</w:t>
             </w:r>
           </w:p>
         </w:tc>
@@ -18099,7 +18223,24 @@
                 <w:sz w:val="14"/>
                 <w:szCs w:val="14"/>
               </w:rPr>
-              <w:t>(Del. 2, 7 demo; new story A6)</w:t>
+              <w:t>(</w:t>
+            </w:r>
+            <w:hyperlink w:anchor="table_8" w:history="1">
+              <w:r>
+                <w:rPr>
+                  <w:rStyle w:val="a9"/>
+                  <w:sz w:val="14"/>
+                  <w:szCs w:val="14"/>
+                </w:rPr>
+                <w:t>Deliverables</w:t>
+              </w:r>
+            </w:hyperlink>
+            <w:r>
+              <w:rPr>
+                <w:sz w:val="14"/>
+                <w:szCs w:val="14"/>
+              </w:rPr>
+              <w:t xml:space="preserve"> 2, 7 demo; new story A6)</w:t>
             </w:r>
           </w:p>
         </w:tc>
@@ -18145,89 +18286,6 @@
         </w:tc>
       </w:tr>
     </w:tbl>
-    <w:p>
-      <w:pPr>
-        <w:pStyle w:val="ReportNormal"/>
-        <w:rPr>
-          <w:sz w:val="18"/>
-          <w:szCs w:val="18"/>
-        </w:rPr>
-      </w:pPr>
-      <w:r>
-        <w:rPr>
-          <w:sz w:val="20"/>
-          <w:szCs w:val="20"/>
-        </w:rPr>
-        <w:t xml:space="preserve">In the effect column, </w:t>
-      </w:r>
-      <w:r>
-        <w:rPr>
-          <w:i/>
-          <w:iCs/>
-          <w:sz w:val="20"/>
-          <w:szCs w:val="20"/>
-        </w:rPr>
-        <w:t>Del.</w:t>
-      </w:r>
-      <w:r>
-        <w:rPr>
-          <w:sz w:val="20"/>
-          <w:szCs w:val="20"/>
-        </w:rPr>
-        <w:t xml:space="preserve"> numbers refer to the proposal deliverables in </w:t>
-      </w:r>
-      <w:hyperlink w:anchor="table_8" w:history="1">
-        <w:r>
-          <w:rPr>
-            <w:rStyle w:val="a9"/>
-            <w:sz w:val="20"/>
-            <w:szCs w:val="20"/>
-          </w:rPr>
-          <w:t>Table 8</w:t>
-        </w:r>
-      </w:hyperlink>
-      <w:r>
-        <w:rPr>
-          <w:sz w:val="20"/>
-          <w:szCs w:val="20"/>
-        </w:rPr>
-        <w:t xml:space="preserve">, and </w:t>
-      </w:r>
-      <w:hyperlink w:anchor="table_14" w:history="1">
-        <w:r>
-          <w:rPr>
-            <w:rStyle w:val="a9"/>
-            <w:sz w:val="20"/>
-            <w:szCs w:val="20"/>
-          </w:rPr>
-          <w:t>Table 14</w:t>
-        </w:r>
-      </w:hyperlink>
-      <w:r>
-        <w:rPr>
-          <w:sz w:val="20"/>
-          <w:szCs w:val="20"/>
-        </w:rPr>
-        <w:t xml:space="preserve"> is the deviation table in </w:t>
-      </w:r>
-      <w:hyperlink w:anchor="sec_3_2" w:history="1">
-        <w:r>
-          <w:rPr>
-            <w:rStyle w:val="a9"/>
-            <w:sz w:val="20"/>
-            <w:szCs w:val="20"/>
-          </w:rPr>
-          <w:t>Section 3.2</w:t>
-        </w:r>
-      </w:hyperlink>
-      <w:r>
-        <w:rPr>
-          <w:sz w:val="20"/>
-          <w:szCs w:val="20"/>
-        </w:rPr>
-        <w:t>.</w:t>
-      </w:r>
-    </w:p>
     <w:p>
       <w:pPr>
         <w:pStyle w:val="PhDTableCaption"/>
@@ -18543,7 +18601,6 @@
                 <w:sz w:val="14"/>
                 <w:szCs w:val="14"/>
               </w:rPr>
-              <w:lastRenderedPageBreak/>
               <w:t>W7</w:t>
             </w:r>
           </w:p>
@@ -18649,6 +18706,7 @@
                 <w:sz w:val="14"/>
                 <w:szCs w:val="14"/>
               </w:rPr>
+              <w:lastRenderedPageBreak/>
               <w:t>W7</w:t>
             </w:r>
           </w:p>
@@ -19793,7 +19851,6 @@
           <w:sz w:val="16"/>
           <w:szCs w:val="16"/>
         </w:rPr>
-        <w:lastRenderedPageBreak/>
         <w:t>Table 12</w:t>
       </w:r>
       <w:r>
@@ -20051,7 +20108,24 @@
                 <w:sz w:val="14"/>
                 <w:szCs w:val="14"/>
               </w:rPr>
-              <w:t>Affects Del. 3, 4; W10–W11</w:t>
+              <w:t xml:space="preserve">Affects </w:t>
+            </w:r>
+            <w:hyperlink w:anchor="table_8" w:history="1">
+              <w:r>
+                <w:rPr>
+                  <w:rStyle w:val="a9"/>
+                  <w:sz w:val="14"/>
+                  <w:szCs w:val="14"/>
+                </w:rPr>
+                <w:t>Deliverables</w:t>
+              </w:r>
+            </w:hyperlink>
+            <w:r>
+              <w:rPr>
+                <w:sz w:val="14"/>
+                <w:szCs w:val="14"/>
+              </w:rPr>
+              <w:t xml:space="preserve"> 3, 4; W10–W11</w:t>
             </w:r>
           </w:p>
         </w:tc>
@@ -20156,6 +20230,7 @@
                 <w:sz w:val="14"/>
                 <w:szCs w:val="14"/>
               </w:rPr>
+              <w:lastRenderedPageBreak/>
               <w:t>R2</w:t>
             </w:r>
           </w:p>
@@ -20191,7 +20266,24 @@
                 <w:sz w:val="14"/>
                 <w:szCs w:val="14"/>
               </w:rPr>
-              <w:t>Affects Del. 2, 4; W10–W11</w:t>
+              <w:t xml:space="preserve">Affects </w:t>
+            </w:r>
+            <w:hyperlink w:anchor="table_8" w:history="1">
+              <w:r>
+                <w:rPr>
+                  <w:rStyle w:val="a9"/>
+                  <w:sz w:val="14"/>
+                  <w:szCs w:val="14"/>
+                </w:rPr>
+                <w:t>Deliverables</w:t>
+              </w:r>
+            </w:hyperlink>
+            <w:r>
+              <w:rPr>
+                <w:sz w:val="14"/>
+                <w:szCs w:val="14"/>
+              </w:rPr>
+              <w:t xml:space="preserve"> 2, 4; W10–W11</w:t>
             </w:r>
           </w:p>
         </w:tc>
@@ -20352,7 +20444,24 @@
                 <w:sz w:val="14"/>
                 <w:szCs w:val="14"/>
               </w:rPr>
-              <w:t>Affects Del. 2–5; W11</w:t>
+              <w:t xml:space="preserve">Affects </w:t>
+            </w:r>
+            <w:hyperlink w:anchor="table_8" w:history="1">
+              <w:r>
+                <w:rPr>
+                  <w:rStyle w:val="a9"/>
+                  <w:sz w:val="14"/>
+                  <w:szCs w:val="14"/>
+                </w:rPr>
+                <w:t>Deliverables</w:t>
+              </w:r>
+            </w:hyperlink>
+            <w:r>
+              <w:rPr>
+                <w:sz w:val="14"/>
+                <w:szCs w:val="14"/>
+              </w:rPr>
+              <w:t xml:space="preserve"> 2–5; W11</w:t>
             </w:r>
           </w:p>
         </w:tc>
@@ -20492,7 +20601,24 @@
                 <w:sz w:val="14"/>
                 <w:szCs w:val="14"/>
               </w:rPr>
-              <w:t>Affects Del. 5; W10–W11</w:t>
+              <w:t xml:space="preserve">Affects </w:t>
+            </w:r>
+            <w:hyperlink w:anchor="table_8" w:history="1">
+              <w:r>
+                <w:rPr>
+                  <w:rStyle w:val="a9"/>
+                  <w:sz w:val="14"/>
+                  <w:szCs w:val="14"/>
+                </w:rPr>
+                <w:t>Deliverable</w:t>
+              </w:r>
+            </w:hyperlink>
+            <w:r>
+              <w:rPr>
+                <w:sz w:val="14"/>
+                <w:szCs w:val="14"/>
+              </w:rPr>
+              <w:t xml:space="preserve"> 5; W10–W11</w:t>
             </w:r>
           </w:p>
         </w:tc>
@@ -20632,7 +20758,24 @@
                 <w:sz w:val="14"/>
                 <w:szCs w:val="14"/>
               </w:rPr>
-              <w:t>Affects Del. 3; W9</w:t>
+              <w:t xml:space="preserve">Affects </w:t>
+            </w:r>
+            <w:hyperlink w:anchor="table_8" w:history="1">
+              <w:r>
+                <w:rPr>
+                  <w:rStyle w:val="a9"/>
+                  <w:sz w:val="14"/>
+                  <w:szCs w:val="14"/>
+                </w:rPr>
+                <w:t>Deliverable</w:t>
+              </w:r>
+            </w:hyperlink>
+            <w:r>
+              <w:rPr>
+                <w:sz w:val="14"/>
+                <w:szCs w:val="14"/>
+              </w:rPr>
+              <w:t xml:space="preserve"> 3; W9</w:t>
             </w:r>
           </w:p>
         </w:tc>
@@ -20772,7 +20915,24 @@
                 <w:sz w:val="14"/>
                 <w:szCs w:val="14"/>
               </w:rPr>
-              <w:t>Affects Del. 7; every sprint</w:t>
+              <w:t xml:space="preserve">Affects </w:t>
+            </w:r>
+            <w:hyperlink w:anchor="table_8" w:history="1">
+              <w:r>
+                <w:rPr>
+                  <w:rStyle w:val="a9"/>
+                  <w:sz w:val="14"/>
+                  <w:szCs w:val="14"/>
+                </w:rPr>
+                <w:t>Deliverable</w:t>
+              </w:r>
+            </w:hyperlink>
+            <w:r>
+              <w:rPr>
+                <w:sz w:val="14"/>
+                <w:szCs w:val="14"/>
+              </w:rPr>
+              <w:t xml:space="preserve"> 7; every sprint</w:t>
             </w:r>
           </w:p>
         </w:tc>
@@ -20912,7 +21072,24 @@
                 <w:sz w:val="14"/>
                 <w:szCs w:val="14"/>
               </w:rPr>
-              <w:t>Affects Del. 6, 7; 29 Oct – W13</w:t>
+              <w:t xml:space="preserve">Affects </w:t>
+            </w:r>
+            <w:hyperlink w:anchor="table_8" w:history="1">
+              <w:r>
+                <w:rPr>
+                  <w:rStyle w:val="a9"/>
+                  <w:sz w:val="14"/>
+                  <w:szCs w:val="14"/>
+                </w:rPr>
+                <w:t>Deliverables</w:t>
+              </w:r>
+            </w:hyperlink>
+            <w:r>
+              <w:rPr>
+                <w:sz w:val="14"/>
+                <w:szCs w:val="14"/>
+              </w:rPr>
+              <w:t xml:space="preserve"> 6, 7; 29 Oct – W13</w:t>
             </w:r>
           </w:p>
         </w:tc>
@@ -21069,7 +21246,24 @@
                 <w:sz w:val="14"/>
                 <w:szCs w:val="14"/>
               </w:rPr>
-              <w:t>Affects Del. 3; W11</w:t>
+              <w:t xml:space="preserve">Affects </w:t>
+            </w:r>
+            <w:hyperlink w:anchor="table_8" w:history="1">
+              <w:r>
+                <w:rPr>
+                  <w:rStyle w:val="a9"/>
+                  <w:sz w:val="14"/>
+                  <w:szCs w:val="14"/>
+                </w:rPr>
+                <w:t>Deliverable</w:t>
+              </w:r>
+            </w:hyperlink>
+            <w:r>
+              <w:rPr>
+                <w:sz w:val="14"/>
+                <w:szCs w:val="14"/>
+              </w:rPr>
+              <w:t xml:space="preserve"> 3; W11</w:t>
             </w:r>
           </w:p>
         </w:tc>
@@ -21209,7 +21403,24 @@
                 <w:sz w:val="14"/>
                 <w:szCs w:val="14"/>
               </w:rPr>
-              <w:t>Affects Del. 5, 7</w:t>
+              <w:t xml:space="preserve">Affects </w:t>
+            </w:r>
+            <w:hyperlink w:anchor="table_8" w:history="1">
+              <w:r>
+                <w:rPr>
+                  <w:rStyle w:val="a9"/>
+                  <w:sz w:val="14"/>
+                  <w:szCs w:val="14"/>
+                </w:rPr>
+                <w:t>Deliverables</w:t>
+              </w:r>
+            </w:hyperlink>
+            <w:r>
+              <w:rPr>
+                <w:sz w:val="14"/>
+                <w:szCs w:val="14"/>
+              </w:rPr>
+              <w:t xml:space="preserve"> 5, 7</w:t>
             </w:r>
           </w:p>
         </w:tc>
@@ -21349,7 +21560,24 @@
                 <w:sz w:val="14"/>
                 <w:szCs w:val="14"/>
               </w:rPr>
-              <w:t>Affects Del. 2; W9</w:t>
+              <w:t xml:space="preserve">Affects </w:t>
+            </w:r>
+            <w:hyperlink w:anchor="table_8" w:history="1">
+              <w:r>
+                <w:rPr>
+                  <w:rStyle w:val="a9"/>
+                  <w:sz w:val="14"/>
+                  <w:szCs w:val="14"/>
+                </w:rPr>
+                <w:t>Deliverable</w:t>
+              </w:r>
+            </w:hyperlink>
+            <w:r>
+              <w:rPr>
+                <w:sz w:val="14"/>
+                <w:szCs w:val="14"/>
+              </w:rPr>
+              <w:t xml:space="preserve"> 2; W9</w:t>
             </w:r>
           </w:p>
         </w:tc>
@@ -22698,7 +22926,7 @@
       <w:pPr>
         <w:pStyle w:val="PhDAppendixSub-heading"/>
       </w:pPr>
-      <w:bookmarkStart w:id="107" w:name="_Toc242480559"/>
+      <w:bookmarkStart w:id="107" w:name="_Toc242480851"/>
       <w:r>
         <w:lastRenderedPageBreak/>
         <w:t>A.3 Deviation to timeline</w:t>
@@ -24288,7 +24516,7 @@
       <w:pPr>
         <w:pStyle w:val="PhDAppendixSub-heading"/>
       </w:pPr>
-      <w:bookmarkStart w:id="110" w:name="_Toc242480560"/>
+      <w:bookmarkStart w:id="110" w:name="_Toc242480852"/>
       <w:r>
         <w:lastRenderedPageBreak/>
         <w:t>A.4 Milestones and reporting</w:t>
@@ -30539,7 +30767,7 @@
           <w:szCs w:val="22"/>
         </w:rPr>
       </w:pPr>
-      <w:bookmarkStart w:id="115" w:name="_Toc242480561"/>
+      <w:bookmarkStart w:id="115" w:name="_Toc242480853"/>
       <w:r>
         <w:rPr>
           <w:sz w:val="24"/>
@@ -31336,7 +31564,7 @@
           <w:szCs w:val="22"/>
         </w:rPr>
       </w:pPr>
-      <w:bookmarkStart w:id="116" w:name="_Toc242480562"/>
+      <w:bookmarkStart w:id="116" w:name="_Toc242480854"/>
       <w:r>
         <w:rPr>
           <w:sz w:val="24"/>

</xml_diff>